<commit_message>
Final paper numbers (3 seeds), passport generator and machine-readable passport
</commit_message>
<xml_diff>
--- a/paper/Brain_Age_Audit_IEEE.docx
+++ b/paper/Brain_Age_Audit_IEEE.docx
@@ -299,7 +299,7 @@
           <w:i w:val="0"/>
           <w:sz w:val="18"/>
         </w:rPr>
-        <w:t xml:space="preserve">) and its errors do not differ by sex (equivalence within </w:t>
+        <w:t xml:space="preserve">) and its errors are equivalent between sexes within </w:t>
       </w:r>
       <w:r>
         <w:rPr>
@@ -317,7 +317,7 @@
           <w:i w:val="0"/>
           <w:sz w:val="18"/>
         </w:rPr>
-        <w:t xml:space="preserve"> years). Scans from one site (IOP) receive a brain-age gap about 4–5 years lower than the reference site. The offset replicates across splits and in 5-fold cross-validation over all 412 non-test subjects ([CV IOP offset, n=61]), survives eight ways of handling age, including age matching and a nonlinear adjustment, and is already present in the pretrained model before any training on IXI (</w:t>
+        <w:t xml:space="preserve"> years. Scans from one site (IOP) receive a brain-age gap about 4–5 years lower than the reference site. The offset replicates across splits and in 5-fold cross-validation over all 412 non-test subjects (</w:t>
       </w:r>
       <w:r>
         <w:rPr>
@@ -326,6 +326,96 @@
           <w:i w:val="0"/>
           <w:sz w:val="18"/>
         </w:rPr>
+        <w:t>−5.24</w:t>
+      </w:r>
+      <w:r>
+        <w:rPr>
+          <w:rFonts w:ascii="Times New Roman" w:hAnsi="Times New Roman"/>
+          <w:b/>
+          <w:i w:val="0"/>
+          <w:sz w:val="18"/>
+        </w:rPr>
+        <w:t xml:space="preserve"> years, 95% CI </w:t>
+      </w:r>
+      <w:r>
+        <w:rPr>
+          <w:rFonts w:ascii="Times New Roman" w:hAnsi="Times New Roman"/>
+          <w:b/>
+          <w:i w:val="0"/>
+          <w:sz w:val="18"/>
+        </w:rPr>
+        <w:t>−7.62</w:t>
+      </w:r>
+      <w:r>
+        <w:rPr>
+          <w:rFonts w:ascii="Times New Roman" w:hAnsi="Times New Roman"/>
+          <w:b/>
+          <w:i w:val="0"/>
+          <w:sz w:val="18"/>
+        </w:rPr>
+        <w:t xml:space="preserve"> to </w:t>
+      </w:r>
+      <w:r>
+        <w:rPr>
+          <w:rFonts w:ascii="Times New Roman" w:hAnsi="Times New Roman"/>
+          <w:b/>
+          <w:i w:val="0"/>
+          <w:sz w:val="18"/>
+        </w:rPr>
+        <w:t>−2.87</w:t>
+      </w:r>
+      <w:r>
+        <w:rPr>
+          <w:rFonts w:ascii="Times New Roman" w:hAnsi="Times New Roman"/>
+          <w:b/>
+          <w:i w:val="0"/>
+          <w:sz w:val="18"/>
+        </w:rPr>
+        <w:t xml:space="preserve">, 52 IOP subjects; </w:t>
+      </w:r>
+      <w:r>
+        <w:rPr>
+          <w:rFonts w:ascii="Times New Roman" w:hAnsi="Times New Roman"/>
+          <w:b/>
+          <w:i w:val="0"/>
+          <w:sz w:val="18"/>
+        </w:rPr>
+        <w:t>−5.2</w:t>
+      </w:r>
+      <w:r>
+        <w:rPr>
+          <w:rFonts w:ascii="Times New Roman" w:hAnsi="Times New Roman"/>
+          <w:b/>
+          <w:i w:val="0"/>
+          <w:sz w:val="18"/>
+        </w:rPr>
+        <w:t xml:space="preserve"> to </w:t>
+      </w:r>
+      <w:r>
+        <w:rPr>
+          <w:rFonts w:ascii="Times New Roman" w:hAnsi="Times New Roman"/>
+          <w:b/>
+          <w:i w:val="0"/>
+          <w:sz w:val="18"/>
+        </w:rPr>
+        <w:t>−6.2</w:t>
+      </w:r>
+      <w:r>
+        <w:rPr>
+          <w:rFonts w:ascii="Times New Roman" w:hAnsi="Times New Roman"/>
+          <w:b/>
+          <w:i w:val="0"/>
+          <w:sz w:val="18"/>
+        </w:rPr>
+        <w:t xml:space="preserve"> across three training seeds), survives eight ways of handling age, including age matching and a nonlinear adjustment, and is already present in the pretrained model before any training on IXI (</w:t>
+      </w:r>
+      <w:r>
+        <w:rPr>
+          <w:rFonts w:ascii="Times New Roman" w:hAnsi="Times New Roman"/>
+          <w:b/>
+          <w:i w:val="0"/>
+          <w:sz w:val="18"/>
+        </w:rPr>
         <w:t>−3.3</w:t>
       </w:r>
       <w:r>
@@ -353,7 +443,7 @@
           <w:i w:val="0"/>
           <w:sz w:val="18"/>
         </w:rPr>
-        <w:t>). The model is sensitive to acquisition appearance: the site is linearly decodable from its features (91% vs a 50% permutation ceiling), and giving Hammersmith brains IOP's intensity appearance lowers their predicted age by 3.9 years. Yet this sensitivity does not explain the disparity: intensity, matched image smoothness, head size, education, BMI, ethnicity, and removing site information from the features with ComBat, ComBat-GAM or age-conditional concept erasure all leave the offset in place. Naive concept erasure appears to remove it only by also erasing age information. Attribution maps pass randomisation and deletion tests under two baselines, and conformal intervals give valid coverage per site. We summarise the audit as a protocol-based fairness passport with graded, pre-specified verdicts.</w:t>
+        <w:t>). The model is sensitive to acquisition appearance: the site is linearly decodable from its features (91% balanced accuracy, against 50% at the 95th percentile of a permutation null), and giving Hammersmith brains IOP's intensity appearance lowers their predicted age by 3.9 years. Yet this sensitivity does not explain the disparity: intensity, matched image smoothness, head size, education, BMI, ethnicity, and removing site information from the features with ComBat, ComBat-GAM or age-conditional concept erasure all leave the offset in place. Naive concept erasure appears to remove it only by also erasing age information. Attribution maps pass randomisation and deletion tests under two baselines. The model's own 90% ranges cover only 77% of out-of-sample IOP subjects, and pooled conformal intervals 69%; per-site conformal intervals restore valid coverage at every site. We summarise the audit as a protocol-based fairness passport with graded, pre-specified verdicts.</w:t>
       </w:r>
     </w:p>
     <w:p>
@@ -2629,7 +2719,7 @@
           <w:i w:val="0"/>
           <w:sz w:val="20"/>
         </w:rPr>
-        <w:t xml:space="preserve"> To estimate group effects on more than 18 held-out IOP subjects without touching the test set, the 412 train+validation subjects were split into 5 site-stratified folds; each fold was predicted by a model trained on the other four (85% training, 15% inner validation for early stopping and for that fold's bias correction). Full fine-tuning was infeasible on our CPU hardware, so the first three blocks were kept at the UK Biobank weights, which never saw IXI, and the remaining blocks and head were trained with the same objective and schedule. Every non-test subject thus receives an out-of-sample prediction (61 IOP). Training was repeated with [2] seeds, and the fold models' average forms an ensemble for the locked test set.</w:t>
+        <w:t xml:space="preserve"> To estimate group effects on more than 18 held-out IOP subjects without touching the test set, the 412 train+validation subjects were split into 5 site-stratified folds; each fold was predicted by a model trained on the other four (85% training, 15% inner validation for early stopping and for that fold's bias correction). Full fine-tuning was infeasible on our CPU hardware, so the first three blocks were kept at the UK Biobank weights, which never saw IXI, and the remaining blocks and head were trained with the same objective and schedule. Every non-test subject thus receives an out-of-sample prediction (52 IOP). Training was repeated with 3 seeds; the first seed is the primary analysis (as fixed in advance) and the others test robustness, and the 15 fold models' average forms an ensemble for the locked test set.</w:t>
       </w:r>
     </w:p>
     <w:p>
@@ -2704,7 +2794,7 @@
           <w:i w:val="0"/>
           <w:sz w:val="20"/>
         </w:rPr>
-        <w:t>\mathrmoutcome ~ sex+site+age</w:t>
+        <w:t>outcome ~ sex+site+age</w:t>
       </w:r>
       <w:r>
         <w:rPr>
@@ -3650,7 +3740,43 @@
           <w:i w:val="0"/>
           <w:sz w:val="20"/>
         </w:rPr>
-        <w:t>). The cross-validated models reached an out-of-sample MAE of [CV MAE] over all 412 non-test subjects, and their ensemble [ensemble test MAE] on the test set. An independently fine-tuned SFCN and DeepBrainNet reached test MAE 4.07 and 4.53.</w:t>
+        <w:t>). The cross-validated models, which fine-tune only the upper blocks, reached an out-of-sample MAE of 4.76 years (</w:t>
+      </w:r>
+      <w:r>
+        <w:rPr>
+          <w:rFonts w:ascii="Times New Roman" w:hAnsi="Times New Roman"/>
+          <w:b w:val="0"/>
+          <w:i w:val="0"/>
+          <w:sz w:val="20"/>
+        </w:rPr>
+        <w:t>r=0.943</w:t>
+      </w:r>
+      <w:r>
+        <w:rPr>
+          <w:rFonts w:ascii="Times New Roman" w:hAnsi="Times New Roman"/>
+          <w:b w:val="0"/>
+          <w:i w:val="0"/>
+          <w:sz w:val="20"/>
+        </w:rPr>
+        <w:t>) over all 412 non-test subjects, and the 15-model ensemble 5.06 (</w:t>
+      </w:r>
+      <w:r>
+        <w:rPr>
+          <w:rFonts w:ascii="Times New Roman" w:hAnsi="Times New Roman"/>
+          <w:b w:val="0"/>
+          <w:i w:val="0"/>
+          <w:sz w:val="20"/>
+        </w:rPr>
+        <w:t>r=0.949</w:t>
+      </w:r>
+      <w:r>
+        <w:rPr>
+          <w:rFonts w:ascii="Times New Roman" w:hAnsi="Times New Roman"/>
+          <w:b w:val="0"/>
+          <w:i w:val="0"/>
+          <w:sz w:val="20"/>
+        </w:rPr>
+        <w:t>) on the locked test set. Across the three seeds, out-of-sample MAE was 4.76, 5.12 and 4.91 years. An independently fine-tuned SFCN and DeepBrainNet reached test MAE 4.07 and 4.53.</w:t>
       </w:r>
     </w:p>
     <w:p>
@@ -3994,7 +4120,7 @@
                 <w:i w:val="0"/>
                 <w:sz w:val="16"/>
               </w:rPr>
-              <w:t>[pending]</w:t>
+              <w:t>4.76</w:t>
             </w:r>
           </w:p>
         </w:tc>
@@ -4020,7 +4146,7 @@
                 <w:i w:val="0"/>
                 <w:sz w:val="16"/>
               </w:rPr>
-              <w:t>[pending]</w:t>
+              <w:t>0.943</w:t>
             </w:r>
           </w:p>
         </w:tc>
@@ -4048,7 +4174,7 @@
                 <w:i w:val="0"/>
                 <w:sz w:val="16"/>
               </w:rPr>
-              <w:t>CV ensemble, test</w:t>
+              <w:t>CV ensemble (15 models), test</w:t>
             </w:r>
           </w:p>
         </w:tc>
@@ -4074,7 +4200,7 @@
                 <w:i w:val="0"/>
                 <w:sz w:val="16"/>
               </w:rPr>
-              <w:t>[pending]</w:t>
+              <w:t>5.06</w:t>
             </w:r>
           </w:p>
         </w:tc>
@@ -4100,7 +4226,7 @@
                 <w:i w:val="0"/>
                 <w:sz w:val="16"/>
               </w:rPr>
-              <w:t>[pending]</w:t>
+              <w:t>0.949</w:t>
             </w:r>
           </w:p>
         </w:tc>
@@ -4296,7 +4422,259 @@
           <w:i w:val="0"/>
           <w:sz w:val="20"/>
         </w:rPr>
-        <w:t>), giving FAIL. With all 412 cross-validated predictions, [CV verdicts for sex and site]. A model never trained on IOP was 3.30 years [1.62, 4.93] less accurate there, whereas one never trained on HH generalised (+0.25).</w:t>
+        <w:t>), giving FAIL. With all 412 cross-validated predictions the picture sharpens: the sex differences in BAG (</w:t>
+      </w:r>
+      <w:r>
+        <w:rPr>
+          <w:rFonts w:ascii="Times New Roman" w:hAnsi="Times New Roman"/>
+          <w:b w:val="0"/>
+          <w:i w:val="0"/>
+          <w:sz w:val="20"/>
+        </w:rPr>
+        <w:t>+0.61</w:t>
+      </w:r>
+      <w:r>
+        <w:rPr>
+          <w:rFonts w:ascii="Times New Roman" w:hAnsi="Times New Roman"/>
+          <w:b w:val="0"/>
+          <w:i w:val="0"/>
+          <w:sz w:val="20"/>
+        </w:rPr>
+        <w:t>, MDE 1.6) and in error (</w:t>
+      </w:r>
+      <w:r>
+        <w:rPr>
+          <w:rFonts w:ascii="Times New Roman" w:hAnsi="Times New Roman"/>
+          <w:b w:val="0"/>
+          <w:i w:val="0"/>
+          <w:sz w:val="20"/>
+        </w:rPr>
+        <w:t>+0.11</w:t>
+      </w:r>
+      <w:r>
+        <w:rPr>
+          <w:rFonts w:ascii="Times New Roman" w:hAnsi="Times New Roman"/>
+          <w:b w:val="0"/>
+          <w:i w:val="0"/>
+          <w:sz w:val="20"/>
+        </w:rPr>
+        <w:t xml:space="preserve">) are now </w:t>
+      </w:r>
+      <w:r>
+        <w:rPr>
+          <w:rFonts w:ascii="Times New Roman" w:hAnsi="Times New Roman"/>
+          <w:b w:val="0"/>
+          <w:i/>
+          <w:sz w:val="20"/>
+        </w:rPr>
+        <w:t>equivalent</w:t>
+      </w:r>
+      <w:r>
+        <w:rPr>
+          <w:rFonts w:ascii="Times New Roman" w:hAnsi="Times New Roman"/>
+          <w:b w:val="0"/>
+          <w:i w:val="0"/>
+          <w:sz w:val="20"/>
+        </w:rPr>
+        <w:t xml:space="preserve"> (PASS); IOP's BAG offset is </w:t>
+      </w:r>
+      <w:r>
+        <w:rPr>
+          <w:rFonts w:ascii="Times New Roman" w:hAnsi="Times New Roman"/>
+          <w:b w:val="0"/>
+          <w:i w:val="0"/>
+          <w:sz w:val="20"/>
+        </w:rPr>
+        <w:t>−5.24</w:t>
+      </w:r>
+      <w:r>
+        <w:rPr>
+          <w:rFonts w:ascii="Times New Roman" w:hAnsi="Times New Roman"/>
+          <w:b w:val="0"/>
+          <w:i w:val="0"/>
+          <w:sz w:val="20"/>
+        </w:rPr>
+        <w:t xml:space="preserve"> [−7.56, −2.92] (Holm </w:t>
+      </w:r>
+      <w:r>
+        <w:rPr>
+          <w:rFonts w:ascii="Times New Roman" w:hAnsi="Times New Roman"/>
+          <w:b w:val="0"/>
+          <w:i w:val="0"/>
+          <w:sz w:val="20"/>
+        </w:rPr>
+        <w:t>p&lt;0.001</w:t>
+      </w:r>
+      <w:r>
+        <w:rPr>
+          <w:rFonts w:ascii="Times New Roman" w:hAnsi="Times New Roman"/>
+          <w:b w:val="0"/>
+          <w:i w:val="0"/>
+          <w:sz w:val="20"/>
+        </w:rPr>
+        <w:t>, FAIL); HH shows a smaller offset within the margin (</w:t>
+      </w:r>
+      <w:r>
+        <w:rPr>
+          <w:rFonts w:ascii="Times New Roman" w:hAnsi="Times New Roman"/>
+          <w:b w:val="0"/>
+          <w:i w:val="0"/>
+          <w:sz w:val="20"/>
+        </w:rPr>
+        <w:t>−1.51</w:t>
+      </w:r>
+      <w:r>
+        <w:rPr>
+          <w:rFonts w:ascii="Times New Roman" w:hAnsi="Times New Roman"/>
+          <w:b w:val="0"/>
+          <w:i w:val="0"/>
+          <w:sz w:val="20"/>
+        </w:rPr>
+        <w:t>, CONCERN); and errors are larger at HH (</w:t>
+      </w:r>
+      <w:r>
+        <w:rPr>
+          <w:rFonts w:ascii="Times New Roman" w:hAnsi="Times New Roman"/>
+          <w:b w:val="0"/>
+          <w:i w:val="0"/>
+          <w:sz w:val="20"/>
+        </w:rPr>
+        <w:t>+1.61</w:t>
+      </w:r>
+      <w:r>
+        <w:rPr>
+          <w:rFonts w:ascii="Times New Roman" w:hAnsi="Times New Roman"/>
+          <w:b w:val="0"/>
+          <w:i w:val="0"/>
+          <w:sz w:val="20"/>
+        </w:rPr>
+        <w:t>) and IOP (</w:t>
+      </w:r>
+      <w:r>
+        <w:rPr>
+          <w:rFonts w:ascii="Times New Roman" w:hAnsi="Times New Roman"/>
+          <w:b w:val="0"/>
+          <w:i w:val="0"/>
+          <w:sz w:val="20"/>
+        </w:rPr>
+        <w:t>+4.06</w:t>
+      </w:r>
+      <w:r>
+        <w:rPr>
+          <w:rFonts w:ascii="Times New Roman" w:hAnsi="Times New Roman"/>
+          <w:b w:val="0"/>
+          <w:i w:val="0"/>
+          <w:sz w:val="20"/>
+        </w:rPr>
+        <w:t xml:space="preserve">), which did not replicate on the locked test set (CONCERN). The IOP offset was </w:t>
+      </w:r>
+      <w:r>
+        <w:rPr>
+          <w:rFonts w:ascii="Times New Roman" w:hAnsi="Times New Roman"/>
+          <w:b w:val="0"/>
+          <w:i w:val="0"/>
+          <w:sz w:val="20"/>
+        </w:rPr>
+        <w:t>−5.24</w:t>
+      </w:r>
+      <w:r>
+        <w:rPr>
+          <w:rFonts w:ascii="Times New Roman" w:hAnsi="Times New Roman"/>
+          <w:b w:val="0"/>
+          <w:i w:val="0"/>
+          <w:sz w:val="20"/>
+        </w:rPr>
+        <w:t xml:space="preserve">, </w:t>
+      </w:r>
+      <w:r>
+        <w:rPr>
+          <w:rFonts w:ascii="Times New Roman" w:hAnsi="Times New Roman"/>
+          <w:b w:val="0"/>
+          <w:i w:val="0"/>
+          <w:sz w:val="20"/>
+        </w:rPr>
+        <w:t>−6.23</w:t>
+      </w:r>
+      <w:r>
+        <w:rPr>
+          <w:rFonts w:ascii="Times New Roman" w:hAnsi="Times New Roman"/>
+          <w:b w:val="0"/>
+          <w:i w:val="0"/>
+          <w:sz w:val="20"/>
+        </w:rPr>
+        <w:t xml:space="preserve"> and </w:t>
+      </w:r>
+      <w:r>
+        <w:rPr>
+          <w:rFonts w:ascii="Times New Roman" w:hAnsi="Times New Roman"/>
+          <w:b w:val="0"/>
+          <w:i w:val="0"/>
+          <w:sz w:val="20"/>
+        </w:rPr>
+        <w:t>−5.57</w:t>
+      </w:r>
+      <w:r>
+        <w:rPr>
+          <w:rFonts w:ascii="Times New Roman" w:hAnsi="Times New Roman"/>
+          <w:b w:val="0"/>
+          <w:i w:val="0"/>
+          <w:sz w:val="20"/>
+        </w:rPr>
+        <w:t xml:space="preserve"> years for the three seeds (</w:t>
+      </w:r>
+      <w:r>
+        <w:rPr>
+          <w:rFonts w:ascii="Times New Roman" w:hAnsi="Times New Roman"/>
+          <w:b w:val="0"/>
+          <w:i w:val="0"/>
+          <w:sz w:val="20"/>
+        </w:rPr>
+        <w:t>−5.68</w:t>
+      </w:r>
+      <w:r>
+        <w:rPr>
+          <w:rFonts w:ascii="Times New Roman" w:hAnsi="Times New Roman"/>
+          <w:b w:val="0"/>
+          <w:i w:val="0"/>
+          <w:sz w:val="20"/>
+        </w:rPr>
+        <w:t xml:space="preserve"> [−7.85, −3.30] averaged over seeds, </w:t>
+      </w:r>
+      <w:r>
+        <w:rPr>
+          <w:rFonts w:ascii="Times New Roman" w:hAnsi="Times New Roman"/>
+          <w:b w:val="0"/>
+          <w:i w:val="0"/>
+          <w:sz w:val="20"/>
+        </w:rPr>
+        <w:t>p=10⁻⁶</w:t>
+      </w:r>
+      <w:r>
+        <w:rPr>
+          <w:rFonts w:ascii="Times New Roman" w:hAnsi="Times New Roman"/>
+          <w:b w:val="0"/>
+          <w:i w:val="0"/>
+          <w:sz w:val="20"/>
+        </w:rPr>
+        <w:t xml:space="preserve">), and </w:t>
+      </w:r>
+      <w:r>
+        <w:rPr>
+          <w:rFonts w:ascii="Times New Roman" w:hAnsi="Times New Roman"/>
+          <w:b w:val="0"/>
+          <w:i w:val="0"/>
+          <w:sz w:val="20"/>
+        </w:rPr>
+        <w:t>−6.67</w:t>
+      </w:r>
+      <w:r>
+        <w:rPr>
+          <w:rFonts w:ascii="Times New Roman" w:hAnsi="Times New Roman"/>
+          <w:b w:val="0"/>
+          <w:i w:val="0"/>
+          <w:sz w:val="20"/>
+        </w:rPr>
+        <w:t xml:space="preserve"> [−11.14, −2.20] for the 15-model ensemble on the locked test set; the sex difference was not significant for any seed. A model never trained on IOP was 3.30 years [1.62, 4.93] less accurate there, whereas one never trained on HH generalised (+0.25).</w:t>
       </w:r>
     </w:p>
     <w:p>
@@ -5400,7 +5778,16 @@
                 <w:i w:val="0"/>
                 <w:sz w:val="16"/>
               </w:rPr>
-              <w:t>[pending]</w:t>
+              <w:t>+0.61</w:t>
+            </w:r>
+            <w:r>
+              <w:rPr>
+                <w:rFonts w:ascii="Times New Roman" w:hAnsi="Times New Roman"/>
+                <w:b w:val="0"/>
+                <w:i w:val="0"/>
+                <w:sz w:val="16"/>
+              </w:rPr>
+              <w:t xml:space="preserve"> [−0.50, 1.72]</w:t>
             </w:r>
           </w:p>
         </w:tc>
@@ -5426,7 +5813,7 @@
                 <w:i w:val="0"/>
                 <w:sz w:val="16"/>
               </w:rPr>
-              <w:t>[pending]</w:t>
+              <w:t>1.6</w:t>
             </w:r>
           </w:p>
         </w:tc>
@@ -5450,9 +5837,10 @@
                 <w:rFonts w:ascii="Times New Roman" w:hAnsi="Times New Roman"/>
                 <w:b w:val="0"/>
                 <w:i w:val="0"/>
+                <w:color w:val="0F7A3A"/>
                 <w:sz w:val="16"/>
               </w:rPr>
-              <w:t>[pending]</w:t>
+              <w:t>PASS</w:t>
             </w:r>
           </w:p>
         </w:tc>
@@ -5532,7 +5920,16 @@
                 <w:i w:val="0"/>
                 <w:sz w:val="16"/>
               </w:rPr>
-              <w:t>[pending]</w:t>
+              <w:t>+0.11</w:t>
+            </w:r>
+            <w:r>
+              <w:rPr>
+                <w:rFonts w:ascii="Times New Roman" w:hAnsi="Times New Roman"/>
+                <w:b w:val="0"/>
+                <w:i w:val="0"/>
+                <w:sz w:val="16"/>
+              </w:rPr>
+              <w:t xml:space="preserve"> [−0.58, 0.80]</w:t>
             </w:r>
           </w:p>
         </w:tc>
@@ -5558,7 +5955,7 @@
                 <w:i w:val="0"/>
                 <w:sz w:val="16"/>
               </w:rPr>
-              <w:t>[pending]</w:t>
+              <w:t>1.0</w:t>
             </w:r>
           </w:p>
         </w:tc>
@@ -5582,9 +5979,10 @@
                 <w:rFonts w:ascii="Times New Roman" w:hAnsi="Times New Roman"/>
                 <w:b w:val="0"/>
                 <w:i w:val="0"/>
+                <w:color w:val="0F7A3A"/>
                 <w:sz w:val="16"/>
               </w:rPr>
-              <w:t>[pending]</w:t>
+              <w:t>PASS</w:t>
             </w:r>
           </w:p>
         </w:tc>
@@ -5664,7 +6062,16 @@
                 <w:i w:val="0"/>
                 <w:sz w:val="16"/>
               </w:rPr>
-              <w:t>[pending]</w:t>
+              <w:t>−1.51</w:t>
+            </w:r>
+            <w:r>
+              <w:rPr>
+                <w:rFonts w:ascii="Times New Roman" w:hAnsi="Times New Roman"/>
+                <w:b w:val="0"/>
+                <w:i w:val="0"/>
+                <w:sz w:val="16"/>
+              </w:rPr>
+              <w:t xml:space="preserve"> [−2.64, −0.38]</w:t>
             </w:r>
           </w:p>
         </w:tc>
@@ -5690,7 +6097,7 @@
                 <w:i w:val="0"/>
                 <w:sz w:val="16"/>
               </w:rPr>
-              <w:t>[pending]</w:t>
+              <w:t>1.6</w:t>
             </w:r>
           </w:p>
         </w:tc>
@@ -5716,7 +6123,7 @@
                 <w:i w:val="0"/>
                 <w:sz w:val="16"/>
               </w:rPr>
-              <w:t>[pending]</w:t>
+              <w:t>CONCERN</w:t>
             </w:r>
           </w:p>
         </w:tc>
@@ -5796,7 +6203,16 @@
                 <w:i w:val="0"/>
                 <w:sz w:val="16"/>
               </w:rPr>
-              <w:t>[pending]</w:t>
+              <w:t>−5.24</w:t>
+            </w:r>
+            <w:r>
+              <w:rPr>
+                <w:rFonts w:ascii="Times New Roman" w:hAnsi="Times New Roman"/>
+                <w:b w:val="0"/>
+                <w:i w:val="0"/>
+                <w:sz w:val="16"/>
+              </w:rPr>
+              <w:t xml:space="preserve"> [−7.56, −2.92]</w:t>
             </w:r>
           </w:p>
         </w:tc>
@@ -5822,7 +6238,7 @@
                 <w:i w:val="0"/>
                 <w:sz w:val="16"/>
               </w:rPr>
-              <w:t>[pending]</w:t>
+              <w:t>3.3</w:t>
             </w:r>
           </w:p>
         </w:tc>
@@ -5846,9 +6262,10 @@
                 <w:rFonts w:ascii="Times New Roman" w:hAnsi="Times New Roman"/>
                 <w:b w:val="0"/>
                 <w:i w:val="0"/>
+                <w:color w:val="B42318"/>
                 <w:sz w:val="16"/>
               </w:rPr>
-              <w:t>[pending]</w:t>
+              <w:t>FAIL</w:t>
             </w:r>
           </w:p>
         </w:tc>
@@ -5928,7 +6345,16 @@
                 <w:i w:val="0"/>
                 <w:sz w:val="16"/>
               </w:rPr>
-              <w:t>[pending]</w:t>
+              <w:t>+4.06</w:t>
+            </w:r>
+            <w:r>
+              <w:rPr>
+                <w:rFonts w:ascii="Times New Roman" w:hAnsi="Times New Roman"/>
+                <w:b w:val="0"/>
+                <w:i w:val="0"/>
+                <w:sz w:val="16"/>
+              </w:rPr>
+              <w:t xml:space="preserve"> [2.26, 5.86]</w:t>
             </w:r>
           </w:p>
         </w:tc>
@@ -5954,7 +6380,7 @@
                 <w:i w:val="0"/>
                 <w:sz w:val="16"/>
               </w:rPr>
-              <w:t>[pending]</w:t>
+              <w:t>2.6</w:t>
             </w:r>
           </w:p>
         </w:tc>
@@ -5980,7 +6406,7 @@
                 <w:i w:val="0"/>
                 <w:sz w:val="16"/>
               </w:rPr>
-              <w:t>[pending]</w:t>
+              <w:t>CONCERN</w:t>
             </w:r>
           </w:p>
         </w:tc>
@@ -6274,7 +6700,97 @@
           <w:i w:val="0"/>
           <w:sz w:val="20"/>
         </w:rPr>
-        <w:t xml:space="preserve"> years. In the cross-validated predictions the offset was [CV range across the eight choices].</w:t>
+        <w:t xml:space="preserve"> years. In the cross-validated predictions the offset was between </w:t>
+      </w:r>
+      <w:r>
+        <w:rPr>
+          <w:rFonts w:ascii="Times New Roman" w:hAnsi="Times New Roman"/>
+          <w:b w:val="0"/>
+          <w:i w:val="0"/>
+          <w:sz w:val="20"/>
+        </w:rPr>
+        <w:t>−3.94</w:t>
+      </w:r>
+      <w:r>
+        <w:rPr>
+          <w:rFonts w:ascii="Times New Roman" w:hAnsi="Times New Roman"/>
+          <w:b w:val="0"/>
+          <w:i w:val="0"/>
+          <w:sz w:val="20"/>
+        </w:rPr>
+        <w:t xml:space="preserve"> (no correction, and age as covariate) and </w:t>
+      </w:r>
+      <w:r>
+        <w:rPr>
+          <w:rFonts w:ascii="Times New Roman" w:hAnsi="Times New Roman"/>
+          <w:b w:val="0"/>
+          <w:i w:val="0"/>
+          <w:sz w:val="20"/>
+        </w:rPr>
+        <w:t>−5.24</w:t>
+      </w:r>
+      <w:r>
+        <w:rPr>
+          <w:rFonts w:ascii="Times New Roman" w:hAnsi="Times New Roman"/>
+          <w:b w:val="0"/>
+          <w:i w:val="0"/>
+          <w:sz w:val="20"/>
+        </w:rPr>
+        <w:t xml:space="preserve"> years across the choices, </w:t>
+      </w:r>
+      <w:r>
+        <w:rPr>
+          <w:rFonts w:ascii="Times New Roman" w:hAnsi="Times New Roman"/>
+          <w:b w:val="0"/>
+          <w:i w:val="0"/>
+          <w:sz w:val="20"/>
+        </w:rPr>
+        <w:t>−4.65</w:t>
+      </w:r>
+      <w:r>
+        <w:rPr>
+          <w:rFonts w:ascii="Times New Roman" w:hAnsi="Times New Roman"/>
+          <w:b w:val="0"/>
+          <w:i w:val="0"/>
+          <w:sz w:val="20"/>
+        </w:rPr>
+        <w:t xml:space="preserve"> with a spline for age and </w:t>
+      </w:r>
+      <w:r>
+        <w:rPr>
+          <w:rFonts w:ascii="Times New Roman" w:hAnsi="Times New Roman"/>
+          <w:b w:val="0"/>
+          <w:i w:val="0"/>
+          <w:sz w:val="20"/>
+        </w:rPr>
+        <w:t>−4.15</w:t>
+      </w:r>
+      <w:r>
+        <w:rPr>
+          <w:rFonts w:ascii="Times New Roman" w:hAnsi="Times New Roman"/>
+          <w:b w:val="0"/>
+          <w:i w:val="0"/>
+          <w:sz w:val="20"/>
+        </w:rPr>
+        <w:t xml:space="preserve"> [−6.62, −1.86] in 51 age- and sex-matched pairs, all with </w:t>
+      </w:r>
+      <w:r>
+        <w:rPr>
+          <w:rFonts w:ascii="Times New Roman" w:hAnsi="Times New Roman"/>
+          <w:b w:val="0"/>
+          <w:i w:val="0"/>
+          <w:sz w:val="20"/>
+        </w:rPr>
+        <w:t>p&lt;0.001</w:t>
+      </w:r>
+      <w:r>
+        <w:rPr>
+          <w:rFonts w:ascii="Times New Roman" w:hAnsi="Times New Roman"/>
+          <w:b w:val="0"/>
+          <w:i w:val="0"/>
+          <w:sz w:val="20"/>
+        </w:rPr>
+        <w:t>.</w:t>
       </w:r>
     </w:p>
     <w:p>
@@ -6408,7 +6924,97 @@
           <w:i w:val="0"/>
           <w:sz w:val="20"/>
         </w:rPr>
-        <w:t>, 241 subjects aged 42–82, 19 IOP). Memorisation of IOP training subjects therefore cannot be its cause. During cross-validated training, [training-dynamics result: train-IOP gap vs out-of-sample IOP gap across epochs].</w:t>
+        <w:t xml:space="preserve">, 241 subjects aged 42–82, 19 IOP). Memorisation of IOP training subjects therefore cannot be its cause. Cross-validated training shows how fine-tuning interacts with it (Fig. </w:t>
+      </w:r>
+      <w:r>
+        <w:rPr>
+          <w:rFonts w:ascii="Times New Roman" w:hAnsi="Times New Roman"/>
+          <w:b w:val="0"/>
+          <w:i w:val="0"/>
+          <w:sz w:val="20"/>
+        </w:rPr>
+        <w:t>7</w:t>
+      </w:r>
+      <w:r>
+        <w:rPr>
+          <w:rFonts w:ascii="Times New Roman" w:hAnsi="Times New Roman"/>
+          <w:b w:val="0"/>
+          <w:i w:val="0"/>
+          <w:sz w:val="20"/>
+        </w:rPr>
+        <w:t xml:space="preserve">): after the first epoch, training and out-of-sample IOP subjects both have an age-adjusted offset of about </w:t>
+      </w:r>
+      <w:r>
+        <w:rPr>
+          <w:rFonts w:ascii="Times New Roman" w:hAnsi="Times New Roman"/>
+          <w:b w:val="0"/>
+          <w:i w:val="0"/>
+          <w:sz w:val="20"/>
+        </w:rPr>
+        <w:t>−2.5</w:t>
+      </w:r>
+      <w:r>
+        <w:rPr>
+          <w:rFonts w:ascii="Times New Roman" w:hAnsi="Times New Roman"/>
+          <w:b w:val="0"/>
+          <w:i w:val="0"/>
+          <w:sz w:val="20"/>
+        </w:rPr>
+        <w:t xml:space="preserve"> to </w:t>
+      </w:r>
+      <w:r>
+        <w:rPr>
+          <w:rFonts w:ascii="Times New Roman" w:hAnsi="Times New Roman"/>
+          <w:b w:val="0"/>
+          <w:i w:val="0"/>
+          <w:sz w:val="20"/>
+        </w:rPr>
+        <w:t>−2.9</w:t>
+      </w:r>
+      <w:r>
+        <w:rPr>
+          <w:rFonts w:ascii="Times New Roman" w:hAnsi="Times New Roman"/>
+          <w:b w:val="0"/>
+          <w:i w:val="0"/>
+          <w:sz w:val="20"/>
+        </w:rPr>
+        <w:t xml:space="preserve"> years; once the upper blocks start training (stage 2) the two diverge, and by the end of training the offset of the IOP subjects the model trains on has been fitted away (</w:t>
+      </w:r>
+      <w:r>
+        <w:rPr>
+          <w:rFonts w:ascii="Times New Roman" w:hAnsi="Times New Roman"/>
+          <w:b w:val="0"/>
+          <w:i w:val="0"/>
+          <w:sz w:val="20"/>
+        </w:rPr>
+        <w:t>+0.19</w:t>
+      </w:r>
+      <w:r>
+        <w:rPr>
+          <w:rFonts w:ascii="Times New Roman" w:hAnsi="Times New Roman"/>
+          <w:b w:val="0"/>
+          <w:i w:val="0"/>
+          <w:sz w:val="20"/>
+        </w:rPr>
+        <w:t xml:space="preserve">), while that of unseen IOP subjects has grown to </w:t>
+      </w:r>
+      <w:r>
+        <w:rPr>
+          <w:rFonts w:ascii="Times New Roman" w:hAnsi="Times New Roman"/>
+          <w:b w:val="0"/>
+          <w:i w:val="0"/>
+          <w:sz w:val="20"/>
+        </w:rPr>
+        <w:t>−4.49</w:t>
+      </w:r>
+      <w:r>
+        <w:rPr>
+          <w:rFonts w:ascii="Times New Roman" w:hAnsi="Times New Roman"/>
+          <w:b w:val="0"/>
+          <w:i w:val="0"/>
+          <w:sz w:val="20"/>
+        </w:rPr>
+        <w:t>. Fine-tuning hides the offset for the subjects it sees rather than causing it, which explains why it is absent in the training set but present in every held-out split.</w:t>
       </w:r>
     </w:p>
     <w:p>
@@ -6904,7 +7510,7 @@
                 <w:i w:val="0"/>
                 <w:sz w:val="16"/>
               </w:rPr>
-              <w:t>[pending]</w:t>
+              <w:t>86.2</w:t>
             </w:r>
           </w:p>
         </w:tc>
@@ -7049,7 +7655,79 @@
           <w:i w:val="0"/>
           <w:sz w:val="20"/>
         </w:rPr>
-        <w:t xml:space="preserve"> voxels) lowered predictions by 3.17 years. With the cross-validated models, [CV stress-test replication].</w:t>
+        <w:t xml:space="preserve"> voxels) lowered predictions by 3.17 years. With the cross-validated models, the direction replicated in all five independently trained models over all 412 out-of-sample subjects, with larger magnitudes: HH brains given IOP's appearance became 6.09 years younger (99% of subjects; per fold </w:t>
+      </w:r>
+      <w:r>
+        <w:rPr>
+          <w:rFonts w:ascii="Times New Roman" w:hAnsi="Times New Roman"/>
+          <w:b w:val="0"/>
+          <w:i w:val="0"/>
+          <w:sz w:val="20"/>
+        </w:rPr>
+        <w:t>−3.7</w:t>
+      </w:r>
+      <w:r>
+        <w:rPr>
+          <w:rFonts w:ascii="Times New Roman" w:hAnsi="Times New Roman"/>
+          <w:b w:val="0"/>
+          <w:i w:val="0"/>
+          <w:sz w:val="20"/>
+        </w:rPr>
+        <w:t xml:space="preserve"> to </w:t>
+      </w:r>
+      <w:r>
+        <w:rPr>
+          <w:rFonts w:ascii="Times New Roman" w:hAnsi="Times New Roman"/>
+          <w:b w:val="0"/>
+          <w:i w:val="0"/>
+          <w:sz w:val="20"/>
+        </w:rPr>
+        <w:t>−8.3</w:t>
+      </w:r>
+      <w:r>
+        <w:rPr>
+          <w:rFonts w:ascii="Times New Roman" w:hAnsi="Times New Roman"/>
+          <w:b w:val="0"/>
+          <w:i w:val="0"/>
+          <w:sz w:val="20"/>
+        </w:rPr>
+        <w:t>) and IOP brains given HH's appearance 4.76 years older (98%). Unlike the main model, these lighter fine-tunes, which keep the UK Biobank weights in their first three blocks, also responded to the Guys</w:t>
+      </w:r>
+      <w:r>
+        <w:rPr>
+          <w:rFonts w:ascii="Times New Roman" w:hAnsi="Times New Roman"/>
+          <w:b w:val="0"/>
+          <w:i w:val="0"/>
+          <w:sz w:val="20"/>
+        </w:rPr>
+        <w:t>→</w:t>
+      </w:r>
+      <w:r>
+        <w:rPr>
+          <w:rFonts w:ascii="Times New Roman" w:hAnsi="Times New Roman"/>
+          <w:b w:val="0"/>
+          <w:i w:val="0"/>
+          <w:sz w:val="20"/>
+        </w:rPr>
+        <w:t>IOP swap (</w:t>
+      </w:r>
+      <w:r>
+        <w:rPr>
+          <w:rFonts w:ascii="Times New Roman" w:hAnsi="Times New Roman"/>
+          <w:b w:val="0"/>
+          <w:i w:val="0"/>
+          <w:sz w:val="20"/>
+        </w:rPr>
+        <w:t>−3.06</w:t>
+      </w:r>
+      <w:r>
+        <w:rPr>
+          <w:rFonts w:ascii="Times New Roman" w:hAnsi="Times New Roman"/>
+          <w:b w:val="0"/>
+          <w:i w:val="0"/>
+          <w:sz w:val="20"/>
+        </w:rPr>
+        <w:t>, 85%), so full fine-tuning appears to reduce, but not remove, acquisition sensitivity.</w:t>
       </w:r>
     </w:p>
     <w:p>
@@ -7511,7 +8189,151 @@
           <w:i w:val="0"/>
           <w:sz w:val="20"/>
         </w:rPr>
-        <w:t>)[, and in CV].</w:t>
+        <w:t>) and in cross-validation (</w:t>
+      </w:r>
+      <w:r>
+        <w:rPr>
+          <w:rFonts w:ascii="Times New Roman" w:hAnsi="Times New Roman"/>
+          <w:b w:val="0"/>
+          <w:i w:val="0"/>
+          <w:sz w:val="20"/>
+        </w:rPr>
+        <w:t>−5.04</w:t>
+      </w:r>
+      <w:r>
+        <w:rPr>
+          <w:rFonts w:ascii="Times New Roman" w:hAnsi="Times New Roman"/>
+          <w:b w:val="0"/>
+          <w:i w:val="0"/>
+          <w:sz w:val="20"/>
+        </w:rPr>
+        <w:t xml:space="preserve"> vs </w:t>
+      </w:r>
+      <w:r>
+        <w:rPr>
+          <w:rFonts w:ascii="Times New Roman" w:hAnsi="Times New Roman"/>
+          <w:b w:val="0"/>
+          <w:i w:val="0"/>
+          <w:sz w:val="20"/>
+        </w:rPr>
+        <w:t>−5.05</w:t>
+      </w:r>
+      <w:r>
+        <w:rPr>
+          <w:rFonts w:ascii="Times New Roman" w:hAnsi="Times New Roman"/>
+          <w:b w:val="0"/>
+          <w:i w:val="0"/>
+          <w:sz w:val="20"/>
+        </w:rPr>
+        <w:t xml:space="preserve">). Ethnicity itself showed at most a small effect: non-White participants had a gap </w:t>
+      </w:r>
+      <w:r>
+        <w:rPr>
+          <w:rFonts w:ascii="Times New Roman" w:hAnsi="Times New Roman"/>
+          <w:b w:val="0"/>
+          <w:i w:val="0"/>
+          <w:sz w:val="20"/>
+        </w:rPr>
+        <w:t>+1.43</w:t>
+      </w:r>
+      <w:r>
+        <w:rPr>
+          <w:rFonts w:ascii="Times New Roman" w:hAnsi="Times New Roman"/>
+          <w:b w:val="0"/>
+          <w:i w:val="0"/>
+          <w:sz w:val="20"/>
+        </w:rPr>
+        <w:t xml:space="preserve"> years higher in cross-validation ([−0.02, 2.88], </w:t>
+      </w:r>
+      <w:r>
+        <w:rPr>
+          <w:rFonts w:ascii="Times New Roman" w:hAnsi="Times New Roman"/>
+          <w:b w:val="0"/>
+          <w:i w:val="0"/>
+          <w:sz w:val="20"/>
+        </w:rPr>
+        <w:t>p=0.054</w:t>
+      </w:r>
+      <w:r>
+        <w:rPr>
+          <w:rFonts w:ascii="Times New Roman" w:hAnsi="Times New Roman"/>
+          <w:b w:val="0"/>
+          <w:i w:val="0"/>
+          <w:sz w:val="20"/>
+        </w:rPr>
+        <w:t xml:space="preserve">, 74 non-White), </w:t>
+      </w:r>
+      <w:r>
+        <w:rPr>
+          <w:rFonts w:ascii="Times New Roman" w:hAnsi="Times New Roman"/>
+          <w:b w:val="0"/>
+          <w:i w:val="0"/>
+          <w:sz w:val="20"/>
+        </w:rPr>
+        <w:t>+1.95</w:t>
+      </w:r>
+      <w:r>
+        <w:rPr>
+          <w:rFonts w:ascii="Times New Roman" w:hAnsi="Times New Roman"/>
+          <w:b w:val="0"/>
+          <w:i w:val="0"/>
+          <w:sz w:val="20"/>
+        </w:rPr>
+        <w:t xml:space="preserve"> in the main model's held-out subjects (</w:t>
+      </w:r>
+      <w:r>
+        <w:rPr>
+          <w:rFonts w:ascii="Times New Roman" w:hAnsi="Times New Roman"/>
+          <w:b w:val="0"/>
+          <w:i w:val="0"/>
+          <w:sz w:val="20"/>
+        </w:rPr>
+        <w:t>p=0.04</w:t>
+      </w:r>
+      <w:r>
+        <w:rPr>
+          <w:rFonts w:ascii="Times New Roman" w:hAnsi="Times New Roman"/>
+          <w:b w:val="0"/>
+          <w:i w:val="0"/>
+          <w:sz w:val="20"/>
+        </w:rPr>
+        <w:t>, 21 non-White) and none in the zero-shot model (</w:t>
+      </w:r>
+      <w:r>
+        <w:rPr>
+          <w:rFonts w:ascii="Times New Roman" w:hAnsi="Times New Roman"/>
+          <w:b w:val="0"/>
+          <w:i w:val="0"/>
+          <w:sz w:val="20"/>
+        </w:rPr>
+        <w:t>−0.18</w:t>
+      </w:r>
+      <w:r>
+        <w:rPr>
+          <w:rFonts w:ascii="Times New Roman" w:hAnsi="Times New Roman"/>
+          <w:b w:val="0"/>
+          <w:i w:val="0"/>
+          <w:sz w:val="20"/>
+        </w:rPr>
+        <w:t xml:space="preserve">), in line with the small ethnicity effects reported elsewhere </w:t>
+      </w:r>
+      <w:r>
+        <w:rPr>
+          <w:rFonts w:ascii="Times New Roman" w:hAnsi="Times New Roman"/>
+          <w:b w:val="0"/>
+          <w:i w:val="0"/>
+          <w:sz w:val="20"/>
+        </w:rPr>
+        <w:t>[20]</w:t>
+      </w:r>
+      <w:r>
+        <w:rPr>
+          <w:rFonts w:ascii="Times New Roman" w:hAnsi="Times New Roman"/>
+          <w:b w:val="0"/>
+          <w:i w:val="0"/>
+          <w:sz w:val="20"/>
+        </w:rPr>
+        <w:t>; with these numbers we report it as INCONCLUSIVE.</w:t>
       </w:r>
     </w:p>
     <w:p>
@@ -8490,7 +9312,133 @@
           <w:i w:val="0"/>
           <w:sz w:val="20"/>
         </w:rPr>
-        <w:t>). Removing the top-ranked 5% of cells changed predictions far more than random cells under both baselines ([smooth and mean baseline numbers, signed and absolute]), and Integrated Gradients agreed with the maps ([median Spearman, top-10% overlap]). No region differed by sex after FDR correction. By site, HH and IOP place 13–16% less attribution density on deep grey matter and 12–15% less on the hippocampus and amygdala than Guys (</w:t>
+        <w:t xml:space="preserve">). Removing the top-ranked 5% of cells changed predictions far more than random or bottom-ranked cells under both baselines (Table </w:t>
+      </w:r>
+      <w:r>
+        <w:rPr>
+          <w:rFonts w:ascii="Times New Roman" w:hAnsi="Times New Roman"/>
+          <w:b w:val="0"/>
+          <w:i w:val="0"/>
+          <w:sz w:val="20"/>
+        </w:rPr>
+        <w:t>VI</w:t>
+      </w:r>
+      <w:r>
+        <w:rPr>
+          <w:rFonts w:ascii="Times New Roman" w:hAnsi="Times New Roman"/>
+          <w:b w:val="0"/>
+          <w:i w:val="0"/>
+          <w:sz w:val="20"/>
+        </w:rPr>
+        <w:t xml:space="preserve">): </w:t>
+      </w:r>
+      <w:r>
+        <w:rPr>
+          <w:rFonts w:ascii="Times New Roman" w:hAnsi="Times New Roman"/>
+          <w:b w:val="0"/>
+          <w:i w:val="0"/>
+          <w:sz w:val="20"/>
+        </w:rPr>
+        <w:t>|Δŷ|</w:t>
+      </w:r>
+      <w:r>
+        <w:rPr>
+          <w:rFonts w:ascii="Times New Roman" w:hAnsi="Times New Roman"/>
+          <w:b w:val="0"/>
+          <w:i w:val="0"/>
+          <w:sz w:val="20"/>
+        </w:rPr>
+        <w:t xml:space="preserve"> 4.83 vs 1.18 vs 0.46 years with smoothing and 6.49 vs 1.99 vs 0.97 with mean infill (top </w:t>
+      </w:r>
+      <w:r>
+        <w:rPr>
+          <w:rFonts w:ascii="Times New Roman" w:hAnsi="Times New Roman"/>
+          <w:b w:val="0"/>
+          <w:i w:val="0"/>
+          <w:sz w:val="20"/>
+        </w:rPr>
+        <w:t>&gt;</w:t>
+      </w:r>
+      <w:r>
+        <w:rPr>
+          <w:rFonts w:ascii="Times New Roman" w:hAnsi="Times New Roman"/>
+          <w:b w:val="0"/>
+          <w:i w:val="0"/>
+          <w:sz w:val="20"/>
+        </w:rPr>
+        <w:t xml:space="preserve"> random in 95% and 88% of subjects, Wilcoxon </w:t>
+      </w:r>
+      <w:r>
+        <w:rPr>
+          <w:rFonts w:ascii="Times New Roman" w:hAnsi="Times New Roman"/>
+          <w:b w:val="0"/>
+          <w:i w:val="0"/>
+          <w:sz w:val="20"/>
+        </w:rPr>
+        <w:t>p&lt;10⁻⁸</w:t>
+      </w:r>
+      <w:r>
+        <w:rPr>
+          <w:rFonts w:ascii="Times New Roman" w:hAnsi="Times New Roman"/>
+          <w:b w:val="0"/>
+          <w:i w:val="0"/>
+          <w:sz w:val="20"/>
+        </w:rPr>
+        <w:t xml:space="preserve">; random </w:t>
+      </w:r>
+      <w:r>
+        <w:rPr>
+          <w:rFonts w:ascii="Times New Roman" w:hAnsi="Times New Roman"/>
+          <w:b w:val="0"/>
+          <w:i w:val="0"/>
+          <w:sz w:val="20"/>
+        </w:rPr>
+        <w:t>&gt;</w:t>
+      </w:r>
+      <w:r>
+        <w:rPr>
+          <w:rFonts w:ascii="Times New Roman" w:hAnsi="Times New Roman"/>
+          <w:b w:val="0"/>
+          <w:i w:val="0"/>
+          <w:sz w:val="20"/>
+        </w:rPr>
+        <w:t xml:space="preserve"> bottom, </w:t>
+      </w:r>
+      <w:r>
+        <w:rPr>
+          <w:rFonts w:ascii="Times New Roman" w:hAnsi="Times New Roman"/>
+          <w:b w:val="0"/>
+          <w:i w:val="0"/>
+          <w:sz w:val="20"/>
+        </w:rPr>
+        <w:t>p&lt;10⁻⁴</w:t>
+      </w:r>
+      <w:r>
+        <w:rPr>
+          <w:rFonts w:ascii="Times New Roman" w:hAnsi="Times New Roman"/>
+          <w:b w:val="0"/>
+          <w:i w:val="0"/>
+          <w:sz w:val="20"/>
+        </w:rPr>
+        <w:t xml:space="preserve">). The signed change from removing top-ranked cells was positive (+1.67 and +2.56 years): predictions became </w:t>
+      </w:r>
+      <w:r>
+        <w:rPr>
+          <w:rFonts w:ascii="Times New Roman" w:hAnsi="Times New Roman"/>
+          <w:b w:val="0"/>
+          <w:i/>
+          <w:sz w:val="20"/>
+        </w:rPr>
+        <w:t>older</w:t>
+      </w:r>
+      <w:r>
+        <w:rPr>
+          <w:rFonts w:ascii="Times New Roman" w:hAnsi="Times New Roman"/>
+          <w:b w:val="0"/>
+          <w:i w:val="0"/>
+          <w:sz w:val="20"/>
+        </w:rPr>
+        <w:t>, opposite to the effect of blur, so the result is not driven by the smoothing baseline. Integrated Gradients agreed with the maps (median Spearman 0.58 across brain cells; 40% overlap of the top 10% of cells, against 10% expected by chance). No region differed by sex after FDR correction. By site, HH and IOP place 13–16% less attribution density on deep grey matter and 12–15% less on the hippocampus and amygdala than Guys (</w:t>
       </w:r>
       <w:r>
         <w:rPr>
@@ -8510,6 +9458,1024 @@
         </w:rPr>
         <w:t>); these are relative differences in density, not artefacts of region size.</w:t>
       </w:r>
+    </w:p>
+    <w:p>
+      <w:pPr>
+        <w:keepNext/>
+        <w:spacing w:before="120" w:after="0" w:line="240" w:lineRule="auto"/>
+        <w:jc w:val="center"/>
+      </w:pPr>
+      <w:r>
+        <w:rPr>
+          <w:rFonts w:ascii="Times New Roman" w:hAnsi="Times New Roman"/>
+          <w:b w:val="0"/>
+          <w:i w:val="0"/>
+          <w:sz w:val="16"/>
+        </w:rPr>
+        <w:t>TABLE VI</w:t>
+      </w:r>
+    </w:p>
+    <w:p>
+      <w:pPr>
+        <w:keepNext/>
+        <w:spacing w:before="0" w:after="60" w:line="240" w:lineRule="auto"/>
+        <w:jc w:val="center"/>
+      </w:pPr>
+      <w:r>
+        <w:rPr>
+          <w:rFonts w:ascii="Times New Roman" w:hAnsi="Times New Roman"/>
+          <w:b w:val="0"/>
+          <w:i w:val="0"/>
+          <w:sz w:val="16"/>
+        </w:rPr>
+        <w:t>Deletion test, 60 held-out subjects (years)</w:t>
+      </w:r>
+    </w:p>
+    <w:tbl>
+      <w:tblPr>
+        <w:tblW w:type="auto" w:w="0"/>
+        <w:jc w:val="center"/>
+        <w:tblLook w:firstColumn="1" w:firstRow="1" w:lastColumn="0" w:lastRow="0" w:noHBand="0" w:noVBand="1" w:val="04A0"/>
+      </w:tblPr>
+      <w:tblGrid>
+        <w:gridCol w:w="2062"/>
+        <w:gridCol w:w="2062"/>
+        <w:gridCol w:w="2062"/>
+        <w:gridCol w:w="2062"/>
+        <w:gridCol w:w="2062"/>
+      </w:tblGrid>
+      <w:tr>
+        <w:tc>
+          <w:tcPr>
+            <w:tcW w:type="dxa" w:w="2062"/>
+            <w:tcBorders>
+              <w:top w:val="single" w:sz="8"/>
+              <w:bottom w:val="nil" w:sz="0"/>
+              <w:left w:val="nil"/>
+              <w:right w:val="nil"/>
+            </w:tcBorders>
+          </w:tcPr>
+          <w:p>
+            <w:pPr>
+              <w:spacing w:before="20" w:after="20"/>
+              <w:jc w:val="left"/>
+            </w:pPr>
+            <w:r>
+              <w:rPr>
+                <w:rFonts w:ascii="Times New Roman" w:hAnsi="Times New Roman"/>
+                <w:b/>
+                <w:i w:val="0"/>
+                <w:sz w:val="16"/>
+              </w:rPr>
+              <w:t>Baseline</w:t>
+            </w:r>
+          </w:p>
+        </w:tc>
+        <w:tc>
+          <w:tcPr>
+            <w:tcW w:type="dxa" w:w="2062"/>
+            <w:tcBorders>
+              <w:top w:val="single" w:sz="8"/>
+              <w:bottom w:val="nil" w:sz="0"/>
+              <w:left w:val="nil"/>
+              <w:right w:val="nil"/>
+            </w:tcBorders>
+          </w:tcPr>
+          <w:p>
+            <w:pPr>
+              <w:spacing w:before="20" w:after="20"/>
+              <w:jc w:val="center"/>
+            </w:pPr>
+            <w:r>
+              <w:rPr>
+                <w:rFonts w:ascii="Times New Roman" w:hAnsi="Times New Roman"/>
+                <w:b/>
+                <w:i w:val="0"/>
+                <w:sz w:val="16"/>
+              </w:rPr>
+              <w:t>Removed</w:t>
+            </w:r>
+          </w:p>
+        </w:tc>
+        <w:tc>
+          <w:tcPr>
+            <w:tcW w:type="dxa" w:w="2062"/>
+            <w:tcBorders>
+              <w:top w:val="single" w:sz="8"/>
+              <w:bottom w:val="nil" w:sz="0"/>
+              <w:left w:val="nil"/>
+              <w:right w:val="nil"/>
+            </w:tcBorders>
+          </w:tcPr>
+          <w:p>
+            <w:pPr>
+              <w:spacing w:before="20" w:after="20"/>
+              <w:jc w:val="center"/>
+            </w:pPr>
+            <w:r>
+              <w:rPr>
+                <w:rFonts w:ascii="Times New Roman" w:hAnsi="Times New Roman"/>
+                <w:b/>
+                <w:i w:val="0"/>
+                <w:sz w:val="16"/>
+              </w:rPr>
+              <w:t>Top-ranked</w:t>
+            </w:r>
+          </w:p>
+        </w:tc>
+        <w:tc>
+          <w:tcPr>
+            <w:tcW w:type="dxa" w:w="2062"/>
+            <w:tcBorders>
+              <w:top w:val="single" w:sz="8"/>
+              <w:bottom w:val="nil" w:sz="0"/>
+              <w:left w:val="nil"/>
+              <w:right w:val="nil"/>
+            </w:tcBorders>
+          </w:tcPr>
+          <w:p>
+            <w:pPr>
+              <w:spacing w:before="20" w:after="20"/>
+              <w:jc w:val="center"/>
+            </w:pPr>
+            <w:r>
+              <w:rPr>
+                <w:rFonts w:ascii="Times New Roman" w:hAnsi="Times New Roman"/>
+                <w:b/>
+                <w:i w:val="0"/>
+                <w:sz w:val="16"/>
+              </w:rPr>
+              <w:t>Random</w:t>
+            </w:r>
+          </w:p>
+        </w:tc>
+        <w:tc>
+          <w:tcPr>
+            <w:tcW w:type="dxa" w:w="2062"/>
+            <w:tcBorders>
+              <w:top w:val="single" w:sz="8"/>
+              <w:bottom w:val="nil" w:sz="0"/>
+              <w:left w:val="nil"/>
+              <w:right w:val="nil"/>
+            </w:tcBorders>
+          </w:tcPr>
+          <w:p>
+            <w:pPr>
+              <w:spacing w:before="20" w:after="20"/>
+              <w:jc w:val="center"/>
+            </w:pPr>
+            <w:r>
+              <w:rPr>
+                <w:rFonts w:ascii="Times New Roman" w:hAnsi="Times New Roman"/>
+                <w:b/>
+                <w:i w:val="0"/>
+                <w:sz w:val="16"/>
+              </w:rPr>
+              <w:t>Bottom-ranked</w:t>
+            </w:r>
+          </w:p>
+        </w:tc>
+      </w:tr>
+      <w:tr>
+        <w:tc>
+          <w:tcPr>
+            <w:tcW w:type="dxa" w:w="2062"/>
+            <w:tcBorders>
+              <w:top w:val="single" w:sz="8"/>
+              <w:bottom w:val="nil" w:sz="0"/>
+              <w:left w:val="nil"/>
+              <w:right w:val="nil"/>
+            </w:tcBorders>
+          </w:tcPr>
+          <w:p>
+            <w:pPr>
+              <w:spacing w:before="20" w:after="20"/>
+              <w:jc w:val="left"/>
+            </w:pPr>
+            <w:r>
+              <w:rPr>
+                <w:rFonts w:ascii="Times New Roman" w:hAnsi="Times New Roman"/>
+                <w:b w:val="0"/>
+                <w:i w:val="0"/>
+                <w:sz w:val="16"/>
+              </w:rPr>
+              <w:t>Smoothing</w:t>
+            </w:r>
+          </w:p>
+        </w:tc>
+        <w:tc>
+          <w:tcPr>
+            <w:tcW w:type="dxa" w:w="2062"/>
+            <w:tcBorders>
+              <w:top w:val="single" w:sz="8"/>
+              <w:bottom w:val="nil" w:sz="0"/>
+              <w:left w:val="nil"/>
+              <w:right w:val="nil"/>
+            </w:tcBorders>
+          </w:tcPr>
+          <w:p>
+            <w:pPr>
+              <w:spacing w:before="20" w:after="20"/>
+              <w:jc w:val="center"/>
+            </w:pPr>
+            <w:r>
+              <w:rPr>
+                <w:rFonts w:ascii="Times New Roman" w:hAnsi="Times New Roman"/>
+                <w:b w:val="0"/>
+                <w:i w:val="0"/>
+                <w:sz w:val="16"/>
+              </w:rPr>
+              <w:t>5%</w:t>
+            </w:r>
+          </w:p>
+        </w:tc>
+        <w:tc>
+          <w:tcPr>
+            <w:tcW w:type="dxa" w:w="2062"/>
+            <w:tcBorders>
+              <w:top w:val="single" w:sz="8"/>
+              <w:bottom w:val="nil" w:sz="0"/>
+              <w:left w:val="nil"/>
+              <w:right w:val="nil"/>
+            </w:tcBorders>
+          </w:tcPr>
+          <w:p>
+            <w:pPr>
+              <w:spacing w:before="20" w:after="20"/>
+              <w:jc w:val="center"/>
+            </w:pPr>
+            <w:r>
+              <w:rPr>
+                <w:rFonts w:ascii="Times New Roman" w:hAnsi="Times New Roman"/>
+                <w:b/>
+                <w:i w:val="0"/>
+                <w:sz w:val="16"/>
+              </w:rPr>
+              <w:t>4.83</w:t>
+            </w:r>
+            <w:r>
+              <w:rPr>
+                <w:rFonts w:ascii="Times New Roman" w:hAnsi="Times New Roman"/>
+                <w:b w:val="0"/>
+                <w:i w:val="0"/>
+                <w:sz w:val="16"/>
+              </w:rPr>
+              <w:t xml:space="preserve"> (</w:t>
+            </w:r>
+            <w:r>
+              <w:rPr>
+                <w:rFonts w:ascii="Times New Roman" w:hAnsi="Times New Roman"/>
+                <w:b w:val="0"/>
+                <w:i w:val="0"/>
+                <w:sz w:val="16"/>
+              </w:rPr>
+              <w:t>+1.67</w:t>
+            </w:r>
+            <w:r>
+              <w:rPr>
+                <w:rFonts w:ascii="Times New Roman" w:hAnsi="Times New Roman"/>
+                <w:b w:val="0"/>
+                <w:i w:val="0"/>
+                <w:sz w:val="16"/>
+              </w:rPr>
+              <w:t>)</w:t>
+            </w:r>
+          </w:p>
+        </w:tc>
+        <w:tc>
+          <w:tcPr>
+            <w:tcW w:type="dxa" w:w="2062"/>
+            <w:tcBorders>
+              <w:top w:val="single" w:sz="8"/>
+              <w:bottom w:val="nil" w:sz="0"/>
+              <w:left w:val="nil"/>
+              <w:right w:val="nil"/>
+            </w:tcBorders>
+          </w:tcPr>
+          <w:p>
+            <w:pPr>
+              <w:spacing w:before="20" w:after="20"/>
+              <w:jc w:val="center"/>
+            </w:pPr>
+            <w:r>
+              <w:rPr>
+                <w:rFonts w:ascii="Times New Roman" w:hAnsi="Times New Roman"/>
+                <w:b w:val="0"/>
+                <w:i w:val="0"/>
+                <w:sz w:val="16"/>
+              </w:rPr>
+              <w:t>1.18 (</w:t>
+            </w:r>
+            <w:r>
+              <w:rPr>
+                <w:rFonts w:ascii="Times New Roman" w:hAnsi="Times New Roman"/>
+                <w:b w:val="0"/>
+                <w:i w:val="0"/>
+                <w:sz w:val="16"/>
+              </w:rPr>
+              <w:t>+0.22</w:t>
+            </w:r>
+            <w:r>
+              <w:rPr>
+                <w:rFonts w:ascii="Times New Roman" w:hAnsi="Times New Roman"/>
+                <w:b w:val="0"/>
+                <w:i w:val="0"/>
+                <w:sz w:val="16"/>
+              </w:rPr>
+              <w:t>)</w:t>
+            </w:r>
+          </w:p>
+        </w:tc>
+        <w:tc>
+          <w:tcPr>
+            <w:tcW w:type="dxa" w:w="2062"/>
+            <w:tcBorders>
+              <w:top w:val="single" w:sz="8"/>
+              <w:bottom w:val="nil" w:sz="0"/>
+              <w:left w:val="nil"/>
+              <w:right w:val="nil"/>
+            </w:tcBorders>
+          </w:tcPr>
+          <w:p>
+            <w:pPr>
+              <w:spacing w:before="20" w:after="20"/>
+              <w:jc w:val="center"/>
+            </w:pPr>
+            <w:r>
+              <w:rPr>
+                <w:rFonts w:ascii="Times New Roman" w:hAnsi="Times New Roman"/>
+                <w:b w:val="0"/>
+                <w:i w:val="0"/>
+                <w:sz w:val="16"/>
+              </w:rPr>
+              <w:t>0.46 (</w:t>
+            </w:r>
+            <w:r>
+              <w:rPr>
+                <w:rFonts w:ascii="Times New Roman" w:hAnsi="Times New Roman"/>
+                <w:b w:val="0"/>
+                <w:i w:val="0"/>
+                <w:sz w:val="16"/>
+              </w:rPr>
+              <w:t>−0.12</w:t>
+            </w:r>
+            <w:r>
+              <w:rPr>
+                <w:rFonts w:ascii="Times New Roman" w:hAnsi="Times New Roman"/>
+                <w:b w:val="0"/>
+                <w:i w:val="0"/>
+                <w:sz w:val="16"/>
+              </w:rPr>
+              <w:t>)</w:t>
+            </w:r>
+          </w:p>
+        </w:tc>
+      </w:tr>
+      <w:tr>
+        <w:tc>
+          <w:tcPr>
+            <w:tcW w:type="dxa" w:w="2062"/>
+            <w:tcBorders>
+              <w:top w:val="nil" w:sz="0"/>
+              <w:bottom w:val="nil" w:sz="0"/>
+              <w:left w:val="nil"/>
+              <w:right w:val="nil"/>
+            </w:tcBorders>
+          </w:tcPr>
+          <w:p>
+            <w:pPr>
+              <w:spacing w:before="20" w:after="20"/>
+              <w:jc w:val="left"/>
+            </w:pPr>
+            <w:r>
+              <w:rPr>
+                <w:rFonts w:ascii="Times New Roman" w:hAnsi="Times New Roman"/>
+                <w:b w:val="0"/>
+                <w:i w:val="0"/>
+                <w:sz w:val="16"/>
+              </w:rPr>
+              <w:t>Smoothing</w:t>
+            </w:r>
+          </w:p>
+        </w:tc>
+        <w:tc>
+          <w:tcPr>
+            <w:tcW w:type="dxa" w:w="2062"/>
+            <w:tcBorders>
+              <w:top w:val="nil" w:sz="0"/>
+              <w:bottom w:val="nil" w:sz="0"/>
+              <w:left w:val="nil"/>
+              <w:right w:val="nil"/>
+            </w:tcBorders>
+          </w:tcPr>
+          <w:p>
+            <w:pPr>
+              <w:spacing w:before="20" w:after="20"/>
+              <w:jc w:val="center"/>
+            </w:pPr>
+            <w:r>
+              <w:rPr>
+                <w:rFonts w:ascii="Times New Roman" w:hAnsi="Times New Roman"/>
+                <w:b w:val="0"/>
+                <w:i w:val="0"/>
+                <w:sz w:val="16"/>
+              </w:rPr>
+              <w:t>10%</w:t>
+            </w:r>
+          </w:p>
+        </w:tc>
+        <w:tc>
+          <w:tcPr>
+            <w:tcW w:type="dxa" w:w="2062"/>
+            <w:tcBorders>
+              <w:top w:val="nil" w:sz="0"/>
+              <w:bottom w:val="nil" w:sz="0"/>
+              <w:left w:val="nil"/>
+              <w:right w:val="nil"/>
+            </w:tcBorders>
+          </w:tcPr>
+          <w:p>
+            <w:pPr>
+              <w:spacing w:before="20" w:after="20"/>
+              <w:jc w:val="center"/>
+            </w:pPr>
+            <w:r>
+              <w:rPr>
+                <w:rFonts w:ascii="Times New Roman" w:hAnsi="Times New Roman"/>
+                <w:b/>
+                <w:i w:val="0"/>
+                <w:sz w:val="16"/>
+              </w:rPr>
+              <w:t>6.05</w:t>
+            </w:r>
+            <w:r>
+              <w:rPr>
+                <w:rFonts w:ascii="Times New Roman" w:hAnsi="Times New Roman"/>
+                <w:b w:val="0"/>
+                <w:i w:val="0"/>
+                <w:sz w:val="16"/>
+              </w:rPr>
+              <w:t xml:space="preserve"> (</w:t>
+            </w:r>
+            <w:r>
+              <w:rPr>
+                <w:rFonts w:ascii="Times New Roman" w:hAnsi="Times New Roman"/>
+                <w:b w:val="0"/>
+                <w:i w:val="0"/>
+                <w:sz w:val="16"/>
+              </w:rPr>
+              <w:t>+0.93</w:t>
+            </w:r>
+            <w:r>
+              <w:rPr>
+                <w:rFonts w:ascii="Times New Roman" w:hAnsi="Times New Roman"/>
+                <w:b w:val="0"/>
+                <w:i w:val="0"/>
+                <w:sz w:val="16"/>
+              </w:rPr>
+              <w:t>)</w:t>
+            </w:r>
+          </w:p>
+        </w:tc>
+        <w:tc>
+          <w:tcPr>
+            <w:tcW w:type="dxa" w:w="2062"/>
+            <w:tcBorders>
+              <w:top w:val="nil" w:sz="0"/>
+              <w:bottom w:val="nil" w:sz="0"/>
+              <w:left w:val="nil"/>
+              <w:right w:val="nil"/>
+            </w:tcBorders>
+          </w:tcPr>
+          <w:p>
+            <w:pPr>
+              <w:spacing w:before="20" w:after="20"/>
+              <w:jc w:val="center"/>
+            </w:pPr>
+            <w:r>
+              <w:rPr>
+                <w:rFonts w:ascii="Times New Roman" w:hAnsi="Times New Roman"/>
+                <w:b w:val="0"/>
+                <w:i w:val="0"/>
+                <w:sz w:val="16"/>
+              </w:rPr>
+              <w:t>1.85 (</w:t>
+            </w:r>
+            <w:r>
+              <w:rPr>
+                <w:rFonts w:ascii="Times New Roman" w:hAnsi="Times New Roman"/>
+                <w:b w:val="0"/>
+                <w:i w:val="0"/>
+                <w:sz w:val="16"/>
+              </w:rPr>
+              <w:t>−0.35</w:t>
+            </w:r>
+            <w:r>
+              <w:rPr>
+                <w:rFonts w:ascii="Times New Roman" w:hAnsi="Times New Roman"/>
+                <w:b w:val="0"/>
+                <w:i w:val="0"/>
+                <w:sz w:val="16"/>
+              </w:rPr>
+              <w:t>)</w:t>
+            </w:r>
+          </w:p>
+        </w:tc>
+        <w:tc>
+          <w:tcPr>
+            <w:tcW w:type="dxa" w:w="2062"/>
+            <w:tcBorders>
+              <w:top w:val="nil" w:sz="0"/>
+              <w:bottom w:val="nil" w:sz="0"/>
+              <w:left w:val="nil"/>
+              <w:right w:val="nil"/>
+            </w:tcBorders>
+          </w:tcPr>
+          <w:p>
+            <w:pPr>
+              <w:spacing w:before="20" w:after="20"/>
+              <w:jc w:val="center"/>
+            </w:pPr>
+            <w:r>
+              <w:rPr>
+                <w:rFonts w:ascii="Times New Roman" w:hAnsi="Times New Roman"/>
+                <w:b w:val="0"/>
+                <w:i w:val="0"/>
+                <w:sz w:val="16"/>
+              </w:rPr>
+              <w:t>0.71 (</w:t>
+            </w:r>
+            <w:r>
+              <w:rPr>
+                <w:rFonts w:ascii="Times New Roman" w:hAnsi="Times New Roman"/>
+                <w:b w:val="0"/>
+                <w:i w:val="0"/>
+                <w:sz w:val="16"/>
+              </w:rPr>
+              <w:t>−0.05</w:t>
+            </w:r>
+            <w:r>
+              <w:rPr>
+                <w:rFonts w:ascii="Times New Roman" w:hAnsi="Times New Roman"/>
+                <w:b w:val="0"/>
+                <w:i w:val="0"/>
+                <w:sz w:val="16"/>
+              </w:rPr>
+              <w:t>)</w:t>
+            </w:r>
+          </w:p>
+        </w:tc>
+      </w:tr>
+      <w:tr>
+        <w:tc>
+          <w:tcPr>
+            <w:tcW w:type="dxa" w:w="2062"/>
+            <w:tcBorders>
+              <w:top w:val="nil" w:sz="0"/>
+              <w:bottom w:val="nil" w:sz="0"/>
+              <w:left w:val="nil"/>
+              <w:right w:val="nil"/>
+            </w:tcBorders>
+          </w:tcPr>
+          <w:p>
+            <w:pPr>
+              <w:spacing w:before="20" w:after="20"/>
+              <w:jc w:val="left"/>
+            </w:pPr>
+            <w:r>
+              <w:rPr>
+                <w:rFonts w:ascii="Times New Roman" w:hAnsi="Times New Roman"/>
+                <w:b w:val="0"/>
+                <w:i w:val="0"/>
+                <w:sz w:val="16"/>
+              </w:rPr>
+              <w:t>Mean infill</w:t>
+            </w:r>
+          </w:p>
+        </w:tc>
+        <w:tc>
+          <w:tcPr>
+            <w:tcW w:type="dxa" w:w="2062"/>
+            <w:tcBorders>
+              <w:top w:val="nil" w:sz="0"/>
+              <w:bottom w:val="nil" w:sz="0"/>
+              <w:left w:val="nil"/>
+              <w:right w:val="nil"/>
+            </w:tcBorders>
+          </w:tcPr>
+          <w:p>
+            <w:pPr>
+              <w:spacing w:before="20" w:after="20"/>
+              <w:jc w:val="center"/>
+            </w:pPr>
+            <w:r>
+              <w:rPr>
+                <w:rFonts w:ascii="Times New Roman" w:hAnsi="Times New Roman"/>
+                <w:b w:val="0"/>
+                <w:i w:val="0"/>
+                <w:sz w:val="16"/>
+              </w:rPr>
+              <w:t>5%</w:t>
+            </w:r>
+          </w:p>
+        </w:tc>
+        <w:tc>
+          <w:tcPr>
+            <w:tcW w:type="dxa" w:w="2062"/>
+            <w:tcBorders>
+              <w:top w:val="nil" w:sz="0"/>
+              <w:bottom w:val="nil" w:sz="0"/>
+              <w:left w:val="nil"/>
+              <w:right w:val="nil"/>
+            </w:tcBorders>
+          </w:tcPr>
+          <w:p>
+            <w:pPr>
+              <w:spacing w:before="20" w:after="20"/>
+              <w:jc w:val="center"/>
+            </w:pPr>
+            <w:r>
+              <w:rPr>
+                <w:rFonts w:ascii="Times New Roman" w:hAnsi="Times New Roman"/>
+                <w:b/>
+                <w:i w:val="0"/>
+                <w:sz w:val="16"/>
+              </w:rPr>
+              <w:t>6.49</w:t>
+            </w:r>
+            <w:r>
+              <w:rPr>
+                <w:rFonts w:ascii="Times New Roman" w:hAnsi="Times New Roman"/>
+                <w:b w:val="0"/>
+                <w:i w:val="0"/>
+                <w:sz w:val="16"/>
+              </w:rPr>
+              <w:t xml:space="preserve"> (</w:t>
+            </w:r>
+            <w:r>
+              <w:rPr>
+                <w:rFonts w:ascii="Times New Roman" w:hAnsi="Times New Roman"/>
+                <w:b w:val="0"/>
+                <w:i w:val="0"/>
+                <w:sz w:val="16"/>
+              </w:rPr>
+              <w:t>+2.56</w:t>
+            </w:r>
+            <w:r>
+              <w:rPr>
+                <w:rFonts w:ascii="Times New Roman" w:hAnsi="Times New Roman"/>
+                <w:b w:val="0"/>
+                <w:i w:val="0"/>
+                <w:sz w:val="16"/>
+              </w:rPr>
+              <w:t>)</w:t>
+            </w:r>
+          </w:p>
+        </w:tc>
+        <w:tc>
+          <w:tcPr>
+            <w:tcW w:type="dxa" w:w="2062"/>
+            <w:tcBorders>
+              <w:top w:val="nil" w:sz="0"/>
+              <w:bottom w:val="nil" w:sz="0"/>
+              <w:left w:val="nil"/>
+              <w:right w:val="nil"/>
+            </w:tcBorders>
+          </w:tcPr>
+          <w:p>
+            <w:pPr>
+              <w:spacing w:before="20" w:after="20"/>
+              <w:jc w:val="center"/>
+            </w:pPr>
+            <w:r>
+              <w:rPr>
+                <w:rFonts w:ascii="Times New Roman" w:hAnsi="Times New Roman"/>
+                <w:b w:val="0"/>
+                <w:i w:val="0"/>
+                <w:sz w:val="16"/>
+              </w:rPr>
+              <w:t>1.99 (</w:t>
+            </w:r>
+            <w:r>
+              <w:rPr>
+                <w:rFonts w:ascii="Times New Roman" w:hAnsi="Times New Roman"/>
+                <w:b w:val="0"/>
+                <w:i w:val="0"/>
+                <w:sz w:val="16"/>
+              </w:rPr>
+              <w:t>−0.60</w:t>
+            </w:r>
+            <w:r>
+              <w:rPr>
+                <w:rFonts w:ascii="Times New Roman" w:hAnsi="Times New Roman"/>
+                <w:b w:val="0"/>
+                <w:i w:val="0"/>
+                <w:sz w:val="16"/>
+              </w:rPr>
+              <w:t>)</w:t>
+            </w:r>
+          </w:p>
+        </w:tc>
+        <w:tc>
+          <w:tcPr>
+            <w:tcW w:type="dxa" w:w="2062"/>
+            <w:tcBorders>
+              <w:top w:val="nil" w:sz="0"/>
+              <w:bottom w:val="nil" w:sz="0"/>
+              <w:left w:val="nil"/>
+              <w:right w:val="nil"/>
+            </w:tcBorders>
+          </w:tcPr>
+          <w:p>
+            <w:pPr>
+              <w:spacing w:before="20" w:after="20"/>
+              <w:jc w:val="center"/>
+            </w:pPr>
+            <w:r>
+              <w:rPr>
+                <w:rFonts w:ascii="Times New Roman" w:hAnsi="Times New Roman"/>
+                <w:b w:val="0"/>
+                <w:i w:val="0"/>
+                <w:sz w:val="16"/>
+              </w:rPr>
+              <w:t>0.97 (</w:t>
+            </w:r>
+            <w:r>
+              <w:rPr>
+                <w:rFonts w:ascii="Times New Roman" w:hAnsi="Times New Roman"/>
+                <w:b w:val="0"/>
+                <w:i w:val="0"/>
+                <w:sz w:val="16"/>
+              </w:rPr>
+              <w:t>−0.87</w:t>
+            </w:r>
+            <w:r>
+              <w:rPr>
+                <w:rFonts w:ascii="Times New Roman" w:hAnsi="Times New Roman"/>
+                <w:b w:val="0"/>
+                <w:i w:val="0"/>
+                <w:sz w:val="16"/>
+              </w:rPr>
+              <w:t>)</w:t>
+            </w:r>
+          </w:p>
+        </w:tc>
+      </w:tr>
+      <w:tr>
+        <w:tc>
+          <w:tcPr>
+            <w:tcW w:type="dxa" w:w="2062"/>
+            <w:tcBorders>
+              <w:top w:val="nil" w:sz="0"/>
+              <w:bottom w:val="single" w:sz="8"/>
+              <w:left w:val="nil"/>
+              <w:right w:val="nil"/>
+            </w:tcBorders>
+          </w:tcPr>
+          <w:p>
+            <w:pPr>
+              <w:spacing w:before="20" w:after="20"/>
+              <w:jc w:val="left"/>
+            </w:pPr>
+            <w:r>
+              <w:rPr>
+                <w:rFonts w:ascii="Times New Roman" w:hAnsi="Times New Roman"/>
+                <w:b w:val="0"/>
+                <w:i w:val="0"/>
+                <w:sz w:val="16"/>
+              </w:rPr>
+              <w:t>Mean infill</w:t>
+            </w:r>
+          </w:p>
+        </w:tc>
+        <w:tc>
+          <w:tcPr>
+            <w:tcW w:type="dxa" w:w="2062"/>
+            <w:tcBorders>
+              <w:top w:val="nil" w:sz="0"/>
+              <w:bottom w:val="single" w:sz="8"/>
+              <w:left w:val="nil"/>
+              <w:right w:val="nil"/>
+            </w:tcBorders>
+          </w:tcPr>
+          <w:p>
+            <w:pPr>
+              <w:spacing w:before="20" w:after="20"/>
+              <w:jc w:val="center"/>
+            </w:pPr>
+            <w:r>
+              <w:rPr>
+                <w:rFonts w:ascii="Times New Roman" w:hAnsi="Times New Roman"/>
+                <w:b w:val="0"/>
+                <w:i w:val="0"/>
+                <w:sz w:val="16"/>
+              </w:rPr>
+              <w:t>10%</w:t>
+            </w:r>
+          </w:p>
+        </w:tc>
+        <w:tc>
+          <w:tcPr>
+            <w:tcW w:type="dxa" w:w="2062"/>
+            <w:tcBorders>
+              <w:top w:val="nil" w:sz="0"/>
+              <w:bottom w:val="single" w:sz="8"/>
+              <w:left w:val="nil"/>
+              <w:right w:val="nil"/>
+            </w:tcBorders>
+          </w:tcPr>
+          <w:p>
+            <w:pPr>
+              <w:spacing w:before="20" w:after="20"/>
+              <w:jc w:val="center"/>
+            </w:pPr>
+            <w:r>
+              <w:rPr>
+                <w:rFonts w:ascii="Times New Roman" w:hAnsi="Times New Roman"/>
+                <w:b/>
+                <w:i w:val="0"/>
+                <w:sz w:val="16"/>
+              </w:rPr>
+              <w:t>8.15</w:t>
+            </w:r>
+            <w:r>
+              <w:rPr>
+                <w:rFonts w:ascii="Times New Roman" w:hAnsi="Times New Roman"/>
+                <w:b w:val="0"/>
+                <w:i w:val="0"/>
+                <w:sz w:val="16"/>
+              </w:rPr>
+              <w:t xml:space="preserve"> (</w:t>
+            </w:r>
+            <w:r>
+              <w:rPr>
+                <w:rFonts w:ascii="Times New Roman" w:hAnsi="Times New Roman"/>
+                <w:b w:val="0"/>
+                <w:i w:val="0"/>
+                <w:sz w:val="16"/>
+              </w:rPr>
+              <w:t>+2.19</w:t>
+            </w:r>
+            <w:r>
+              <w:rPr>
+                <w:rFonts w:ascii="Times New Roman" w:hAnsi="Times New Roman"/>
+                <w:b w:val="0"/>
+                <w:i w:val="0"/>
+                <w:sz w:val="16"/>
+              </w:rPr>
+              <w:t>)</w:t>
+            </w:r>
+          </w:p>
+        </w:tc>
+        <w:tc>
+          <w:tcPr>
+            <w:tcW w:type="dxa" w:w="2062"/>
+            <w:tcBorders>
+              <w:top w:val="nil" w:sz="0"/>
+              <w:bottom w:val="single" w:sz="8"/>
+              <w:left w:val="nil"/>
+              <w:right w:val="nil"/>
+            </w:tcBorders>
+          </w:tcPr>
+          <w:p>
+            <w:pPr>
+              <w:spacing w:before="20" w:after="20"/>
+              <w:jc w:val="center"/>
+            </w:pPr>
+            <w:r>
+              <w:rPr>
+                <w:rFonts w:ascii="Times New Roman" w:hAnsi="Times New Roman"/>
+                <w:b w:val="0"/>
+                <w:i w:val="0"/>
+                <w:sz w:val="16"/>
+              </w:rPr>
+              <w:t>3.32 (</w:t>
+            </w:r>
+            <w:r>
+              <w:rPr>
+                <w:rFonts w:ascii="Times New Roman" w:hAnsi="Times New Roman"/>
+                <w:b w:val="0"/>
+                <w:i w:val="0"/>
+                <w:sz w:val="16"/>
+              </w:rPr>
+              <w:t>−1.23</w:t>
+            </w:r>
+            <w:r>
+              <w:rPr>
+                <w:rFonts w:ascii="Times New Roman" w:hAnsi="Times New Roman"/>
+                <w:b w:val="0"/>
+                <w:i w:val="0"/>
+                <w:sz w:val="16"/>
+              </w:rPr>
+              <w:t>)</w:t>
+            </w:r>
+          </w:p>
+        </w:tc>
+        <w:tc>
+          <w:tcPr>
+            <w:tcW w:type="dxa" w:w="2062"/>
+            <w:tcBorders>
+              <w:top w:val="nil" w:sz="0"/>
+              <w:bottom w:val="single" w:sz="8"/>
+              <w:left w:val="nil"/>
+              <w:right w:val="nil"/>
+            </w:tcBorders>
+          </w:tcPr>
+          <w:p>
+            <w:pPr>
+              <w:spacing w:before="20" w:after="20"/>
+              <w:jc w:val="center"/>
+            </w:pPr>
+            <w:r>
+              <w:rPr>
+                <w:rFonts w:ascii="Times New Roman" w:hAnsi="Times New Roman"/>
+                <w:b w:val="0"/>
+                <w:i w:val="0"/>
+                <w:sz w:val="16"/>
+              </w:rPr>
+              <w:t>1.49 (</w:t>
+            </w:r>
+            <w:r>
+              <w:rPr>
+                <w:rFonts w:ascii="Times New Roman" w:hAnsi="Times New Roman"/>
+                <w:b w:val="0"/>
+                <w:i w:val="0"/>
+                <w:sz w:val="16"/>
+              </w:rPr>
+              <w:t>−1.24</w:t>
+            </w:r>
+            <w:r>
+              <w:rPr>
+                <w:rFonts w:ascii="Times New Roman" w:hAnsi="Times New Roman"/>
+                <w:b w:val="0"/>
+                <w:i w:val="0"/>
+                <w:sz w:val="16"/>
+              </w:rPr>
+              <w:t>)</w:t>
+            </w:r>
+          </w:p>
+        </w:tc>
+      </w:tr>
+    </w:tbl>
+    <w:p>
+      <w:pPr>
+        <w:keepNext w:val="0"/>
+        <w:spacing w:before="0" w:after="0" w:line="240" w:lineRule="auto"/>
+        <w:jc w:val="left"/>
+      </w:pPr>
+      <w:r>
+        <w:rPr>
+          <w:rFonts w:ascii="Times New Roman" w:hAnsi="Times New Roman"/>
+          <w:b w:val="0"/>
+          <w:i w:val="0"/>
+          <w:sz w:val="15"/>
+        </w:rPr>
+        <w:t xml:space="preserve">Mean </w:t>
+      </w:r>
+      <w:r>
+        <w:rPr>
+          <w:rFonts w:ascii="Times New Roman" w:hAnsi="Times New Roman"/>
+          <w:b w:val="0"/>
+          <w:i w:val="0"/>
+          <w:sz w:val="15"/>
+        </w:rPr>
+        <w:t>|Δŷ|</w:t>
+      </w:r>
+      <w:r>
+        <w:rPr>
+          <w:rFonts w:ascii="Times New Roman" w:hAnsi="Times New Roman"/>
+          <w:b w:val="0"/>
+          <w:i w:val="0"/>
+          <w:sz w:val="15"/>
+        </w:rPr>
+        <w:t xml:space="preserve"> (mean signed </w:t>
+      </w:r>
+      <w:r>
+        <w:rPr>
+          <w:rFonts w:ascii="Times New Roman" w:hAnsi="Times New Roman"/>
+          <w:b w:val="0"/>
+          <w:i w:val="0"/>
+          <w:sz w:val="15"/>
+        </w:rPr>
+        <w:t>Δŷ</w:t>
+      </w:r>
+      <w:r>
+        <w:rPr>
+          <w:rFonts w:ascii="Times New Roman" w:hAnsi="Times New Roman"/>
+          <w:b w:val="0"/>
+          <w:i w:val="0"/>
+          <w:sz w:val="15"/>
+        </w:rPr>
+        <w:t>).</w:t>
+      </w:r>
+    </w:p>
+    <w:p>
+      <w:pPr>
+        <w:keepNext w:val="0"/>
+        <w:spacing w:before="0" w:after="0" w:line="240" w:lineRule="auto"/>
+        <w:ind w:firstLine="245"/>
+        <w:jc w:val="both"/>
+      </w:pPr>
     </w:p>
     <w:p>
       <w:pPr>
@@ -8646,7 +10612,745 @@
           <w:i w:val="0"/>
           <w:sz w:val="20"/>
         </w:rPr>
-        <w:t>The model's own spread was larger for IOP (8.06 vs 5.66 years for Guys) and doubled when IOP was unseen (12.46 vs 6.13) with 92% coverage, so the model signals unfamiliar data. Out of fold, the model's own 90% range covered [per-site coverage]; pooled conformal intervals [pending]; per-site conformal intervals [pending]. Per subject, uncertainty tracked error only weakly (Spearman 0.16).</w:t>
+        <w:t xml:space="preserve">The model's own spread was larger for IOP (8.06 vs 5.66 years for Guys) and doubled when IOP was unseen (12.46 vs 6.13) with 92% coverage, so the model signals unfamiliar data. Out of fold (Table </w:t>
+      </w:r>
+      <w:r>
+        <w:rPr>
+          <w:rFonts w:ascii="Times New Roman" w:hAnsi="Times New Roman"/>
+          <w:b w:val="0"/>
+          <w:i w:val="0"/>
+          <w:sz w:val="20"/>
+        </w:rPr>
+        <w:t>VII</w:t>
+      </w:r>
+      <w:r>
+        <w:rPr>
+          <w:rFonts w:ascii="Times New Roman" w:hAnsi="Times New Roman"/>
+          <w:b w:val="0"/>
+          <w:i w:val="0"/>
+          <w:sz w:val="20"/>
+        </w:rPr>
+        <w:t xml:space="preserve">), the model's own 90% range covered 94% of Guys, 89% of HH but only </w:t>
+      </w:r>
+      <w:r>
+        <w:rPr>
+          <w:rFonts w:ascii="Times New Roman" w:hAnsi="Times New Roman"/>
+          <w:b/>
+          <w:i w:val="0"/>
+          <w:sz w:val="20"/>
+        </w:rPr>
+        <w:t>77%</w:t>
+      </w:r>
+      <w:r>
+        <w:rPr>
+          <w:rFonts w:ascii="Times New Roman" w:hAnsi="Times New Roman"/>
+          <w:b w:val="0"/>
+          <w:i w:val="0"/>
+          <w:sz w:val="20"/>
+        </w:rPr>
+        <w:t xml:space="preserve"> of IOP subjects. Pooled split-conformal intervals, which guarantee coverage only on average, were worse for IOP (69%), whereas per-site (Mondrian) conformal intervals covered 91–92% at every site, at the price of much wider intervals for IOP (</w:t>
+      </w:r>
+      <w:r>
+        <w:rPr>
+          <w:rFonts w:ascii="Times New Roman" w:hAnsi="Times New Roman"/>
+          <w:b w:val="0"/>
+          <w:i w:val="0"/>
+          <w:sz w:val="20"/>
+        </w:rPr>
+        <w:t>±17.8</w:t>
+      </w:r>
+      <w:r>
+        <w:rPr>
+          <w:rFonts w:ascii="Times New Roman" w:hAnsi="Times New Roman"/>
+          <w:b w:val="0"/>
+          <w:i w:val="0"/>
+          <w:sz w:val="20"/>
+        </w:rPr>
+        <w:t xml:space="preserve"> vs </w:t>
+      </w:r>
+      <w:r>
+        <w:rPr>
+          <w:rFonts w:ascii="Times New Roman" w:hAnsi="Times New Roman"/>
+          <w:b w:val="0"/>
+          <w:i w:val="0"/>
+          <w:sz w:val="20"/>
+        </w:rPr>
+        <w:t>±8.2</w:t>
+      </w:r>
+      <w:r>
+        <w:rPr>
+          <w:rFonts w:ascii="Times New Roman" w:hAnsi="Times New Roman"/>
+          <w:b w:val="0"/>
+          <w:i w:val="0"/>
+          <w:sz w:val="20"/>
+        </w:rPr>
+        <w:t xml:space="preserve"> years for Guys). Disagreement between the 15 ensemble members was also largest for IOP on the test set (spread 3.1 vs 1.6 years for Guys). Average coverage thus hides that one site receives unreliable intervals; uncertainty must be calibrated per site, like accuracy and bias. Per subject, uncertainty tracked error only weakly (Spearman 0.16).</w:t>
+      </w:r>
+    </w:p>
+    <w:p>
+      <w:pPr>
+        <w:keepNext/>
+        <w:spacing w:before="120" w:after="0" w:line="240" w:lineRule="auto"/>
+        <w:jc w:val="center"/>
+      </w:pPr>
+      <w:r>
+        <w:rPr>
+          <w:rFonts w:ascii="Times New Roman" w:hAnsi="Times New Roman"/>
+          <w:b w:val="0"/>
+          <w:i w:val="0"/>
+          <w:sz w:val="16"/>
+        </w:rPr>
+        <w:t>TABLE VII</w:t>
+      </w:r>
+    </w:p>
+    <w:p>
+      <w:pPr>
+        <w:keepNext/>
+        <w:spacing w:before="0" w:after="60" w:line="240" w:lineRule="auto"/>
+        <w:jc w:val="center"/>
+      </w:pPr>
+      <w:r>
+        <w:rPr>
+          <w:rFonts w:ascii="Times New Roman" w:hAnsi="Times New Roman"/>
+          <w:b w:val="0"/>
+          <w:i w:val="0"/>
+          <w:sz w:val="16"/>
+        </w:rPr>
+        <w:t>Coverage of nominal 90% intervals, out-of-sample (CV)</w:t>
+      </w:r>
+    </w:p>
+    <w:tbl>
+      <w:tblPr>
+        <w:tblW w:type="auto" w:w="0"/>
+        <w:jc w:val="center"/>
+        <w:tblLook w:firstColumn="1" w:firstRow="1" w:lastColumn="0" w:lastRow="0" w:noHBand="0" w:noVBand="1" w:val="04A0"/>
+      </w:tblPr>
+      <w:tblGrid>
+        <w:gridCol w:w="2577"/>
+        <w:gridCol w:w="2577"/>
+        <w:gridCol w:w="2577"/>
+        <w:gridCol w:w="2577"/>
+      </w:tblGrid>
+      <w:tr>
+        <w:tc>
+          <w:tcPr>
+            <w:tcW w:type="dxa" w:w="2577"/>
+            <w:tcBorders>
+              <w:top w:val="single" w:sz="8"/>
+              <w:bottom w:val="nil" w:sz="0"/>
+              <w:left w:val="nil"/>
+              <w:right w:val="nil"/>
+            </w:tcBorders>
+          </w:tcPr>
+          <w:p>
+            <w:pPr>
+              <w:spacing w:before="20" w:after="20"/>
+              <w:jc w:val="left"/>
+            </w:pPr>
+            <w:r>
+              <w:rPr>
+                <w:rFonts w:ascii="Times New Roman" w:hAnsi="Times New Roman"/>
+                <w:b/>
+                <w:i w:val="0"/>
+                <w:sz w:val="16"/>
+              </w:rPr>
+              <w:t>Interval</w:t>
+            </w:r>
+          </w:p>
+        </w:tc>
+        <w:tc>
+          <w:tcPr>
+            <w:tcW w:type="dxa" w:w="2577"/>
+            <w:tcBorders>
+              <w:top w:val="single" w:sz="8"/>
+              <w:bottom w:val="nil" w:sz="0"/>
+              <w:left w:val="nil"/>
+              <w:right w:val="nil"/>
+            </w:tcBorders>
+          </w:tcPr>
+          <w:p>
+            <w:pPr>
+              <w:spacing w:before="20" w:after="20"/>
+              <w:jc w:val="center"/>
+            </w:pPr>
+            <w:r>
+              <w:rPr>
+                <w:rFonts w:ascii="Times New Roman" w:hAnsi="Times New Roman"/>
+                <w:b/>
+                <w:i w:val="0"/>
+                <w:sz w:val="16"/>
+              </w:rPr>
+              <w:t>Guys (</w:t>
+            </w:r>
+            <w:r>
+              <w:rPr>
+                <w:rFonts w:ascii="Times New Roman" w:hAnsi="Times New Roman"/>
+                <w:b/>
+                <w:i w:val="0"/>
+                <w:sz w:val="16"/>
+              </w:rPr>
+              <w:t>n</w:t>
+            </w:r>
+            <w:r>
+              <w:rPr>
+                <w:rFonts w:ascii="Times New Roman" w:hAnsi="Times New Roman"/>
+                <w:b/>
+                <w:i w:val="0"/>
+                <w:sz w:val="16"/>
+              </w:rPr>
+              <w:t>=233)</w:t>
+            </w:r>
+          </w:p>
+        </w:tc>
+        <w:tc>
+          <w:tcPr>
+            <w:tcW w:type="dxa" w:w="2577"/>
+            <w:tcBorders>
+              <w:top w:val="single" w:sz="8"/>
+              <w:bottom w:val="nil" w:sz="0"/>
+              <w:left w:val="nil"/>
+              <w:right w:val="nil"/>
+            </w:tcBorders>
+          </w:tcPr>
+          <w:p>
+            <w:pPr>
+              <w:spacing w:before="20" w:after="20"/>
+              <w:jc w:val="center"/>
+            </w:pPr>
+            <w:r>
+              <w:rPr>
+                <w:rFonts w:ascii="Times New Roman" w:hAnsi="Times New Roman"/>
+                <w:b/>
+                <w:i w:val="0"/>
+                <w:sz w:val="16"/>
+              </w:rPr>
+              <w:t>HH (127)</w:t>
+            </w:r>
+          </w:p>
+        </w:tc>
+        <w:tc>
+          <w:tcPr>
+            <w:tcW w:type="dxa" w:w="2577"/>
+            <w:tcBorders>
+              <w:top w:val="single" w:sz="8"/>
+              <w:bottom w:val="nil" w:sz="0"/>
+              <w:left w:val="nil"/>
+              <w:right w:val="nil"/>
+            </w:tcBorders>
+          </w:tcPr>
+          <w:p>
+            <w:pPr>
+              <w:spacing w:before="20" w:after="20"/>
+              <w:jc w:val="center"/>
+            </w:pPr>
+            <w:r>
+              <w:rPr>
+                <w:rFonts w:ascii="Times New Roman" w:hAnsi="Times New Roman"/>
+                <w:b/>
+                <w:i w:val="0"/>
+                <w:sz w:val="16"/>
+              </w:rPr>
+              <w:t>IOP (52)</w:t>
+            </w:r>
+          </w:p>
+        </w:tc>
+      </w:tr>
+      <w:tr>
+        <w:tc>
+          <w:tcPr>
+            <w:tcW w:type="dxa" w:w="2577"/>
+            <w:tcBorders>
+              <w:top w:val="single" w:sz="8"/>
+              <w:bottom w:val="nil" w:sz="0"/>
+              <w:left w:val="nil"/>
+              <w:right w:val="nil"/>
+            </w:tcBorders>
+          </w:tcPr>
+          <w:p>
+            <w:pPr>
+              <w:spacing w:before="20" w:after="20"/>
+              <w:jc w:val="left"/>
+            </w:pPr>
+            <w:r>
+              <w:rPr>
+                <w:rFonts w:ascii="Times New Roman" w:hAnsi="Times New Roman"/>
+                <w:b w:val="0"/>
+                <w:i w:val="0"/>
+                <w:sz w:val="16"/>
+              </w:rPr>
+              <w:t>Model's own 90% range</w:t>
+            </w:r>
+          </w:p>
+        </w:tc>
+        <w:tc>
+          <w:tcPr>
+            <w:tcW w:type="dxa" w:w="2577"/>
+            <w:tcBorders>
+              <w:top w:val="single" w:sz="8"/>
+              <w:bottom w:val="nil" w:sz="0"/>
+              <w:left w:val="nil"/>
+              <w:right w:val="nil"/>
+            </w:tcBorders>
+          </w:tcPr>
+          <w:p>
+            <w:pPr>
+              <w:spacing w:before="20" w:after="20"/>
+              <w:jc w:val="center"/>
+            </w:pPr>
+            <w:r>
+              <w:rPr>
+                <w:rFonts w:ascii="Times New Roman" w:hAnsi="Times New Roman"/>
+                <w:b w:val="0"/>
+                <w:i w:val="0"/>
+                <w:sz w:val="16"/>
+              </w:rPr>
+              <w:t>0.94</w:t>
+            </w:r>
+          </w:p>
+        </w:tc>
+        <w:tc>
+          <w:tcPr>
+            <w:tcW w:type="dxa" w:w="2577"/>
+            <w:tcBorders>
+              <w:top w:val="single" w:sz="8"/>
+              <w:bottom w:val="nil" w:sz="0"/>
+              <w:left w:val="nil"/>
+              <w:right w:val="nil"/>
+            </w:tcBorders>
+          </w:tcPr>
+          <w:p>
+            <w:pPr>
+              <w:spacing w:before="20" w:after="20"/>
+              <w:jc w:val="center"/>
+            </w:pPr>
+            <w:r>
+              <w:rPr>
+                <w:rFonts w:ascii="Times New Roman" w:hAnsi="Times New Roman"/>
+                <w:b w:val="0"/>
+                <w:i w:val="0"/>
+                <w:sz w:val="16"/>
+              </w:rPr>
+              <w:t>0.89</w:t>
+            </w:r>
+          </w:p>
+        </w:tc>
+        <w:tc>
+          <w:tcPr>
+            <w:tcW w:type="dxa" w:w="2577"/>
+            <w:tcBorders>
+              <w:top w:val="single" w:sz="8"/>
+              <w:bottom w:val="nil" w:sz="0"/>
+              <w:left w:val="nil"/>
+              <w:right w:val="nil"/>
+            </w:tcBorders>
+          </w:tcPr>
+          <w:p>
+            <w:pPr>
+              <w:spacing w:before="20" w:after="20"/>
+              <w:jc w:val="center"/>
+            </w:pPr>
+            <w:r>
+              <w:rPr>
+                <w:rFonts w:ascii="Times New Roman" w:hAnsi="Times New Roman"/>
+                <w:b/>
+                <w:i w:val="0"/>
+                <w:sz w:val="16"/>
+              </w:rPr>
+              <w:t>0.77</w:t>
+            </w:r>
+          </w:p>
+        </w:tc>
+      </w:tr>
+      <w:tr>
+        <w:tc>
+          <w:tcPr>
+            <w:tcW w:type="dxa" w:w="2577"/>
+            <w:tcBorders>
+              <w:top w:val="nil" w:sz="0"/>
+              <w:bottom w:val="nil" w:sz="0"/>
+              <w:left w:val="nil"/>
+              <w:right w:val="nil"/>
+            </w:tcBorders>
+          </w:tcPr>
+          <w:p>
+            <w:pPr>
+              <w:spacing w:before="20" w:after="20"/>
+              <w:jc w:val="left"/>
+            </w:pPr>
+            <w:r>
+              <w:rPr>
+                <w:rFonts w:ascii="Times New Roman" w:hAnsi="Times New Roman"/>
+                <w:b w:val="0"/>
+                <w:i w:val="0"/>
+                <w:sz w:val="16"/>
+              </w:rPr>
+              <w:t>Split conformal, pooled</w:t>
+            </w:r>
+          </w:p>
+        </w:tc>
+        <w:tc>
+          <w:tcPr>
+            <w:tcW w:type="dxa" w:w="2577"/>
+            <w:tcBorders>
+              <w:top w:val="nil" w:sz="0"/>
+              <w:bottom w:val="nil" w:sz="0"/>
+              <w:left w:val="nil"/>
+              <w:right w:val="nil"/>
+            </w:tcBorders>
+          </w:tcPr>
+          <w:p>
+            <w:pPr>
+              <w:spacing w:before="20" w:after="20"/>
+              <w:jc w:val="center"/>
+            </w:pPr>
+            <w:r>
+              <w:rPr>
+                <w:rFonts w:ascii="Times New Roman" w:hAnsi="Times New Roman"/>
+                <w:b w:val="0"/>
+                <w:i w:val="0"/>
+                <w:sz w:val="16"/>
+              </w:rPr>
+              <w:t>0.97</w:t>
+            </w:r>
+          </w:p>
+        </w:tc>
+        <w:tc>
+          <w:tcPr>
+            <w:tcW w:type="dxa" w:w="2577"/>
+            <w:tcBorders>
+              <w:top w:val="nil" w:sz="0"/>
+              <w:bottom w:val="nil" w:sz="0"/>
+              <w:left w:val="nil"/>
+              <w:right w:val="nil"/>
+            </w:tcBorders>
+          </w:tcPr>
+          <w:p>
+            <w:pPr>
+              <w:spacing w:before="20" w:after="20"/>
+              <w:jc w:val="center"/>
+            </w:pPr>
+            <w:r>
+              <w:rPr>
+                <w:rFonts w:ascii="Times New Roman" w:hAnsi="Times New Roman"/>
+                <w:b w:val="0"/>
+                <w:i w:val="0"/>
+                <w:sz w:val="16"/>
+              </w:rPr>
+              <w:t>0.89</w:t>
+            </w:r>
+          </w:p>
+        </w:tc>
+        <w:tc>
+          <w:tcPr>
+            <w:tcW w:type="dxa" w:w="2577"/>
+            <w:tcBorders>
+              <w:top w:val="nil" w:sz="0"/>
+              <w:bottom w:val="nil" w:sz="0"/>
+              <w:left w:val="nil"/>
+              <w:right w:val="nil"/>
+            </w:tcBorders>
+          </w:tcPr>
+          <w:p>
+            <w:pPr>
+              <w:spacing w:before="20" w:after="20"/>
+              <w:jc w:val="center"/>
+            </w:pPr>
+            <w:r>
+              <w:rPr>
+                <w:rFonts w:ascii="Times New Roman" w:hAnsi="Times New Roman"/>
+                <w:b/>
+                <w:i w:val="0"/>
+                <w:sz w:val="16"/>
+              </w:rPr>
+              <w:t>0.69</w:t>
+            </w:r>
+          </w:p>
+        </w:tc>
+      </w:tr>
+      <w:tr>
+        <w:tc>
+          <w:tcPr>
+            <w:tcW w:type="dxa" w:w="2577"/>
+            <w:tcBorders>
+              <w:top w:val="nil" w:sz="0"/>
+              <w:bottom w:val="nil" w:sz="0"/>
+              <w:left w:val="nil"/>
+              <w:right w:val="nil"/>
+            </w:tcBorders>
+          </w:tcPr>
+          <w:p>
+            <w:pPr>
+              <w:spacing w:before="20" w:after="20"/>
+              <w:jc w:val="left"/>
+            </w:pPr>
+            <w:r>
+              <w:rPr>
+                <w:rFonts w:ascii="Times New Roman" w:hAnsi="Times New Roman"/>
+                <w:b w:val="0"/>
+                <w:i w:val="0"/>
+                <w:sz w:val="16"/>
+              </w:rPr>
+              <w:t>Split conformal, per site</w:t>
+            </w:r>
+          </w:p>
+        </w:tc>
+        <w:tc>
+          <w:tcPr>
+            <w:tcW w:type="dxa" w:w="2577"/>
+            <w:tcBorders>
+              <w:top w:val="nil" w:sz="0"/>
+              <w:bottom w:val="nil" w:sz="0"/>
+              <w:left w:val="nil"/>
+              <w:right w:val="nil"/>
+            </w:tcBorders>
+          </w:tcPr>
+          <w:p>
+            <w:pPr>
+              <w:spacing w:before="20" w:after="20"/>
+              <w:jc w:val="center"/>
+            </w:pPr>
+            <w:r>
+              <w:rPr>
+                <w:rFonts w:ascii="Times New Roman" w:hAnsi="Times New Roman"/>
+                <w:b w:val="0"/>
+                <w:i w:val="0"/>
+                <w:sz w:val="16"/>
+              </w:rPr>
+              <w:t>0.91</w:t>
+            </w:r>
+          </w:p>
+        </w:tc>
+        <w:tc>
+          <w:tcPr>
+            <w:tcW w:type="dxa" w:w="2577"/>
+            <w:tcBorders>
+              <w:top w:val="nil" w:sz="0"/>
+              <w:bottom w:val="nil" w:sz="0"/>
+              <w:left w:val="nil"/>
+              <w:right w:val="nil"/>
+            </w:tcBorders>
+          </w:tcPr>
+          <w:p>
+            <w:pPr>
+              <w:spacing w:before="20" w:after="20"/>
+              <w:jc w:val="center"/>
+            </w:pPr>
+            <w:r>
+              <w:rPr>
+                <w:rFonts w:ascii="Times New Roman" w:hAnsi="Times New Roman"/>
+                <w:b w:val="0"/>
+                <w:i w:val="0"/>
+                <w:sz w:val="16"/>
+              </w:rPr>
+              <w:t>0.90</w:t>
+            </w:r>
+          </w:p>
+        </w:tc>
+        <w:tc>
+          <w:tcPr>
+            <w:tcW w:type="dxa" w:w="2577"/>
+            <w:tcBorders>
+              <w:top w:val="nil" w:sz="0"/>
+              <w:bottom w:val="nil" w:sz="0"/>
+              <w:left w:val="nil"/>
+              <w:right w:val="nil"/>
+            </w:tcBorders>
+          </w:tcPr>
+          <w:p>
+            <w:pPr>
+              <w:spacing w:before="20" w:after="20"/>
+              <w:jc w:val="center"/>
+            </w:pPr>
+            <w:r>
+              <w:rPr>
+                <w:rFonts w:ascii="Times New Roman" w:hAnsi="Times New Roman"/>
+                <w:b w:val="0"/>
+                <w:i w:val="0"/>
+                <w:sz w:val="16"/>
+              </w:rPr>
+              <w:t>0.92</w:t>
+            </w:r>
+          </w:p>
+        </w:tc>
+      </w:tr>
+      <w:tr>
+        <w:tc>
+          <w:tcPr>
+            <w:tcW w:type="dxa" w:w="2577"/>
+            <w:tcBorders>
+              <w:top w:val="single" w:sz="8"/>
+              <w:bottom w:val="single" w:sz="8"/>
+              <w:left w:val="nil"/>
+              <w:right w:val="nil"/>
+            </w:tcBorders>
+          </w:tcPr>
+          <w:p>
+            <w:pPr>
+              <w:spacing w:before="20" w:after="20"/>
+              <w:jc w:val="left"/>
+            </w:pPr>
+            <w:r>
+              <w:rPr>
+                <w:rFonts w:ascii="Times New Roman" w:hAnsi="Times New Roman"/>
+                <w:b w:val="0"/>
+                <w:i w:val="0"/>
+                <w:sz w:val="16"/>
+              </w:rPr>
+              <w:t>Per-site half-width (years)</w:t>
+            </w:r>
+          </w:p>
+        </w:tc>
+        <w:tc>
+          <w:tcPr>
+            <w:tcW w:type="dxa" w:w="2577"/>
+            <w:tcBorders>
+              <w:top w:val="single" w:sz="8"/>
+              <w:bottom w:val="single" w:sz="8"/>
+              <w:left w:val="nil"/>
+              <w:right w:val="nil"/>
+            </w:tcBorders>
+          </w:tcPr>
+          <w:p>
+            <w:pPr>
+              <w:spacing w:before="20" w:after="20"/>
+              <w:jc w:val="center"/>
+            </w:pPr>
+            <w:r>
+              <w:rPr>
+                <w:rFonts w:ascii="Times New Roman" w:hAnsi="Times New Roman"/>
+                <w:b w:val="0"/>
+                <w:i w:val="0"/>
+                <w:sz w:val="16"/>
+              </w:rPr>
+              <w:t>8.2</w:t>
+            </w:r>
+          </w:p>
+        </w:tc>
+        <w:tc>
+          <w:tcPr>
+            <w:tcW w:type="dxa" w:w="2577"/>
+            <w:tcBorders>
+              <w:top w:val="single" w:sz="8"/>
+              <w:bottom w:val="single" w:sz="8"/>
+              <w:left w:val="nil"/>
+              <w:right w:val="nil"/>
+            </w:tcBorders>
+          </w:tcPr>
+          <w:p>
+            <w:pPr>
+              <w:spacing w:before="20" w:after="20"/>
+              <w:jc w:val="center"/>
+            </w:pPr>
+            <w:r>
+              <w:rPr>
+                <w:rFonts w:ascii="Times New Roman" w:hAnsi="Times New Roman"/>
+                <w:b w:val="0"/>
+                <w:i w:val="0"/>
+                <w:sz w:val="16"/>
+              </w:rPr>
+              <w:t>10.6</w:t>
+            </w:r>
+          </w:p>
+        </w:tc>
+        <w:tc>
+          <w:tcPr>
+            <w:tcW w:type="dxa" w:w="2577"/>
+            <w:tcBorders>
+              <w:top w:val="single" w:sz="8"/>
+              <w:bottom w:val="single" w:sz="8"/>
+              <w:left w:val="nil"/>
+              <w:right w:val="nil"/>
+            </w:tcBorders>
+          </w:tcPr>
+          <w:p>
+            <w:pPr>
+              <w:spacing w:before="20" w:after="20"/>
+              <w:jc w:val="center"/>
+            </w:pPr>
+            <w:r>
+              <w:rPr>
+                <w:rFonts w:ascii="Times New Roman" w:hAnsi="Times New Roman"/>
+                <w:b w:val="0"/>
+                <w:i w:val="0"/>
+                <w:sz w:val="16"/>
+              </w:rPr>
+              <w:t>17.8</w:t>
+            </w:r>
+          </w:p>
+        </w:tc>
+      </w:tr>
+    </w:tbl>
+    <w:p>
+      <w:pPr>
+        <w:keepNext w:val="0"/>
+        <w:spacing w:before="0" w:after="0" w:line="240" w:lineRule="auto"/>
+        <w:ind w:firstLine="245"/>
+        <w:jc w:val="both"/>
+      </w:pPr>
+    </w:p>
+    <w:p>
+      <w:pPr>
+        <w:keepNext/>
+        <w:jc w:val="center"/>
+      </w:pPr>
+      <w:r>
+        <w:drawing>
+          <wp:inline xmlns:a="http://schemas.openxmlformats.org/drawingml/2006/main" xmlns:pic="http://schemas.openxmlformats.org/drawingml/2006/picture">
+            <wp:extent cx="3200400" cy="1772529"/>
+            <wp:docPr id="8" name="Picture 8"/>
+            <wp:cNvGraphicFramePr>
+              <a:graphicFrameLocks noChangeAspect="1"/>
+            </wp:cNvGraphicFramePr>
+            <a:graphic>
+              <a:graphicData uri="http://schemas.openxmlformats.org/drawingml/2006/picture">
+                <pic:pic>
+                  <pic:nvPicPr>
+                    <pic:cNvPr id="0" name="training_dynamics.png"/>
+                    <pic:cNvPicPr/>
+                  </pic:nvPicPr>
+                  <pic:blipFill>
+                    <a:blip r:embed="rId16"/>
+                    <a:stretch>
+                      <a:fillRect/>
+                    </a:stretch>
+                  </pic:blipFill>
+                  <pic:spPr>
+                    <a:xfrm>
+                      <a:off x="0" y="0"/>
+                      <a:ext cx="3200400" cy="1772529"/>
+                    </a:xfrm>
+                    <a:prstGeom prst="rect"/>
+                  </pic:spPr>
+                </pic:pic>
+              </a:graphicData>
+            </a:graphic>
+          </wp:inline>
+        </w:drawing>
+      </w:r>
+    </w:p>
+    <w:p>
+      <w:pPr>
+        <w:keepNext w:val="0"/>
+        <w:spacing w:before="0" w:after="160" w:line="240" w:lineRule="auto"/>
+        <w:jc w:val="both"/>
+      </w:pPr>
+      <w:r>
+        <w:rPr>
+          <w:rFonts w:ascii="Times New Roman" w:hAnsi="Times New Roman"/>
+          <w:b w:val="0"/>
+          <w:i w:val="0"/>
+          <w:sz w:val="16"/>
+        </w:rPr>
+        <w:t xml:space="preserve">Fig. 7.  </w:t>
+      </w:r>
+      <w:r>
+        <w:rPr>
+          <w:rFonts w:ascii="Times New Roman" w:hAnsi="Times New Roman"/>
+          <w:b w:val="0"/>
+          <w:i w:val="0"/>
+          <w:sz w:val="16"/>
+        </w:rPr>
+        <w:t>Age-adjusted IOP offset during cross-validated training (thin: folds; thick: mean). Fine-tuning fits away the offset of IOP subjects in training (brown) but not of unseen IOP subjects (green).</w:t>
       </w:r>
     </w:p>
     <w:p>
@@ -8688,7 +11392,7 @@
           <w:i w:val="0"/>
           <w:sz w:val="20"/>
         </w:rPr>
-        <w:t>VI</w:t>
+        <w:t>VIII</w:t>
       </w:r>
       <w:r>
         <w:rPr>
@@ -8713,7 +11417,7 @@
           <w:i w:val="0"/>
           <w:sz w:val="16"/>
         </w:rPr>
-        <w:t>TABLE VI</w:t>
+        <w:t>TABLE VIII</w:t>
       </w:r>
     </w:p>
     <w:p>
@@ -8969,9 +11673,10 @@
                 <w:rFonts w:ascii="Times New Roman" w:hAnsi="Times New Roman"/>
                 <w:b w:val="0"/>
                 <w:i w:val="0"/>
+                <w:color w:val="0F7A3A"/>
                 <w:sz w:val="16"/>
               </w:rPr>
-              <w:t>[pending]</w:t>
+              <w:t>PASS</w:t>
             </w:r>
           </w:p>
         </w:tc>
@@ -8997,7 +11702,25 @@
                 <w:i w:val="0"/>
                 <w:sz w:val="16"/>
               </w:rPr>
-              <w:t>error equivalent; gap [pending]</w:t>
+              <w:t xml:space="preserve">gap and error equivalent within </w:t>
+            </w:r>
+            <w:r>
+              <w:rPr>
+                <w:rFonts w:ascii="Times New Roman" w:hAnsi="Times New Roman"/>
+                <w:b w:val="0"/>
+                <w:i w:val="0"/>
+                <w:sz w:val="16"/>
+              </w:rPr>
+              <w:t>±2</w:t>
+            </w:r>
+            <w:r>
+              <w:rPr>
+                <w:rFonts w:ascii="Times New Roman" w:hAnsi="Times New Roman"/>
+                <w:b w:val="0"/>
+                <w:i w:val="0"/>
+                <w:sz w:val="16"/>
+              </w:rPr>
+              <w:t xml:space="preserve"> yrs (CV)</w:t>
             </w:r>
           </w:p>
         </w:tc>
@@ -9087,7 +11810,7 @@
                 <w:i w:val="0"/>
                 <w:sz w:val="16"/>
               </w:rPr>
-              <w:t>−4</w:t>
+              <w:t>−5.2</w:t>
             </w:r>
             <w:r>
               <w:rPr>
@@ -9096,25 +11819,7 @@
                 <w:i w:val="0"/>
                 <w:sz w:val="16"/>
               </w:rPr>
-              <w:t xml:space="preserve"> to </w:t>
-            </w:r>
-            <w:r>
-              <w:rPr>
-                <w:rFonts w:ascii="Times New Roman" w:hAnsi="Times New Roman"/>
-                <w:b w:val="0"/>
-                <w:i w:val="0"/>
-                <w:sz w:val="16"/>
-              </w:rPr>
-              <w:t>−5</w:t>
-            </w:r>
-            <w:r>
-              <w:rPr>
-                <w:rFonts w:ascii="Times New Roman" w:hAnsi="Times New Roman"/>
-                <w:b w:val="0"/>
-                <w:i w:val="0"/>
-                <w:sz w:val="16"/>
-              </w:rPr>
-              <w:t xml:space="preserve"> yrs, replicated, robust to age</w:t>
+              <w:t xml:space="preserve"> yrs (CV), replicated, robust to age; HH CONCERN</w:t>
             </w:r>
           </w:p>
         </w:tc>
@@ -9204,7 +11909,7 @@
                 <w:i w:val="0"/>
                 <w:sz w:val="16"/>
               </w:rPr>
-              <w:t>\leftrightarrow</w:t>
+              <w:t>↔</w:t>
             </w:r>
             <w:r>
               <w:rPr>
@@ -9265,9 +11970,10 @@
                 <w:rFonts w:ascii="Times New Roman" w:hAnsi="Times New Roman"/>
                 <w:b w:val="0"/>
                 <w:i w:val="0"/>
+                <w:color w:val="0F7A3A"/>
                 <w:sz w:val="16"/>
               </w:rPr>
-              <w:t>[pending]</w:t>
+              <w:t>PASS</w:t>
             </w:r>
           </w:p>
         </w:tc>
@@ -9293,7 +11999,34 @@
                 <w:i w:val="0"/>
                 <w:sz w:val="16"/>
               </w:rPr>
-              <w:t>randomisation, deletion (2 baselines), IG</w:t>
+              <w:t>ρ</w:t>
+            </w:r>
+            <w:r>
+              <w:rPr>
+                <w:rFonts w:ascii="Times New Roman" w:hAnsi="Times New Roman"/>
+                <w:b w:val="0"/>
+                <w:i w:val="0"/>
+                <w:sz w:val="16"/>
+              </w:rPr>
+              <w:t xml:space="preserve"> 0.13; deletion top </w:t>
+            </w:r>
+            <w:r>
+              <w:rPr>
+                <w:rFonts w:ascii="Times New Roman" w:hAnsi="Times New Roman"/>
+                <w:b w:val="0"/>
+                <w:i w:val="0"/>
+                <w:sz w:val="16"/>
+              </w:rPr>
+              <w:t>&gt;</w:t>
+            </w:r>
+            <w:r>
+              <w:rPr>
+                <w:rFonts w:ascii="Times New Roman" w:hAnsi="Times New Roman"/>
+                <w:b w:val="0"/>
+                <w:i w:val="0"/>
+                <w:sz w:val="16"/>
+              </w:rPr>
+              <w:t xml:space="preserve"> random under both baselines; IG agrees</w:t>
             </w:r>
           </w:p>
         </w:tc>
@@ -9345,9 +12078,10 @@
                 <w:rFonts w:ascii="Times New Roman" w:hAnsi="Times New Roman"/>
                 <w:b w:val="0"/>
                 <w:i w:val="0"/>
+                <w:color w:val="B42318"/>
                 <w:sz w:val="16"/>
               </w:rPr>
-              <w:t>[pending]</w:t>
+              <w:t>FAIL</w:t>
             </w:r>
           </w:p>
         </w:tc>
@@ -9373,7 +12107,7 @@
                 <w:i w:val="0"/>
                 <w:sz w:val="16"/>
               </w:rPr>
-              <w:t>per-site coverage</w:t>
+              <w:t>own 90% range covers 77% at IOP; per-site conformal restores 92%</w:t>
             </w:r>
           </w:p>
         </w:tc>

</xml_diff>

<commit_message>
Paper: review fixes (pre-specification timing, margin basis, verdict rules, CI consistency, age-floor and conformal checks, erasure diagnostics)
</commit_message>
<xml_diff>
--- a/paper/Brain_Age_Audit_IEEE.docx
+++ b/paper/Brain_Age_Audit_IEEE.docx
@@ -281,7 +281,7 @@
           <w:i w:val="0"/>
           <w:sz w:val="18"/>
         </w:rPr>
-        <w:t xml:space="preserve">Brain-age models predict chronological age from structural MRI, and the brain-age gap is studied as a marker of brain health. When such a model shows a disparity between acquisition sites, the disparity is often attributed to scanner differences without a test. We present a layered, pre-specified audit of a UK Biobank-pretrained SFCN fine-tuned on 485 T1-weighted IXI scans from three London sites. The model is accurate (test MAE 3.71 years, </w:t>
+        <w:t xml:space="preserve">Brain-age models predict age from structural MRI, and site disparities in the brain-age gap are often attributed to scanner differences without a test. We audit a UK Biobank-pretrained SFCN fine-tuned on 485 T1-weighted IXI scans from three London sites, with an equivalence margin and verdict rules fixed after the test-set analysis and before cross-validation. The model is accurate (test MAE 3.71 years) and its errors are equivalent between sexes. Scans from one site (IOP) receive a brain-age gap 5.24 years lower than the reference site in 5-fold cross-validation (95% CI </w:t>
       </w:r>
       <w:r>
         <w:rPr>
@@ -290,7 +290,7 @@
           <w:i w:val="0"/>
           <w:sz w:val="18"/>
         </w:rPr>
-        <w:t>r=0.966</w:t>
+        <w:t>−7.56</w:t>
       </w:r>
       <w:r>
         <w:rPr>
@@ -299,7 +299,7 @@
           <w:i w:val="0"/>
           <w:sz w:val="18"/>
         </w:rPr>
-        <w:t xml:space="preserve">) and its errors are equivalent between sexes within </w:t>
+        <w:t xml:space="preserve"> to </w:t>
       </w:r>
       <w:r>
         <w:rPr>
@@ -308,7 +308,7 @@
           <w:i w:val="0"/>
           <w:sz w:val="18"/>
         </w:rPr>
-        <w:t>±2</w:t>
+        <w:t>−2.92</w:t>
       </w:r>
       <w:r>
         <w:rPr>
@@ -317,7 +317,7 @@
           <w:i w:val="0"/>
           <w:sz w:val="18"/>
         </w:rPr>
-        <w:t xml:space="preserve"> years. Scans from one site (IOP) receive a brain-age gap about 4–5 years lower than the reference site. The offset replicates across splits and in 5-fold cross-validation over all 412 non-test subjects (</w:t>
+        <w:t>). The offset survives eight ways of handling age and is already present in the pretrained model before any training on IXI (</w:t>
       </w:r>
       <w:r>
         <w:rPr>
@@ -326,7 +326,7 @@
           <w:i w:val="0"/>
           <w:sz w:val="18"/>
         </w:rPr>
-        <w:t>−5.24</w:t>
+        <w:t>−3.3</w:t>
       </w:r>
       <w:r>
         <w:rPr>
@@ -335,115 +335,7 @@
           <w:i w:val="0"/>
           <w:sz w:val="18"/>
         </w:rPr>
-        <w:t xml:space="preserve"> years, 95% CI </w:t>
-      </w:r>
-      <w:r>
-        <w:rPr>
-          <w:rFonts w:ascii="Times New Roman" w:hAnsi="Times New Roman"/>
-          <w:b/>
-          <w:i w:val="0"/>
-          <w:sz w:val="18"/>
-        </w:rPr>
-        <w:t>−7.62</w:t>
-      </w:r>
-      <w:r>
-        <w:rPr>
-          <w:rFonts w:ascii="Times New Roman" w:hAnsi="Times New Roman"/>
-          <w:b/>
-          <w:i w:val="0"/>
-          <w:sz w:val="18"/>
-        </w:rPr>
-        <w:t xml:space="preserve"> to </w:t>
-      </w:r>
-      <w:r>
-        <w:rPr>
-          <w:rFonts w:ascii="Times New Roman" w:hAnsi="Times New Roman"/>
-          <w:b/>
-          <w:i w:val="0"/>
-          <w:sz w:val="18"/>
-        </w:rPr>
-        <w:t>−2.87</w:t>
-      </w:r>
-      <w:r>
-        <w:rPr>
-          <w:rFonts w:ascii="Times New Roman" w:hAnsi="Times New Roman"/>
-          <w:b/>
-          <w:i w:val="0"/>
-          <w:sz w:val="18"/>
-        </w:rPr>
-        <w:t xml:space="preserve">, 52 IOP subjects; </w:t>
-      </w:r>
-      <w:r>
-        <w:rPr>
-          <w:rFonts w:ascii="Times New Roman" w:hAnsi="Times New Roman"/>
-          <w:b/>
-          <w:i w:val="0"/>
-          <w:sz w:val="18"/>
-        </w:rPr>
-        <w:t>−5.2</w:t>
-      </w:r>
-      <w:r>
-        <w:rPr>
-          <w:rFonts w:ascii="Times New Roman" w:hAnsi="Times New Roman"/>
-          <w:b/>
-          <w:i w:val="0"/>
-          <w:sz w:val="18"/>
-        </w:rPr>
-        <w:t xml:space="preserve"> to </w:t>
-      </w:r>
-      <w:r>
-        <w:rPr>
-          <w:rFonts w:ascii="Times New Roman" w:hAnsi="Times New Roman"/>
-          <w:b/>
-          <w:i w:val="0"/>
-          <w:sz w:val="18"/>
-        </w:rPr>
-        <w:t>−6.2</w:t>
-      </w:r>
-      <w:r>
-        <w:rPr>
-          <w:rFonts w:ascii="Times New Roman" w:hAnsi="Times New Roman"/>
-          <w:b/>
-          <w:i w:val="0"/>
-          <w:sz w:val="18"/>
-        </w:rPr>
-        <w:t xml:space="preserve"> across three training seeds), survives eight ways of handling age, including age matching and a nonlinear adjustment, and is already present in the pretrained model before any training on IXI (</w:t>
-      </w:r>
-      <w:r>
-        <w:rPr>
-          <w:rFonts w:ascii="Times New Roman" w:hAnsi="Times New Roman"/>
-          <w:b/>
-          <w:i w:val="0"/>
-          <w:sz w:val="18"/>
-        </w:rPr>
-        <w:t>−3.3</w:t>
-      </w:r>
-      <w:r>
-        <w:rPr>
-          <w:rFonts w:ascii="Times New Roman" w:hAnsi="Times New Roman"/>
-          <w:b/>
-          <w:i w:val="0"/>
-          <w:sz w:val="18"/>
-        </w:rPr>
-        <w:t xml:space="preserve"> years, </w:t>
-      </w:r>
-      <w:r>
-        <w:rPr>
-          <w:rFonts w:ascii="Times New Roman" w:hAnsi="Times New Roman"/>
-          <w:b/>
-          <w:i w:val="0"/>
-          <w:sz w:val="18"/>
-        </w:rPr>
-        <w:t>p=5×10⁻⁶</w:t>
-      </w:r>
-      <w:r>
-        <w:rPr>
-          <w:rFonts w:ascii="Times New Roman" w:hAnsi="Times New Roman"/>
-          <w:b/>
-          <w:i w:val="0"/>
-          <w:sz w:val="18"/>
-        </w:rPr>
-        <w:t>). The model is sensitive to acquisition appearance: the site is linearly decodable from its features (91% balanced accuracy, against 50% at the 95th percentile of a permutation null), and giving Hammersmith brains IOP's intensity appearance lowers their predicted age by 3.9 years. Yet this sensitivity does not explain the disparity: intensity, matched image smoothness, head size, education, BMI, ethnicity, and removing site information from the features with ComBat, ComBat-GAM or age-conditional concept erasure all leave the offset in place. Naive concept erasure appears to remove it only by also erasing age information. Attribution maps pass randomisation and deletion tests under two baselines. The model's own 90% ranges cover only 77% of out-of-sample IOP subjects, and pooled conformal intervals 69%; per-site conformal intervals restore valid coverage at every site. We summarise the audit as a protocol-based fairness passport with graded, pre-specified verdicts.</w:t>
+        <w:t xml:space="preserve"> years), including away from that model's 42-year output floor. Fine-tuning hides the offset for the subjects it trains on, but not for unseen subjects. The model is sensitive to acquisition appearance: site is decodable from its features, and giving Hammersmith brains IOP's intensity profile lowers their predicted age by 3.9 years. Yet this sensitivity does not explain the disparity. Intensity, smoothness, head size, recorded cohort characteristics and age-conditional removal of site from the features all leave the offset in place; naive concept erasure removes it only by distorting IOP's predictions. Attribution maps pass randomisation and deletion tests. The model's own 90% ranges cover only 77% of out-of-sample IOP subjects, and per-site conformal intervals restore coverage. We summarise the audit as a fairness passport with graded verdicts.</w:t>
       </w:r>
     </w:p>
     <w:p>
@@ -722,7 +614,7 @@
           <w:i w:val="0"/>
           <w:sz w:val="20"/>
         </w:rPr>
-        <w:t xml:space="preserve">A pre-specified, layered audit protocol (Fig. </w:t>
+        <w:t xml:space="preserve">A layered audit protocol (Fig. </w:t>
       </w:r>
       <w:r>
         <w:rPr>
@@ -836,7 +728,7 @@
           <w:i w:val="0"/>
           <w:sz w:val="20"/>
         </w:rPr>
-        <w:t>A methodological warning: concept erasure that ignores the age–site confound appears to remove the disparity by removing age information.</w:t>
+        <w:t>A methodological warning: concept erasure that ignores the age–site confound appears to remove the disparity by distorting the predictions of the younger site.</w:t>
       </w:r>
     </w:p>
     <w:p>
@@ -2719,7 +2611,7 @@
           <w:i w:val="0"/>
           <w:sz w:val="20"/>
         </w:rPr>
-        <w:t xml:space="preserve"> To estimate group effects on more than 18 held-out IOP subjects without touching the test set, the 412 train+validation subjects were split into 5 site-stratified folds; each fold was predicted by a model trained on the other four (85% training, 15% inner validation for early stopping and for that fold's bias correction). Full fine-tuning was infeasible on our CPU hardware, so the first three blocks were kept at the UK Biobank weights, which never saw IXI, and the remaining blocks and head were trained with the same objective and schedule. Every non-test subject thus receives an out-of-sample prediction (52 IOP). Training was repeated with 3 seeds; the first seed is the primary analysis (as fixed in advance) and the others test robustness, and the 15 fold models' average forms an ensemble for the locked test set.</w:t>
+        <w:t xml:space="preserve"> To estimate group effects on more than 18 held-out IOP subjects without touching the test set, the 412 train+validation subjects were split into 5 site-stratified folds; each fold was predicted by a model trained on the other four (85% training, 15% inner validation for early stopping and for that fold's bias correction). Full fine-tuning was infeasible on our CPU hardware, so the first three blocks were kept at the UK Biobank weights, which never saw IXI, and the remaining blocks and head were trained with the same objective and schedule. Every non-test subject thus receives an out-of-sample prediction (52 IOP). Cross-validated estimates therefore describe this training recipe applied to IXI, not the frozen main model itself; the main model's held-out estimates are reported alongside them. Training was repeated with 3 seeds, the most our CPU budget allowed (each seed is 5 fold models): the first seed is the primary analysis (as fixed in advance), the other two test whether conclusions depend on initialisation, and the 15 fold models' average forms an ensemble for the locked test set.</w:t>
       </w:r>
     </w:p>
     <w:p>
@@ -2752,7 +2644,25 @@
           <w:i w:val="0"/>
           <w:sz w:val="20"/>
         </w:rPr>
-        <w:t>Fixed before the test set was evaluated: the split, the exclusions, the bias-correction procedure, the attribution layer and method, and the regression model for group effects. Fixed before the cross-validation results were seen (and committed to the public repository with a timestamp): the equivalence margin, the graded verdict rules and the passport criteria below. The remaining analyses are tests of explanations for an effect already observed and are reported as such.</w:t>
+        <w:t xml:space="preserve">Fixed before the test set was evaluated: the split, the exclusions, the bias-correction procedure, the attribution layer and method, and the regression model for group effects. The equivalence margin, the graded verdict rules and the passport criteria below were fixed </w:t>
+      </w:r>
+      <w:r>
+        <w:rPr>
+          <w:rFonts w:ascii="Times New Roman" w:hAnsi="Times New Roman"/>
+          <w:b w:val="0"/>
+          <w:i/>
+          <w:sz w:val="20"/>
+        </w:rPr>
+        <w:t>after</w:t>
+      </w:r>
+      <w:r>
+        <w:rPr>
+          <w:rFonts w:ascii="Times New Roman" w:hAnsi="Times New Roman"/>
+          <w:b w:val="0"/>
+          <w:i w:val="0"/>
+          <w:sz w:val="20"/>
+        </w:rPr>
+        <w:t xml:space="preserve"> the test-set analysis had been run, and therefore after the IOP offset had been seen, but before the cross-validation results existed; they were committed to the public repository with a timestamp. They are thus pre-specified only for the cross-validated analysis. The remaining analyses are tests of explanations for an effect already observed and are reported as such.</w:t>
       </w:r>
     </w:p>
     <w:p>
@@ -2821,7 +2731,7 @@
           <w:i w:val="0"/>
           <w:sz w:val="20"/>
         </w:rPr>
-        <w:t xml:space="preserve">) for corrected BAG and absolute error, with bootstrap CIs </w:t>
+        <w:t xml:space="preserve">) for corrected BAG and absolute error. Regression effects are reported with HC3 normal-approximation 95% CIs throughout; bootstrap CIs </w:t>
       </w:r>
       <w:r>
         <w:rPr>
@@ -2839,7 +2749,25 @@
           <w:i w:val="0"/>
           <w:sz w:val="20"/>
         </w:rPr>
-        <w:t xml:space="preserve">. Each effect received a pre-specified verdict with margin </w:t>
+        <w:t xml:space="preserve"> are used only for MAE, </w:t>
+      </w:r>
+      <w:r>
+        <w:rPr>
+          <w:rFonts w:ascii="Times New Roman" w:hAnsi="Times New Roman"/>
+          <w:b w:val="0"/>
+          <w:i w:val="0"/>
+          <w:sz w:val="20"/>
+        </w:rPr>
+        <w:t>r</w:t>
+      </w:r>
+      <w:r>
+        <w:rPr>
+          <w:rFonts w:ascii="Times New Roman" w:hAnsi="Times New Roman"/>
+          <w:b w:val="0"/>
+          <w:i w:val="0"/>
+          <w:sz w:val="20"/>
+        </w:rPr>
+        <w:t xml:space="preserve">, probe accuracy, matched-pair differences and zero-shot estimates, as marked. The equivalence margin is </w:t>
       </w:r>
       <w:r>
         <w:rPr>
@@ -2857,7 +2785,7 @@
           <w:i w:val="0"/>
           <w:sz w:val="20"/>
         </w:rPr>
-        <w:t xml:space="preserve"> years (about half the MAE): PASS if equivalence is shown by two one-sided tests </w:t>
+        <w:t xml:space="preserve"> years, the order of the scan–rescan variability of brain-age estimates: mean absolute test–retest differences of 1.0–2.3 years were reported for well-performing packages </w:t>
       </w:r>
       <w:r>
         <w:rPr>
@@ -2875,7 +2803,7 @@
           <w:i w:val="0"/>
           <w:sz w:val="20"/>
         </w:rPr>
-        <w:t xml:space="preserve"> (90% CI within the margin); INCONCLUSIVE if the 95% CI includes zero without equivalence; CONCERN if it excludes zero but the effect is within the margin or does not replicate; FAIL if it excludes zero, exceeds the margin and replicates in an independent split. We report the minimum detectable effect at 80% power and Holm-adjusted </w:t>
+        <w:t xml:space="preserve">, so smaller group differences are not distinguishable from measurement noise in a single scan. Verdicts follow fixed rules: PASS if equivalence is shown by two one-sided tests </w:t>
       </w:r>
       <w:r>
         <w:rPr>
@@ -2885,6 +2813,78 @@
           <w:sz w:val="20"/>
         </w:rPr>
         <w:t>[48]</w:t>
+      </w:r>
+      <w:r>
+        <w:rPr>
+          <w:rFonts w:ascii="Times New Roman" w:hAnsi="Times New Roman"/>
+          <w:b w:val="0"/>
+          <w:i w:val="0"/>
+          <w:sz w:val="20"/>
+        </w:rPr>
+        <w:t xml:space="preserve"> (90% CI within </w:t>
+      </w:r>
+      <w:r>
+        <w:rPr>
+          <w:rFonts w:ascii="Times New Roman" w:hAnsi="Times New Roman"/>
+          <w:b w:val="0"/>
+          <w:i w:val="0"/>
+          <w:sz w:val="20"/>
+        </w:rPr>
+        <w:t>±2</w:t>
+      </w:r>
+      <w:r>
+        <w:rPr>
+          <w:rFonts w:ascii="Times New Roman" w:hAnsi="Times New Roman"/>
+          <w:b w:val="0"/>
+          <w:i w:val="0"/>
+          <w:sz w:val="20"/>
+        </w:rPr>
+        <w:t xml:space="preserve">); INCONCLUSIVE if the 95% CI includes zero without equivalence; CONCERN if the 95% CI excludes zero but the point estimate lies within </w:t>
+      </w:r>
+      <w:r>
+        <w:rPr>
+          <w:rFonts w:ascii="Times New Roman" w:hAnsi="Times New Roman"/>
+          <w:b w:val="0"/>
+          <w:i w:val="0"/>
+          <w:sz w:val="20"/>
+        </w:rPr>
+        <w:t>±2</w:t>
+      </w:r>
+      <w:r>
+        <w:rPr>
+          <w:rFonts w:ascii="Times New Roman" w:hAnsi="Times New Roman"/>
+          <w:b w:val="0"/>
+          <w:i w:val="0"/>
+          <w:sz w:val="20"/>
+        </w:rPr>
+        <w:t xml:space="preserve">, or if the effect does not replicate; FAIL if the 95% CI excludes zero, the point estimate lies outside </w:t>
+      </w:r>
+      <w:r>
+        <w:rPr>
+          <w:rFonts w:ascii="Times New Roman" w:hAnsi="Times New Roman"/>
+          <w:b w:val="0"/>
+          <w:i w:val="0"/>
+          <w:sz w:val="20"/>
+        </w:rPr>
+        <w:t>±2</w:t>
+      </w:r>
+      <w:r>
+        <w:rPr>
+          <w:rFonts w:ascii="Times New Roman" w:hAnsi="Times New Roman"/>
+          <w:b w:val="0"/>
+          <w:i w:val="0"/>
+          <w:sz w:val="20"/>
+        </w:rPr>
+        <w:t xml:space="preserve"> and the effect replicates (same sign, 95% CI excluding zero) in an independent sample. “Exceeds the margin” refers to the point estimate. The cross-validated estimate (412 subjects) determines the verdict; the main model's test-set estimate serves as replication, and vice versa for the test-set rows. We report the minimum detectable effect at 80% power and Holm-adjusted </w:t>
+      </w:r>
+      <w:r>
+        <w:rPr>
+          <w:rFonts w:ascii="Times New Roman" w:hAnsi="Times New Roman"/>
+          <w:b w:val="0"/>
+          <w:i w:val="0"/>
+          <w:sz w:val="20"/>
+        </w:rPr>
+        <w:t>[49]</w:t>
       </w:r>
       <w:r>
         <w:rPr>
@@ -3186,7 +3186,7 @@
           <w:i w:val="0"/>
           <w:sz w:val="20"/>
         </w:rPr>
-        <w:t>[49]</w:t>
+        <w:t>[50]</w:t>
       </w:r>
       <w:r>
         <w:rPr>
@@ -3433,7 +3433,7 @@
           <w:i w:val="0"/>
           <w:sz w:val="20"/>
         </w:rPr>
-        <w:t>[50]</w:t>
+        <w:t>[51]</w:t>
       </w:r>
       <w:r>
         <w:rPr>
@@ -3451,7 +3451,7 @@
           <w:i w:val="0"/>
           <w:sz w:val="20"/>
         </w:rPr>
-        <w:t>[51]</w:t>
+        <w:t>[52]</w:t>
       </w:r>
       <w:r>
         <w:rPr>
@@ -3704,25 +3704,7 @@
           <w:i w:val="0"/>
           <w:sz w:val="20"/>
         </w:rPr>
-        <w:t xml:space="preserve"> years [3.10, 4.38] and </w:t>
-      </w:r>
-      <w:r>
-        <w:rPr>
-          <w:rFonts w:ascii="Times New Roman" w:hAnsi="Times New Roman"/>
-          <w:b w:val="0"/>
-          <w:i w:val="0"/>
-          <w:sz w:val="20"/>
-        </w:rPr>
-        <w:t>r=0.966</w:t>
-      </w:r>
-      <w:r>
-        <w:rPr>
-          <w:rFonts w:ascii="Times New Roman" w:hAnsi="Times New Roman"/>
-          <w:b w:val="0"/>
-          <w:i w:val="0"/>
-          <w:sz w:val="20"/>
-        </w:rPr>
-        <w:t xml:space="preserve"> (Table </w:t>
+        <w:t xml:space="preserve"> years (Table </w:t>
       </w:r>
       <w:r>
         <w:rPr>
@@ -3740,43 +3722,7 @@
           <w:i w:val="0"/>
           <w:sz w:val="20"/>
         </w:rPr>
-        <w:t>). The cross-validated models, which fine-tune only the upper blocks, reached an out-of-sample MAE of 4.76 years (</w:t>
-      </w:r>
-      <w:r>
-        <w:rPr>
-          <w:rFonts w:ascii="Times New Roman" w:hAnsi="Times New Roman"/>
-          <w:b w:val="0"/>
-          <w:i w:val="0"/>
-          <w:sz w:val="20"/>
-        </w:rPr>
-        <w:t>r=0.943</w:t>
-      </w:r>
-      <w:r>
-        <w:rPr>
-          <w:rFonts w:ascii="Times New Roman" w:hAnsi="Times New Roman"/>
-          <w:b w:val="0"/>
-          <w:i w:val="0"/>
-          <w:sz w:val="20"/>
-        </w:rPr>
-        <w:t>) over all 412 non-test subjects, and the 15-model ensemble 5.06 (</w:t>
-      </w:r>
-      <w:r>
-        <w:rPr>
-          <w:rFonts w:ascii="Times New Roman" w:hAnsi="Times New Roman"/>
-          <w:b w:val="0"/>
-          <w:i w:val="0"/>
-          <w:sz w:val="20"/>
-        </w:rPr>
-        <w:t>r=0.949</w:t>
-      </w:r>
-      <w:r>
-        <w:rPr>
-          <w:rFonts w:ascii="Times New Roman" w:hAnsi="Times New Roman"/>
-          <w:b w:val="0"/>
-          <w:i w:val="0"/>
-          <w:sz w:val="20"/>
-        </w:rPr>
-        <w:t>) on the locked test set. Across the three seeds, out-of-sample MAE was 4.76, 5.12 and 4.91 years. An independently fine-tuned SFCN and DeepBrainNet reached test MAE 4.07 and 4.53.</w:t>
+        <w:t>). The cross-validated models, which fine-tune only the upper blocks, were less accurate (out-of-sample MAE 4.76 years; 4.76–5.12 across seeds). An independently fine-tuned SFCN and DeepBrainNet reached test MAE 4.07 and 4.53.</w:t>
       </w:r>
     </w:p>
     <w:p>
@@ -4368,115 +4314,7 @@
           <w:i w:val="0"/>
           <w:sz w:val="20"/>
         </w:rPr>
-        <w:t xml:space="preserve"> lists every group effect with its verdict. On the test set alone, absolute error is </w:t>
-      </w:r>
-      <w:r>
-        <w:rPr>
-          <w:rFonts w:ascii="Times New Roman" w:hAnsi="Times New Roman"/>
-          <w:b w:val="0"/>
-          <w:i/>
-          <w:sz w:val="20"/>
-        </w:rPr>
-        <w:t>equivalent</w:t>
-      </w:r>
-      <w:r>
-        <w:rPr>
-          <w:rFonts w:ascii="Times New Roman" w:hAnsi="Times New Roman"/>
-          <w:b w:val="0"/>
-          <w:i w:val="0"/>
-          <w:sz w:val="20"/>
-        </w:rPr>
-        <w:t xml:space="preserve"> between sexes and between HH and Guys (PASS), whereas the sex difference in BAG (</w:t>
-      </w:r>
-      <w:r>
-        <w:rPr>
-          <w:rFonts w:ascii="Times New Roman" w:hAnsi="Times New Roman"/>
-          <w:b w:val="0"/>
-          <w:i w:val="0"/>
-          <w:sz w:val="20"/>
-        </w:rPr>
-        <w:t>−0.59</w:t>
-      </w:r>
-      <w:r>
-        <w:rPr>
-          <w:rFonts w:ascii="Times New Roman" w:hAnsi="Times New Roman"/>
-          <w:b w:val="0"/>
-          <w:i w:val="0"/>
-          <w:sz w:val="20"/>
-        </w:rPr>
-        <w:t>, minimum detectable effect 3.1 years) is INCONCLUSIVE: 73 test subjects cannot show equivalence. IOP scans receive a BAG 5.06 years lower than Guys [−8.66, −1.34], replicated in validation (</w:t>
-      </w:r>
-      <w:r>
-        <w:rPr>
-          <w:rFonts w:ascii="Times New Roman" w:hAnsi="Times New Roman"/>
-          <w:b w:val="0"/>
-          <w:i w:val="0"/>
-          <w:sz w:val="20"/>
-        </w:rPr>
-        <w:t>−4.08</w:t>
-      </w:r>
-      <w:r>
-        <w:rPr>
-          <w:rFonts w:ascii="Times New Roman" w:hAnsi="Times New Roman"/>
-          <w:b w:val="0"/>
-          <w:i w:val="0"/>
-          <w:sz w:val="20"/>
-        </w:rPr>
-        <w:t>), giving FAIL. With all 412 cross-validated predictions the picture sharpens: the sex differences in BAG (</w:t>
-      </w:r>
-      <w:r>
-        <w:rPr>
-          <w:rFonts w:ascii="Times New Roman" w:hAnsi="Times New Roman"/>
-          <w:b w:val="0"/>
-          <w:i w:val="0"/>
-          <w:sz w:val="20"/>
-        </w:rPr>
-        <w:t>+0.61</w:t>
-      </w:r>
-      <w:r>
-        <w:rPr>
-          <w:rFonts w:ascii="Times New Roman" w:hAnsi="Times New Roman"/>
-          <w:b w:val="0"/>
-          <w:i w:val="0"/>
-          <w:sz w:val="20"/>
-        </w:rPr>
-        <w:t>, MDE 1.6) and in error (</w:t>
-      </w:r>
-      <w:r>
-        <w:rPr>
-          <w:rFonts w:ascii="Times New Roman" w:hAnsi="Times New Roman"/>
-          <w:b w:val="0"/>
-          <w:i w:val="0"/>
-          <w:sz w:val="20"/>
-        </w:rPr>
-        <w:t>+0.11</w:t>
-      </w:r>
-      <w:r>
-        <w:rPr>
-          <w:rFonts w:ascii="Times New Roman" w:hAnsi="Times New Roman"/>
-          <w:b w:val="0"/>
-          <w:i w:val="0"/>
-          <w:sz w:val="20"/>
-        </w:rPr>
-        <w:t xml:space="preserve">) are now </w:t>
-      </w:r>
-      <w:r>
-        <w:rPr>
-          <w:rFonts w:ascii="Times New Roman" w:hAnsi="Times New Roman"/>
-          <w:b w:val="0"/>
-          <w:i/>
-          <w:sz w:val="20"/>
-        </w:rPr>
-        <w:t>equivalent</w:t>
-      </w:r>
-      <w:r>
-        <w:rPr>
-          <w:rFonts w:ascii="Times New Roman" w:hAnsi="Times New Roman"/>
-          <w:b w:val="0"/>
-          <w:i w:val="0"/>
-          <w:sz w:val="20"/>
-        </w:rPr>
-        <w:t xml:space="preserve"> (PASS); IOP's BAG offset is </w:t>
+        <w:t xml:space="preserve"> lists every group effect with its verdict. With 73 test subjects, the sex difference in BAG cannot be shown equivalent (INCONCLUSIVE); with all 412 cross-validated predictions it can (PASS). IOP's BAG offset is </w:t>
       </w:r>
       <w:r>
         <w:rPr>
@@ -4494,7 +4332,7 @@
           <w:i w:val="0"/>
           <w:sz w:val="20"/>
         </w:rPr>
-        <w:t xml:space="preserve"> [−7.56, −2.92] (Holm </w:t>
+        <w:t xml:space="preserve"> years in cross-validation (Holm </w:t>
       </w:r>
       <w:r>
         <w:rPr>
@@ -4512,61 +4350,25 @@
           <w:i w:val="0"/>
           <w:sz w:val="20"/>
         </w:rPr>
-        <w:t>, FAIL); HH shows a smaller offset within the margin (</w:t>
-      </w:r>
-      <w:r>
-        <w:rPr>
-          <w:rFonts w:ascii="Times New Roman" w:hAnsi="Times New Roman"/>
-          <w:b w:val="0"/>
-          <w:i w:val="0"/>
-          <w:sz w:val="20"/>
-        </w:rPr>
-        <w:t>−1.51</w:t>
-      </w:r>
-      <w:r>
-        <w:rPr>
-          <w:rFonts w:ascii="Times New Roman" w:hAnsi="Times New Roman"/>
-          <w:b w:val="0"/>
-          <w:i w:val="0"/>
-          <w:sz w:val="20"/>
-        </w:rPr>
-        <w:t>, CONCERN); and errors are larger at HH (</w:t>
-      </w:r>
-      <w:r>
-        <w:rPr>
-          <w:rFonts w:ascii="Times New Roman" w:hAnsi="Times New Roman"/>
-          <w:b w:val="0"/>
-          <w:i w:val="0"/>
-          <w:sz w:val="20"/>
-        </w:rPr>
-        <w:t>+1.61</w:t>
-      </w:r>
-      <w:r>
-        <w:rPr>
-          <w:rFonts w:ascii="Times New Roman" w:hAnsi="Times New Roman"/>
-          <w:b w:val="0"/>
-          <w:i w:val="0"/>
-          <w:sz w:val="20"/>
-        </w:rPr>
-        <w:t>) and IOP (</w:t>
-      </w:r>
-      <w:r>
-        <w:rPr>
-          <w:rFonts w:ascii="Times New Roman" w:hAnsi="Times New Roman"/>
-          <w:b w:val="0"/>
-          <w:i w:val="0"/>
-          <w:sz w:val="20"/>
-        </w:rPr>
-        <w:t>+4.06</w:t>
-      </w:r>
-      <w:r>
-        <w:rPr>
-          <w:rFonts w:ascii="Times New Roman" w:hAnsi="Times New Roman"/>
-          <w:b w:val="0"/>
-          <w:i w:val="0"/>
-          <w:sz w:val="20"/>
-        </w:rPr>
-        <w:t xml:space="preserve">), which did not replicate on the locked test set (CONCERN). The IOP offset was </w:t>
+        <w:t>) and replicates on the test set (</w:t>
+      </w:r>
+      <w:r>
+        <w:rPr>
+          <w:rFonts w:ascii="Times New Roman" w:hAnsi="Times New Roman"/>
+          <w:b w:val="0"/>
+          <w:i w:val="0"/>
+          <w:sz w:val="20"/>
+        </w:rPr>
+        <w:t>−5.06</w:t>
+      </w:r>
+      <w:r>
+        <w:rPr>
+          <w:rFonts w:ascii="Times New Roman" w:hAnsi="Times New Roman"/>
+          <w:b w:val="0"/>
+          <w:i w:val="0"/>
+          <w:sz w:val="20"/>
+        </w:rPr>
+        <w:t>), giving FAIL. HH shows a smaller offset within the margin (CONCERN). The IOP offset was similar for all three seeds (</w:t>
       </w:r>
       <w:r>
         <w:rPr>
@@ -4602,7 +4404,7 @@
           <w:i w:val="0"/>
           <w:sz w:val="20"/>
         </w:rPr>
-        <w:t xml:space="preserve"> and </w:t>
+        <w:t xml:space="preserve">, </w:t>
       </w:r>
       <w:r>
         <w:rPr>
@@ -4620,43 +4422,7 @@
           <w:i w:val="0"/>
           <w:sz w:val="20"/>
         </w:rPr>
-        <w:t xml:space="preserve"> years for the three seeds (</w:t>
-      </w:r>
-      <w:r>
-        <w:rPr>
-          <w:rFonts w:ascii="Times New Roman" w:hAnsi="Times New Roman"/>
-          <w:b w:val="0"/>
-          <w:i w:val="0"/>
-          <w:sz w:val="20"/>
-        </w:rPr>
-        <w:t>−5.68</w:t>
-      </w:r>
-      <w:r>
-        <w:rPr>
-          <w:rFonts w:ascii="Times New Roman" w:hAnsi="Times New Roman"/>
-          <w:b w:val="0"/>
-          <w:i w:val="0"/>
-          <w:sz w:val="20"/>
-        </w:rPr>
-        <w:t xml:space="preserve"> [−7.85, −3.30] averaged over seeds, </w:t>
-      </w:r>
-      <w:r>
-        <w:rPr>
-          <w:rFonts w:ascii="Times New Roman" w:hAnsi="Times New Roman"/>
-          <w:b w:val="0"/>
-          <w:i w:val="0"/>
-          <w:sz w:val="20"/>
-        </w:rPr>
-        <w:t>p=10⁻⁶</w:t>
-      </w:r>
-      <w:r>
-        <w:rPr>
-          <w:rFonts w:ascii="Times New Roman" w:hAnsi="Times New Roman"/>
-          <w:b w:val="0"/>
-          <w:i w:val="0"/>
-          <w:sz w:val="20"/>
-        </w:rPr>
-        <w:t xml:space="preserve">), and </w:t>
+        <w:t>) and for the 15-model ensemble on the locked test set (</w:t>
       </w:r>
       <w:r>
         <w:rPr>
@@ -4674,7 +4440,25 @@
           <w:i w:val="0"/>
           <w:sz w:val="20"/>
         </w:rPr>
-        <w:t xml:space="preserve"> [−11.14, −2.20] for the 15-model ensemble on the locked test set; the sex difference was not significant for any seed. A model never trained on IOP was 3.30 years [1.62, 4.93] less accurate there, whereas one never trained on HH generalised (+0.25).</w:t>
+        <w:t>); the sex difference was not significant for any seed. The test-set CI for IOP is the HC3 interval; an earlier draft reported a bootstrap interval ([−8.66, −1.34]), and we now use HC3 for all regression effects. A leave-one-site-out model never trained on IOP was 3.30 years [1.62, 4.93] less accurate there, whereas one never trained on HH generalised (</w:t>
+      </w:r>
+      <w:r>
+        <w:rPr>
+          <w:rFonts w:ascii="Times New Roman" w:hAnsi="Times New Roman"/>
+          <w:b w:val="0"/>
+          <w:i w:val="0"/>
+          <w:sz w:val="20"/>
+        </w:rPr>
+        <w:t>+0.25</w:t>
+      </w:r>
+      <w:r>
+        <w:rPr>
+          <w:rFonts w:ascii="Times New Roman" w:hAnsi="Times New Roman"/>
+          <w:b w:val="0"/>
+          <w:i w:val="0"/>
+          <w:sz w:val="20"/>
+        </w:rPr>
+        <w:t>).</w:t>
       </w:r>
     </w:p>
     <w:p>
@@ -4706,7 +4490,7 @@
           <w:i w:val="0"/>
           <w:sz w:val="16"/>
         </w:rPr>
-        <w:t>Group effects (years) and pre-specified verdicts</w:t>
+        <w:t>Group effects (years) and graded verdicts</w:t>
       </w:r>
     </w:p>
     <w:tbl>
@@ -6425,7 +6209,7 @@
           <w:i w:val="0"/>
           <w:sz w:val="15"/>
         </w:rPr>
-        <w:t>HC3 normal CIs; MDE: minimum detectable effect, 80% power.</w:t>
+        <w:t>CV rows decide verdicts; test rows replicate. CV: training recipe, not main model.</w:t>
       </w:r>
     </w:p>
     <w:p>
@@ -6466,7 +6250,7 @@
           <w:i w:val="0"/>
           <w:sz w:val="20"/>
         </w:rPr>
-        <w:t xml:space="preserve"> Across all eight age-handling choices, the held-out IOP offset ranged from </w:t>
+        <w:t xml:space="preserve"> Across all eight age-handling choices, the main model's held-out IOP offset ranged from </w:t>
       </w:r>
       <w:r>
         <w:rPr>
@@ -6520,16 +6304,16 @@
           <w:i w:val="0"/>
           <w:sz w:val="20"/>
         </w:rPr>
-        <w:t xml:space="preserve">); on the test set alone it ranged from </w:t>
-      </w:r>
-      <w:r>
-        <w:rPr>
-          <w:rFonts w:ascii="Times New Roman" w:hAnsi="Times New Roman"/>
-          <w:b w:val="0"/>
-          <w:i w:val="0"/>
-          <w:sz w:val="20"/>
-        </w:rPr>
-        <w:t>−4.21</w:t>
+        <w:t xml:space="preserve">); the weakest estimate came from 1:1 age-matched pairs. In the cross-validated predictions it ranged from </w:t>
+      </w:r>
+      <w:r>
+        <w:rPr>
+          <w:rFonts w:ascii="Times New Roman" w:hAnsi="Times New Roman"/>
+          <w:b w:val="0"/>
+          <w:i w:val="0"/>
+          <w:sz w:val="20"/>
+        </w:rPr>
+        <w:t>−3.94</w:t>
       </w:r>
       <w:r>
         <w:rPr>
@@ -6556,79 +6340,25 @@
           <w:i w:val="0"/>
           <w:sz w:val="20"/>
         </w:rPr>
-        <w:t>. It persisted in age-matched pairs (</w:t>
-      </w:r>
-      <w:r>
-        <w:rPr>
-          <w:rFonts w:ascii="Times New Roman" w:hAnsi="Times New Roman"/>
-          <w:b w:val="0"/>
-          <w:i w:val="0"/>
-          <w:sz w:val="20"/>
-        </w:rPr>
-        <w:t>−3.11</w:t>
-      </w:r>
-      <w:r>
-        <w:rPr>
-          <w:rFonts w:ascii="Times New Roman" w:hAnsi="Times New Roman"/>
-          <w:b w:val="0"/>
-          <w:i w:val="0"/>
-          <w:sz w:val="20"/>
-        </w:rPr>
-        <w:t xml:space="preserve"> [−5.67, −0.33]), with a spline for age (</w:t>
-      </w:r>
-      <w:r>
-        <w:rPr>
-          <w:rFonts w:ascii="Times New Roman" w:hAnsi="Times New Roman"/>
-          <w:b w:val="0"/>
-          <w:i w:val="0"/>
-          <w:sz w:val="20"/>
-        </w:rPr>
-        <w:t>−3.98</w:t>
-      </w:r>
-      <w:r>
-        <w:rPr>
-          <w:rFonts w:ascii="Times New Roman" w:hAnsi="Times New Roman"/>
-          <w:b w:val="0"/>
-          <w:i w:val="0"/>
-          <w:sz w:val="20"/>
-        </w:rPr>
-        <w:t>) and with no correction at all (</w:t>
-      </w:r>
-      <w:r>
-        <w:rPr>
-          <w:rFonts w:ascii="Times New Roman" w:hAnsi="Times New Roman"/>
-          <w:b w:val="0"/>
-          <w:i w:val="0"/>
-          <w:sz w:val="20"/>
-        </w:rPr>
-        <w:t>−3.77</w:t>
-      </w:r>
-      <w:r>
-        <w:rPr>
-          <w:rFonts w:ascii="Times New Roman" w:hAnsi="Times New Roman"/>
-          <w:b w:val="0"/>
-          <w:i w:val="0"/>
-          <w:sz w:val="20"/>
-        </w:rPr>
-        <w:t>). Native brain volume did not differ between IOP and Guys after age and sex adjustment (</w:t>
-      </w:r>
-      <w:r>
-        <w:rPr>
-          <w:rFonts w:ascii="Times New Roman" w:hAnsi="Times New Roman"/>
-          <w:b w:val="0"/>
-          <w:i w:val="0"/>
-          <w:sz w:val="20"/>
-        </w:rPr>
-        <w:t>−16</w:t>
-      </w:r>
-      <w:r>
-        <w:rPr>
-          <w:rFonts w:ascii="Times New Roman" w:hAnsi="Times New Roman"/>
-          <w:b w:val="0"/>
-          <w:i w:val="0"/>
-          <w:sz w:val="20"/>
-        </w:rPr>
-        <w:t xml:space="preserve"> ml, </w:t>
+        <w:t xml:space="preserve"> years, all with </w:t>
+      </w:r>
+      <w:r>
+        <w:rPr>
+          <w:rFonts w:ascii="Times New Roman" w:hAnsi="Times New Roman"/>
+          <w:b w:val="0"/>
+          <w:i w:val="0"/>
+          <w:sz w:val="20"/>
+        </w:rPr>
+        <w:t>p&lt;0.001</w:t>
+      </w:r>
+      <w:r>
+        <w:rPr>
+          <w:rFonts w:ascii="Times New Roman" w:hAnsi="Times New Roman"/>
+          <w:b w:val="0"/>
+          <w:i w:val="0"/>
+          <w:sz w:val="20"/>
+        </w:rPr>
+        <w:t>. Native brain volume did not differ between IOP and Guys after age and sex adjustment (</w:t>
       </w:r>
       <w:r>
         <w:rPr>
@@ -6646,25 +6376,7 @@
           <w:i w:val="0"/>
           <w:sz w:val="20"/>
         </w:rPr>
-        <w:t>) and did not change the offset (</w:t>
-      </w:r>
-      <w:r>
-        <w:rPr>
-          <w:rFonts w:ascii="Times New Roman" w:hAnsi="Times New Roman"/>
-          <w:b w:val="0"/>
-          <w:i w:val="0"/>
-          <w:sz w:val="20"/>
-        </w:rPr>
-        <w:t>−4.47</w:t>
-      </w:r>
-      <w:r>
-        <w:rPr>
-          <w:rFonts w:ascii="Times New Roman" w:hAnsi="Times New Roman"/>
-          <w:b w:val="0"/>
-          <w:i w:val="0"/>
-          <w:sz w:val="20"/>
-        </w:rPr>
-        <w:t xml:space="preserve">). The offset is not at the edge of the label range: held-out IOP subjects under 30 had a mean gap of </w:t>
+        <w:t xml:space="preserve">) and did not change the offset. The offset is not at the lower edge of the label range: held-out IOP subjects under 30 had a mean gap of </w:t>
       </w:r>
       <w:r>
         <w:rPr>
@@ -6700,97 +6412,7 @@
           <w:i w:val="0"/>
           <w:sz w:val="20"/>
         </w:rPr>
-        <w:t xml:space="preserve"> years. In the cross-validated predictions the offset was between </w:t>
-      </w:r>
-      <w:r>
-        <w:rPr>
-          <w:rFonts w:ascii="Times New Roman" w:hAnsi="Times New Roman"/>
-          <w:b w:val="0"/>
-          <w:i w:val="0"/>
-          <w:sz w:val="20"/>
-        </w:rPr>
-        <w:t>−3.94</w:t>
-      </w:r>
-      <w:r>
-        <w:rPr>
-          <w:rFonts w:ascii="Times New Roman" w:hAnsi="Times New Roman"/>
-          <w:b w:val="0"/>
-          <w:i w:val="0"/>
-          <w:sz w:val="20"/>
-        </w:rPr>
-        <w:t xml:space="preserve"> (no correction, and age as covariate) and </w:t>
-      </w:r>
-      <w:r>
-        <w:rPr>
-          <w:rFonts w:ascii="Times New Roman" w:hAnsi="Times New Roman"/>
-          <w:b w:val="0"/>
-          <w:i w:val="0"/>
-          <w:sz w:val="20"/>
-        </w:rPr>
-        <w:t>−5.24</w:t>
-      </w:r>
-      <w:r>
-        <w:rPr>
-          <w:rFonts w:ascii="Times New Roman" w:hAnsi="Times New Roman"/>
-          <w:b w:val="0"/>
-          <w:i w:val="0"/>
-          <w:sz w:val="20"/>
-        </w:rPr>
-        <w:t xml:space="preserve"> years across the choices, </w:t>
-      </w:r>
-      <w:r>
-        <w:rPr>
-          <w:rFonts w:ascii="Times New Roman" w:hAnsi="Times New Roman"/>
-          <w:b w:val="0"/>
-          <w:i w:val="0"/>
-          <w:sz w:val="20"/>
-        </w:rPr>
-        <w:t>−4.65</w:t>
-      </w:r>
-      <w:r>
-        <w:rPr>
-          <w:rFonts w:ascii="Times New Roman" w:hAnsi="Times New Roman"/>
-          <w:b w:val="0"/>
-          <w:i w:val="0"/>
-          <w:sz w:val="20"/>
-        </w:rPr>
-        <w:t xml:space="preserve"> with a spline for age and </w:t>
-      </w:r>
-      <w:r>
-        <w:rPr>
-          <w:rFonts w:ascii="Times New Roman" w:hAnsi="Times New Roman"/>
-          <w:b w:val="0"/>
-          <w:i w:val="0"/>
-          <w:sz w:val="20"/>
-        </w:rPr>
-        <w:t>−4.15</w:t>
-      </w:r>
-      <w:r>
-        <w:rPr>
-          <w:rFonts w:ascii="Times New Roman" w:hAnsi="Times New Roman"/>
-          <w:b w:val="0"/>
-          <w:i w:val="0"/>
-          <w:sz w:val="20"/>
-        </w:rPr>
-        <w:t xml:space="preserve"> [−6.62, −1.86] in 51 age- and sex-matched pairs, all with </w:t>
-      </w:r>
-      <w:r>
-        <w:rPr>
-          <w:rFonts w:ascii="Times New Roman" w:hAnsi="Times New Roman"/>
-          <w:b w:val="0"/>
-          <w:i w:val="0"/>
-          <w:sz w:val="20"/>
-        </w:rPr>
-        <w:t>p&lt;0.001</w:t>
-      </w:r>
-      <w:r>
-        <w:rPr>
-          <w:rFonts w:ascii="Times New Roman" w:hAnsi="Times New Roman"/>
-          <w:b w:val="0"/>
-          <w:i w:val="0"/>
-          <w:sz w:val="20"/>
-        </w:rPr>
-        <w:t>.</w:t>
+        <w:t xml:space="preserve"> years.</w:t>
       </w:r>
     </w:p>
     <w:p>
@@ -6855,7 +6477,7 @@
           <w:i w:val="0"/>
           <w:sz w:val="16"/>
         </w:rPr>
-        <w:t>Left: held-out corrected brain-age gap by age and site (lines: running means). Right: the IOP-vs-Guys offset under eight age-handling choices (95% CI).</w:t>
+        <w:t>Main model, held-out subjects. Left: corrected brain-age gap by age and site (lines: running means). Right: the IOP-vs-Guys offset under eight age-handling choices (95% CI).</w:t>
       </w:r>
     </w:p>
     <w:p>
@@ -6924,7 +6546,97 @@
           <w:i w:val="0"/>
           <w:sz w:val="20"/>
         </w:rPr>
-        <w:t xml:space="preserve">, 241 subjects aged 42–82, 19 IOP). Memorisation of IOP training subjects therefore cannot be its cause. Cross-validated training shows how fine-tuning interacts with it (Fig. </w:t>
+        <w:t>, 241 subjects aged 42–82, 19 IOP). Because this model cannot predict below 42, IOP's younger subjects could be pushed towards the floor; but the offset is unchanged with a B-spline for age (</w:t>
+      </w:r>
+      <w:r>
+        <w:rPr>
+          <w:rFonts w:ascii="Times New Roman" w:hAnsi="Times New Roman"/>
+          <w:b w:val="0"/>
+          <w:i w:val="0"/>
+          <w:sz w:val="20"/>
+        </w:rPr>
+        <w:t>−3.55</w:t>
+      </w:r>
+      <w:r>
+        <w:rPr>
+          <w:rFonts w:ascii="Times New Roman" w:hAnsi="Times New Roman"/>
+          <w:b w:val="0"/>
+          <w:i w:val="0"/>
+          <w:sz w:val="20"/>
+        </w:rPr>
+        <w:t>) and in 19 age- and sex-matched pairs (</w:t>
+      </w:r>
+      <w:r>
+        <w:rPr>
+          <w:rFonts w:ascii="Times New Roman" w:hAnsi="Times New Roman"/>
+          <w:b w:val="0"/>
+          <w:i w:val="0"/>
+          <w:sz w:val="20"/>
+        </w:rPr>
+        <w:t>−3.63</w:t>
+      </w:r>
+      <w:r>
+        <w:rPr>
+          <w:rFonts w:ascii="Times New Roman" w:hAnsi="Times New Roman"/>
+          <w:b w:val="0"/>
+          <w:i w:val="0"/>
+          <w:sz w:val="20"/>
+        </w:rPr>
+        <w:t xml:space="preserve"> [−5.47, −1.74]), and grows when the analysis is restricted to ages 50–80, away from the floor (</w:t>
+      </w:r>
+      <w:r>
+        <w:rPr>
+          <w:rFonts w:ascii="Times New Roman" w:hAnsi="Times New Roman"/>
+          <w:b w:val="0"/>
+          <w:i w:val="0"/>
+          <w:sz w:val="20"/>
+        </w:rPr>
+        <w:t>−5.49</w:t>
+      </w:r>
+      <w:r>
+        <w:rPr>
+          <w:rFonts w:ascii="Times New Roman" w:hAnsi="Times New Roman"/>
+          <w:b w:val="0"/>
+          <w:i w:val="0"/>
+          <w:sz w:val="20"/>
+        </w:rPr>
+        <w:t xml:space="preserve"> [−6.75, −4.27]; 12 matched pairs: </w:t>
+      </w:r>
+      <w:r>
+        <w:rPr>
+          <w:rFonts w:ascii="Times New Roman" w:hAnsi="Times New Roman"/>
+          <w:b w:val="0"/>
+          <w:i w:val="0"/>
+          <w:sz w:val="20"/>
+        </w:rPr>
+        <w:t>−5.94</w:t>
+      </w:r>
+      <w:r>
+        <w:rPr>
+          <w:rFonts w:ascii="Times New Roman" w:hAnsi="Times New Roman"/>
+          <w:b w:val="0"/>
+          <w:i w:val="0"/>
+          <w:sz w:val="20"/>
+        </w:rPr>
+        <w:t xml:space="preserve">; Table </w:t>
+      </w:r>
+      <w:r>
+        <w:rPr>
+          <w:rFonts w:ascii="Times New Roman" w:hAnsi="Times New Roman"/>
+          <w:b w:val="0"/>
+          <w:i w:val="0"/>
+          <w:sz w:val="20"/>
+        </w:rPr>
+        <w:t>V</w:t>
+      </w:r>
+      <w:r>
+        <w:rPr>
+          <w:rFonts w:ascii="Times New Roman" w:hAnsi="Times New Roman"/>
+          <w:b w:val="0"/>
+          <w:i w:val="0"/>
+          <w:sz w:val="20"/>
+        </w:rPr>
+        <w:t xml:space="preserve">). Memorisation of IOP training subjects therefore cannot be its cause, and neither can the output floor. Cross-validated training shows how fine-tuning interacts with it (Fig. </w:t>
       </w:r>
       <w:r>
         <w:rPr>
@@ -7601,97 +7313,25 @@
           <w:i w:val="0"/>
           <w:sz w:val="20"/>
         </w:rPr>
-        <w:t>). Between Guys and IOP the effect was small (</w:t>
-      </w:r>
-      <w:r>
-        <w:rPr>
-          <w:rFonts w:ascii="Times New Roman" w:hAnsi="Times New Roman"/>
-          <w:b w:val="0"/>
-          <w:i w:val="0"/>
-          <w:sz w:val="20"/>
-        </w:rPr>
-        <w:t>+0.11</w:t>
-      </w:r>
-      <w:r>
-        <w:rPr>
-          <w:rFonts w:ascii="Times New Roman" w:hAnsi="Times New Roman"/>
-          <w:b w:val="0"/>
-          <w:i w:val="0"/>
-          <w:sz w:val="20"/>
-        </w:rPr>
-        <w:t xml:space="preserve"> and </w:t>
-      </w:r>
-      <w:r>
-        <w:rPr>
-          <w:rFonts w:ascii="Times New Roman" w:hAnsi="Times New Roman"/>
-          <w:b w:val="0"/>
-          <w:i w:val="0"/>
-          <w:sz w:val="20"/>
-        </w:rPr>
-        <w:t>+0.90</w:t>
-      </w:r>
-      <w:r>
-        <w:rPr>
-          <w:rFonts w:ascii="Times New Roman" w:hAnsi="Times New Roman"/>
-          <w:b w:val="0"/>
-          <w:i w:val="0"/>
-          <w:sz w:val="20"/>
-        </w:rPr>
-        <w:t>), and Guys brains given HH's appearance became 3.32 years older. Strong blur (</w:t>
-      </w:r>
-      <w:r>
-        <w:rPr>
-          <w:rFonts w:ascii="Times New Roman" w:hAnsi="Times New Roman"/>
-          <w:b w:val="0"/>
-          <w:i w:val="0"/>
-          <w:sz w:val="20"/>
-        </w:rPr>
-        <w:t>σ=1.5</w:t>
-      </w:r>
-      <w:r>
-        <w:rPr>
-          <w:rFonts w:ascii="Times New Roman" w:hAnsi="Times New Roman"/>
-          <w:b w:val="0"/>
-          <w:i w:val="0"/>
-          <w:sz w:val="20"/>
-        </w:rPr>
-        <w:t xml:space="preserve"> voxels) lowered predictions by 3.17 years. With the cross-validated models, the direction replicated in all five independently trained models over all 412 out-of-sample subjects, with larger magnitudes: HH brains given IOP's appearance became 6.09 years younger (99% of subjects; per fold </w:t>
-      </w:r>
-      <w:r>
-        <w:rPr>
-          <w:rFonts w:ascii="Times New Roman" w:hAnsi="Times New Roman"/>
-          <w:b w:val="0"/>
-          <w:i w:val="0"/>
-          <w:sz w:val="20"/>
-        </w:rPr>
-        <w:t>−3.7</w:t>
-      </w:r>
-      <w:r>
-        <w:rPr>
-          <w:rFonts w:ascii="Times New Roman" w:hAnsi="Times New Roman"/>
-          <w:b w:val="0"/>
-          <w:i w:val="0"/>
-          <w:sz w:val="20"/>
-        </w:rPr>
-        <w:t xml:space="preserve"> to </w:t>
-      </w:r>
-      <w:r>
-        <w:rPr>
-          <w:rFonts w:ascii="Times New Roman" w:hAnsi="Times New Roman"/>
-          <w:b w:val="0"/>
-          <w:i w:val="0"/>
-          <w:sz w:val="20"/>
-        </w:rPr>
-        <w:t>−8.3</w:t>
-      </w:r>
-      <w:r>
-        <w:rPr>
-          <w:rFonts w:ascii="Times New Roman" w:hAnsi="Times New Roman"/>
-          <w:b w:val="0"/>
-          <w:i w:val="0"/>
-          <w:sz w:val="20"/>
-        </w:rPr>
-        <w:t>) and IOP brains given HH's appearance 4.76 years older (98%). Unlike the main model, these lighter fine-tunes, which keep the UK Biobank weights in their first three blocks, also responded to the Guys</w:t>
+        <w:t xml:space="preserve">). Between Guys and IOP the effect was small (Table </w:t>
+      </w:r>
+      <w:r>
+        <w:rPr>
+          <w:rFonts w:ascii="Times New Roman" w:hAnsi="Times New Roman"/>
+          <w:b w:val="0"/>
+          <w:i w:val="0"/>
+          <w:sz w:val="20"/>
+        </w:rPr>
+        <w:t>V</w:t>
+      </w:r>
+      <w:r>
+        <w:rPr>
+          <w:rFonts w:ascii="Times New Roman" w:hAnsi="Times New Roman"/>
+          <w:b w:val="0"/>
+          <w:i w:val="0"/>
+          <w:sz w:val="20"/>
+        </w:rPr>
+        <w:t>). With the cross-validated models, the direction replicated in all five fold models over all 412 out-of-sample subjects, with larger magnitudes (HH</w:t>
       </w:r>
       <w:r>
         <w:rPr>
@@ -7709,6 +7349,42 @@
           <w:i w:val="0"/>
           <w:sz w:val="20"/>
         </w:rPr>
+        <w:t xml:space="preserve">IOP: </w:t>
+      </w:r>
+      <w:r>
+        <w:rPr>
+          <w:rFonts w:ascii="Times New Roman" w:hAnsi="Times New Roman"/>
+          <w:b w:val="0"/>
+          <w:i w:val="0"/>
+          <w:sz w:val="20"/>
+        </w:rPr>
+        <w:t>−6.09</w:t>
+      </w:r>
+      <w:r>
+        <w:rPr>
+          <w:rFonts w:ascii="Times New Roman" w:hAnsi="Times New Roman"/>
+          <w:b w:val="0"/>
+          <w:i w:val="0"/>
+          <w:sz w:val="20"/>
+        </w:rPr>
+        <w:t xml:space="preserve"> years, 99% of subjects). These lighter fine-tunes also responded to the Guys</w:t>
+      </w:r>
+      <w:r>
+        <w:rPr>
+          <w:rFonts w:ascii="Times New Roman" w:hAnsi="Times New Roman"/>
+          <w:b w:val="0"/>
+          <w:i w:val="0"/>
+          <w:sz w:val="20"/>
+        </w:rPr>
+        <w:t>→</w:t>
+      </w:r>
+      <w:r>
+        <w:rPr>
+          <w:rFonts w:ascii="Times New Roman" w:hAnsi="Times New Roman"/>
+          <w:b w:val="0"/>
+          <w:i w:val="0"/>
+          <w:sz w:val="20"/>
+        </w:rPr>
         <w:t>IOP swap (</w:t>
       </w:r>
       <w:r>
@@ -7727,7 +7403,7 @@
           <w:i w:val="0"/>
           <w:sz w:val="20"/>
         </w:rPr>
-        <w:t>, 85%), so full fine-tuning appears to reduce, but not remove, acquisition sensitivity.</w:t>
+        <w:t>), so full fine-tuning appears to reduce, but not remove, acquisition sensitivity.</w:t>
       </w:r>
     </w:p>
     <w:p>
@@ -7973,7 +7649,97 @@
           <w:i w:val="0"/>
           <w:sz w:val="20"/>
         </w:rPr>
-        <w:t>); with spline age it remained (</w:t>
+        <w:t xml:space="preserve">), as it did with spline-age ComBat and with age-conditional LEACE. Only </w:t>
+      </w:r>
+      <w:r>
+        <w:rPr>
+          <w:rFonts w:ascii="Times New Roman" w:hAnsi="Times New Roman"/>
+          <w:b w:val="0"/>
+          <w:i/>
+          <w:sz w:val="20"/>
+        </w:rPr>
+        <w:t>plain</w:t>
+      </w:r>
+      <w:r>
+        <w:rPr>
+          <w:rFonts w:ascii="Times New Roman" w:hAnsi="Times New Roman"/>
+          <w:b w:val="0"/>
+          <w:i w:val="0"/>
+          <w:sz w:val="20"/>
+        </w:rPr>
+        <w:t xml:space="preserve"> LEACE removed it (</w:t>
+      </w:r>
+      <w:r>
+        <w:rPr>
+          <w:rFonts w:ascii="Times New Roman" w:hAnsi="Times New Roman"/>
+          <w:b w:val="0"/>
+          <w:i w:val="0"/>
+          <w:sz w:val="20"/>
+        </w:rPr>
+        <w:t>+0.40</w:t>
+      </w:r>
+      <w:r>
+        <w:rPr>
+          <w:rFonts w:ascii="Times New Roman" w:hAnsi="Times New Roman"/>
+          <w:b w:val="0"/>
+          <w:i w:val="0"/>
+          <w:sz w:val="20"/>
+        </w:rPr>
+        <w:t>). It did so without lowering overall accuracy or the age–prediction correlation (</w:t>
+      </w:r>
+      <w:r>
+        <w:rPr>
+          <w:rFonts w:ascii="Times New Roman" w:hAnsi="Times New Roman"/>
+          <w:b w:val="0"/>
+          <w:i w:val="0"/>
+          <w:sz w:val="20"/>
+        </w:rPr>
+        <w:t>r=0.962</w:t>
+      </w:r>
+      <w:r>
+        <w:rPr>
+          <w:rFonts w:ascii="Times New Roman" w:hAnsi="Times New Roman"/>
+          <w:b w:val="0"/>
+          <w:i w:val="0"/>
+          <w:sz w:val="20"/>
+        </w:rPr>
+        <w:t xml:space="preserve"> vs </w:t>
+      </w:r>
+      <w:r>
+        <w:rPr>
+          <w:rFonts w:ascii="Times New Roman" w:hAnsi="Times New Roman"/>
+          <w:b w:val="0"/>
+          <w:i w:val="0"/>
+          <w:sz w:val="20"/>
+        </w:rPr>
+        <w:t>0.965</w:t>
+      </w:r>
+      <w:r>
+        <w:rPr>
+          <w:rFonts w:ascii="Times New Roman" w:hAnsi="Times New Roman"/>
+          <w:b w:val="0"/>
+          <w:i w:val="0"/>
+          <w:sz w:val="20"/>
+        </w:rPr>
+        <w:t xml:space="preserve">; Table </w:t>
+      </w:r>
+      <w:r>
+        <w:rPr>
+          <w:rFonts w:ascii="Times New Roman" w:hAnsi="Times New Roman"/>
+          <w:b w:val="0"/>
+          <w:i w:val="0"/>
+          <w:sz w:val="20"/>
+        </w:rPr>
+        <w:t>V</w:t>
+      </w:r>
+      <w:r>
+        <w:rPr>
+          <w:rFonts w:ascii="Times New Roman" w:hAnsi="Times New Roman"/>
+          <w:b w:val="0"/>
+          <w:i w:val="0"/>
+          <w:sz w:val="20"/>
+        </w:rPr>
+        <w:t>), but it moved predictions by 1.1 years on average (conditional LEACE: 0.26) and raised IOP's error from 5.2 to 6.1 years. Because IOP's training subjects are younger, the site direction it erases is partly an age direction for IOP; the conditional version, which first removes age and sex, leaves the offset in place. Spline-age ComBat enlarged the offset (</w:t>
       </w:r>
       <w:r>
         <w:rPr>
@@ -7991,25 +7757,61 @@
           <w:i w:val="0"/>
           <w:sz w:val="20"/>
         </w:rPr>
-        <w:t>); with age-conditional LEACE it remained (</w:t>
-      </w:r>
-      <w:r>
-        <w:rPr>
-          <w:rFonts w:ascii="Times New Roman" w:hAnsi="Times New Roman"/>
-          <w:b w:val="0"/>
-          <w:i w:val="0"/>
-          <w:sz w:val="20"/>
-        </w:rPr>
-        <w:t>−4.46</w:t>
-      </w:r>
-      <w:r>
-        <w:rPr>
-          <w:rFonts w:ascii="Times New Roman" w:hAnsi="Times New Roman"/>
-          <w:b w:val="0"/>
-          <w:i w:val="0"/>
-          <w:sz w:val="20"/>
-        </w:rPr>
-        <w:t xml:space="preserve">). Only </w:t>
+        <w:t xml:space="preserve"> with 4 df), but this estimate was unstable across spline flexibility (</w:t>
+      </w:r>
+      <w:r>
+        <w:rPr>
+          <w:rFonts w:ascii="Times New Roman" w:hAnsi="Times New Roman"/>
+          <w:b w:val="0"/>
+          <w:i w:val="0"/>
+          <w:sz w:val="20"/>
+        </w:rPr>
+        <w:t>−6.07</w:t>
+      </w:r>
+      <w:r>
+        <w:rPr>
+          <w:rFonts w:ascii="Times New Roman" w:hAnsi="Times New Roman"/>
+          <w:b w:val="0"/>
+          <w:i w:val="0"/>
+          <w:sz w:val="20"/>
+        </w:rPr>
+        <w:t xml:space="preserve">, </w:t>
+      </w:r>
+      <w:r>
+        <w:rPr>
+          <w:rFonts w:ascii="Times New Roman" w:hAnsi="Times New Roman"/>
+          <w:b w:val="0"/>
+          <w:i w:val="0"/>
+          <w:sz w:val="20"/>
+        </w:rPr>
+        <w:t>−6.27</w:t>
+      </w:r>
+      <w:r>
+        <w:rPr>
+          <w:rFonts w:ascii="Times New Roman" w:hAnsi="Times New Roman"/>
+          <w:b w:val="0"/>
+          <w:i w:val="0"/>
+          <w:sz w:val="20"/>
+        </w:rPr>
+        <w:t xml:space="preserve"> and </w:t>
+      </w:r>
+      <w:r>
+        <w:rPr>
+          <w:rFonts w:ascii="Times New Roman" w:hAnsi="Times New Roman"/>
+          <w:b w:val="0"/>
+          <w:i w:val="0"/>
+          <w:sz w:val="20"/>
+        </w:rPr>
+        <w:t>−4.72</w:t>
+      </w:r>
+      <w:r>
+        <w:rPr>
+          <w:rFonts w:ascii="Times New Roman" w:hAnsi="Times New Roman"/>
+          <w:b w:val="0"/>
+          <w:i w:val="0"/>
+          <w:sz w:val="20"/>
+        </w:rPr>
+        <w:t xml:space="preserve"> with 3, 5 and 6 df) and IOP's error rose with it, so we attribute it to the harmonisation model fitting IOP's narrow, young age range poorly rather than to a larger true offset. </w:t>
       </w:r>
       <w:r>
         <w:rPr>
@@ -8018,42 +7820,6 @@
           <w:i/>
           <w:sz w:val="20"/>
         </w:rPr>
-        <w:t>plain</w:t>
-      </w:r>
-      <w:r>
-        <w:rPr>
-          <w:rFonts w:ascii="Times New Roman" w:hAnsi="Times New Roman"/>
-          <w:b w:val="0"/>
-          <w:i w:val="0"/>
-          <w:sz w:val="20"/>
-        </w:rPr>
-        <w:t xml:space="preserve"> LEACE removed it (</w:t>
-      </w:r>
-      <w:r>
-        <w:rPr>
-          <w:rFonts w:ascii="Times New Roman" w:hAnsi="Times New Roman"/>
-          <w:b w:val="0"/>
-          <w:i w:val="0"/>
-          <w:sz w:val="20"/>
-        </w:rPr>
-        <w:t>+0.40</w:t>
-      </w:r>
-      <w:r>
-        <w:rPr>
-          <w:rFonts w:ascii="Times New Roman" w:hAnsi="Times New Roman"/>
-          <w:b w:val="0"/>
-          <w:i w:val="0"/>
-          <w:sz w:val="20"/>
-        </w:rPr>
-        <w:t xml:space="preserve">), and only because, IOP's training subjects being younger, it also erased age information correlated with site; the conditional version, which preserves age, does not. </w:t>
-      </w:r>
-      <w:r>
-        <w:rPr>
-          <w:rFonts w:ascii="Times New Roman" w:hAnsi="Times New Roman"/>
-          <w:b w:val="0"/>
-          <w:i/>
-          <w:sz w:val="20"/>
-        </w:rPr>
         <w:t>Cohort:</w:t>
       </w:r>
       <w:r>
@@ -8063,169 +7829,25 @@
           <w:i w:val="0"/>
           <w:sz w:val="20"/>
         </w:rPr>
-        <w:t xml:space="preserve"> IOP did not differ from Guys in university degree (68% vs 56%; adjusted </w:t>
-      </w:r>
-      <w:r>
-        <w:rPr>
-          <w:rFonts w:ascii="Times New Roman" w:hAnsi="Times New Roman"/>
-          <w:b w:val="0"/>
-          <w:i w:val="0"/>
-          <w:sz w:val="20"/>
-        </w:rPr>
-        <w:t>p=0.56</w:t>
-      </w:r>
-      <w:r>
-        <w:rPr>
-          <w:rFonts w:ascii="Times New Roman" w:hAnsi="Times New Roman"/>
-          <w:b w:val="0"/>
-          <w:i w:val="0"/>
-          <w:sz w:val="20"/>
-        </w:rPr>
-        <w:t>), ethnicity (</w:t>
-      </w:r>
-      <w:r>
-        <w:rPr>
-          <w:rFonts w:ascii="Times New Roman" w:hAnsi="Times New Roman"/>
-          <w:b w:val="0"/>
-          <w:i w:val="0"/>
-          <w:sz w:val="20"/>
-        </w:rPr>
-        <w:t>p=0.64</w:t>
-      </w:r>
-      <w:r>
-        <w:rPr>
-          <w:rFonts w:ascii="Times New Roman" w:hAnsi="Times New Roman"/>
-          <w:b w:val="0"/>
-          <w:i w:val="0"/>
-          <w:sz w:val="20"/>
-        </w:rPr>
-        <w:t>) or BMI (</w:t>
-      </w:r>
-      <w:r>
-        <w:rPr>
-          <w:rFonts w:ascii="Times New Roman" w:hAnsi="Times New Roman"/>
-          <w:b w:val="0"/>
-          <w:i w:val="0"/>
-          <w:sz w:val="20"/>
-        </w:rPr>
-        <w:t>p=0.49</w:t>
-      </w:r>
-      <w:r>
-        <w:rPr>
-          <w:rFonts w:ascii="Times New Roman" w:hAnsi="Times New Roman"/>
-          <w:b w:val="0"/>
-          <w:i w:val="0"/>
-          <w:sz w:val="20"/>
-        </w:rPr>
-        <w:t>), and adjusting for all three left the offset unchanged in the zero-shot (</w:t>
-      </w:r>
-      <w:r>
-        <w:rPr>
-          <w:rFonts w:ascii="Times New Roman" w:hAnsi="Times New Roman"/>
-          <w:b w:val="0"/>
-          <w:i w:val="0"/>
-          <w:sz w:val="20"/>
-        </w:rPr>
-        <w:t>−2.80</w:t>
-      </w:r>
-      <w:r>
-        <w:rPr>
-          <w:rFonts w:ascii="Times New Roman" w:hAnsi="Times New Roman"/>
-          <w:b w:val="0"/>
-          <w:i w:val="0"/>
-          <w:sz w:val="20"/>
-        </w:rPr>
-        <w:t xml:space="preserve"> vs </w:t>
-      </w:r>
-      <w:r>
-        <w:rPr>
-          <w:rFonts w:ascii="Times New Roman" w:hAnsi="Times New Roman"/>
-          <w:b w:val="0"/>
-          <w:i w:val="0"/>
-          <w:sz w:val="20"/>
-        </w:rPr>
-        <w:t>−2.74</w:t>
-      </w:r>
-      <w:r>
-        <w:rPr>
-          <w:rFonts w:ascii="Times New Roman" w:hAnsi="Times New Roman"/>
-          <w:b w:val="0"/>
-          <w:i w:val="0"/>
-          <w:sz w:val="20"/>
-        </w:rPr>
-        <w:t>) and main models (</w:t>
-      </w:r>
-      <w:r>
-        <w:rPr>
-          <w:rFonts w:ascii="Times New Roman" w:hAnsi="Times New Roman"/>
-          <w:b w:val="0"/>
-          <w:i w:val="0"/>
-          <w:sz w:val="20"/>
-        </w:rPr>
-        <w:t>−5.26</w:t>
-      </w:r>
-      <w:r>
-        <w:rPr>
-          <w:rFonts w:ascii="Times New Roman" w:hAnsi="Times New Roman"/>
-          <w:b w:val="0"/>
-          <w:i w:val="0"/>
-          <w:sz w:val="20"/>
-        </w:rPr>
-        <w:t xml:space="preserve"> vs </w:t>
-      </w:r>
-      <w:r>
-        <w:rPr>
-          <w:rFonts w:ascii="Times New Roman" w:hAnsi="Times New Roman"/>
-          <w:b w:val="0"/>
-          <w:i w:val="0"/>
-          <w:sz w:val="20"/>
-        </w:rPr>
-        <w:t>−5.13</w:t>
-      </w:r>
-      <w:r>
-        <w:rPr>
-          <w:rFonts w:ascii="Times New Roman" w:hAnsi="Times New Roman"/>
-          <w:b w:val="0"/>
-          <w:i w:val="0"/>
-          <w:sz w:val="20"/>
-        </w:rPr>
-        <w:t>) and in cross-validation (</w:t>
-      </w:r>
-      <w:r>
-        <w:rPr>
-          <w:rFonts w:ascii="Times New Roman" w:hAnsi="Times New Roman"/>
-          <w:b w:val="0"/>
-          <w:i w:val="0"/>
-          <w:sz w:val="20"/>
-        </w:rPr>
-        <w:t>−5.04</w:t>
-      </w:r>
-      <w:r>
-        <w:rPr>
-          <w:rFonts w:ascii="Times New Roman" w:hAnsi="Times New Roman"/>
-          <w:b w:val="0"/>
-          <w:i w:val="0"/>
-          <w:sz w:val="20"/>
-        </w:rPr>
-        <w:t xml:space="preserve"> vs </w:t>
-      </w:r>
-      <w:r>
-        <w:rPr>
-          <w:rFonts w:ascii="Times New Roman" w:hAnsi="Times New Roman"/>
-          <w:b w:val="0"/>
-          <w:i w:val="0"/>
-          <w:sz w:val="20"/>
-        </w:rPr>
-        <w:t>−5.05</w:t>
-      </w:r>
-      <w:r>
-        <w:rPr>
-          <w:rFonts w:ascii="Times New Roman" w:hAnsi="Times New Roman"/>
-          <w:b w:val="0"/>
-          <w:i w:val="0"/>
-          <w:sz w:val="20"/>
-        </w:rPr>
-        <w:t xml:space="preserve">). Ethnicity itself showed at most a small effect: non-White participants had a gap </w:t>
+        <w:t xml:space="preserve"> IOP did not differ from Guys in university degree, ethnicity or BMI (adjusted </w:t>
+      </w:r>
+      <w:r>
+        <w:rPr>
+          <w:rFonts w:ascii="Times New Roman" w:hAnsi="Times New Roman"/>
+          <w:b w:val="0"/>
+          <w:i w:val="0"/>
+          <w:sz w:val="20"/>
+        </w:rPr>
+        <w:t>p&gt;0.4</w:t>
+      </w:r>
+      <w:r>
+        <w:rPr>
+          <w:rFonts w:ascii="Times New Roman" w:hAnsi="Times New Roman"/>
+          <w:b w:val="0"/>
+          <w:i w:val="0"/>
+          <w:sz w:val="20"/>
+        </w:rPr>
+        <w:t xml:space="preserve">), and adjusting for all three left the offset unchanged in the zero-shot, main and cross-validated models. Ethnicity itself showed at most a small effect: non-White participants had a gap </w:t>
       </w:r>
       <w:r>
         <w:rPr>
@@ -8243,25 +7865,7 @@
           <w:i w:val="0"/>
           <w:sz w:val="20"/>
         </w:rPr>
-        <w:t xml:space="preserve"> years higher in cross-validation ([−0.02, 2.88], </w:t>
-      </w:r>
-      <w:r>
-        <w:rPr>
-          <w:rFonts w:ascii="Times New Roman" w:hAnsi="Times New Roman"/>
-          <w:b w:val="0"/>
-          <w:i w:val="0"/>
-          <w:sz w:val="20"/>
-        </w:rPr>
-        <w:t>p=0.054</w:t>
-      </w:r>
-      <w:r>
-        <w:rPr>
-          <w:rFonts w:ascii="Times New Roman" w:hAnsi="Times New Roman"/>
-          <w:b w:val="0"/>
-          <w:i w:val="0"/>
-          <w:sz w:val="20"/>
-        </w:rPr>
-        <w:t xml:space="preserve">, 74 non-White), </w:t>
+        <w:t xml:space="preserve"> years higher in cross-validation ([−0.02, 2.88], 74 non-White) and </w:t>
       </w:r>
       <w:r>
         <w:rPr>
@@ -8297,25 +7901,7 @@
           <w:i w:val="0"/>
           <w:sz w:val="20"/>
         </w:rPr>
-        <w:t>, 21 non-White) and none in the zero-shot model (</w:t>
-      </w:r>
-      <w:r>
-        <w:rPr>
-          <w:rFonts w:ascii="Times New Roman" w:hAnsi="Times New Roman"/>
-          <w:b w:val="0"/>
-          <w:i w:val="0"/>
-          <w:sz w:val="20"/>
-        </w:rPr>
-        <w:t>−0.18</w:t>
-      </w:r>
-      <w:r>
-        <w:rPr>
-          <w:rFonts w:ascii="Times New Roman" w:hAnsi="Times New Roman"/>
-          <w:b w:val="0"/>
-          <w:i w:val="0"/>
-          <w:sz w:val="20"/>
-        </w:rPr>
-        <w:t xml:space="preserve">), in line with the small ethnicity effects reported elsewhere </w:t>
+        <w:t xml:space="preserve">, 21 non-White), in line with the small ethnicity effects reported elsewhere </w:t>
       </w:r>
       <w:r>
         <w:rPr>
@@ -8333,7 +7919,7 @@
           <w:i w:val="0"/>
           <w:sz w:val="20"/>
         </w:rPr>
-        <w:t>; with these numbers we report it as INCONCLUSIVE.</w:t>
+        <w:t>. Under the stated rule the cross-validated estimate decides, and its CI includes zero without equivalence, so the verdict is INCONCLUSIVE.</w:t>
       </w:r>
     </w:p>
     <w:p>
@@ -8375,13 +7961,15 @@
         <w:tblLook w:firstColumn="1" w:firstRow="1" w:lastColumn="0" w:lastRow="0" w:noHBand="0" w:noVBand="1" w:val="04A0"/>
       </w:tblPr>
       <w:tblGrid>
-        <w:gridCol w:w="5155"/>
-        <w:gridCol w:w="5155"/>
+        <w:gridCol w:w="2577"/>
+        <w:gridCol w:w="2577"/>
+        <w:gridCol w:w="2577"/>
+        <w:gridCol w:w="2577"/>
       </w:tblGrid>
       <w:tr>
         <w:tc>
           <w:tcPr>
-            <w:tcW w:type="dxa" w:w="5155"/>
+            <w:tcW w:type="dxa" w:w="2577"/>
             <w:tcBorders>
               <w:top w:val="single" w:sz="8"/>
               <w:bottom w:val="nil" w:sz="0"/>
@@ -8401,13 +7989,13 @@
                 <w:i w:val="0"/>
                 <w:sz w:val="16"/>
               </w:rPr>
-              <w:t>Test (held-out unless noted)</w:t>
+              <w:t>Test (main model, held-out)</w:t>
             </w:r>
           </w:p>
         </w:tc>
         <w:tc>
           <w:tcPr>
-            <w:tcW w:type="dxa" w:w="5155"/>
+            <w:tcW w:type="dxa" w:w="2577"/>
             <w:tcBorders>
               <w:top w:val="single" w:sz="8"/>
               <w:bottom w:val="nil" w:sz="0"/>
@@ -8431,11 +8019,63 @@
             </w:r>
           </w:p>
         </w:tc>
+        <w:tc>
+          <w:tcPr>
+            <w:tcW w:type="dxa" w:w="2577"/>
+            <w:tcBorders>
+              <w:top w:val="single" w:sz="8"/>
+              <w:bottom w:val="nil" w:sz="0"/>
+              <w:left w:val="nil"/>
+              <w:right w:val="nil"/>
+            </w:tcBorders>
+          </w:tcPr>
+          <w:p>
+            <w:pPr>
+              <w:spacing w:before="20" w:after="20"/>
+              <w:jc w:val="center"/>
+            </w:pPr>
+            <w:r>
+              <w:rPr>
+                <w:rFonts w:ascii="Times New Roman" w:hAnsi="Times New Roman"/>
+                <w:b/>
+                <w:i w:val="0"/>
+                <w:sz w:val="16"/>
+              </w:rPr>
+              <w:t>MAE</w:t>
+            </w:r>
+          </w:p>
+        </w:tc>
+        <w:tc>
+          <w:tcPr>
+            <w:tcW w:type="dxa" w:w="2577"/>
+            <w:tcBorders>
+              <w:top w:val="single" w:sz="8"/>
+              <w:bottom w:val="nil" w:sz="0"/>
+              <w:left w:val="nil"/>
+              <w:right w:val="nil"/>
+            </w:tcBorders>
+          </w:tcPr>
+          <w:p>
+            <w:pPr>
+              <w:spacing w:before="20" w:after="20"/>
+              <w:jc w:val="center"/>
+            </w:pPr>
+            <w:r>
+              <w:rPr>
+                <w:rFonts w:ascii="Times New Roman" w:hAnsi="Times New Roman"/>
+                <w:b/>
+                <w:i w:val="0"/>
+                <w:sz w:val="16"/>
+              </w:rPr>
+              <w:t>r</w:t>
+            </w:r>
+          </w:p>
+        </w:tc>
       </w:tr>
       <w:tr>
         <w:tc>
           <w:tcPr>
-            <w:tcW w:type="dxa" w:w="5155"/>
+            <w:tcW w:type="dxa" w:w="2577"/>
             <w:tcBorders>
               <w:top w:val="single" w:sz="8"/>
               <w:bottom w:val="nil" w:sz="0"/>
@@ -8455,13 +8095,13 @@
                 <w:i w:val="0"/>
                 <w:sz w:val="16"/>
               </w:rPr>
-              <w:t>Reference: corrected BAG, held-out</w:t>
+              <w:t>Reference: corrected BAG</w:t>
             </w:r>
           </w:p>
         </w:tc>
         <w:tc>
           <w:tcPr>
-            <w:tcW w:type="dxa" w:w="5155"/>
+            <w:tcW w:type="dxa" w:w="2577"/>
             <w:tcBorders>
               <w:top w:val="single" w:sz="8"/>
               <w:bottom w:val="nil" w:sz="0"/>
@@ -8494,11 +8134,63 @@
             </w:r>
           </w:p>
         </w:tc>
+        <w:tc>
+          <w:tcPr>
+            <w:tcW w:type="dxa" w:w="2577"/>
+            <w:tcBorders>
+              <w:top w:val="single" w:sz="8"/>
+              <w:bottom w:val="nil" w:sz="0"/>
+              <w:left w:val="nil"/>
+              <w:right w:val="nil"/>
+            </w:tcBorders>
+          </w:tcPr>
+          <w:p>
+            <w:pPr>
+              <w:spacing w:before="20" w:after="20"/>
+              <w:jc w:val="center"/>
+            </w:pPr>
+            <w:r>
+              <w:rPr>
+                <w:rFonts w:ascii="Times New Roman" w:hAnsi="Times New Roman"/>
+                <w:b w:val="0"/>
+                <w:i w:val="0"/>
+                <w:sz w:val="16"/>
+              </w:rPr>
+              <w:t>3.81</w:t>
+            </w:r>
+          </w:p>
+        </w:tc>
+        <w:tc>
+          <w:tcPr>
+            <w:tcW w:type="dxa" w:w="2577"/>
+            <w:tcBorders>
+              <w:top w:val="single" w:sz="8"/>
+              <w:bottom w:val="nil" w:sz="0"/>
+              <w:left w:val="nil"/>
+              <w:right w:val="nil"/>
+            </w:tcBorders>
+          </w:tcPr>
+          <w:p>
+            <w:pPr>
+              <w:spacing w:before="20" w:after="20"/>
+              <w:jc w:val="center"/>
+            </w:pPr>
+            <w:r>
+              <w:rPr>
+                <w:rFonts w:ascii="Times New Roman" w:hAnsi="Times New Roman"/>
+                <w:b w:val="0"/>
+                <w:i w:val="0"/>
+                <w:sz w:val="16"/>
+              </w:rPr>
+              <w:t>0.965</w:t>
+            </w:r>
+          </w:p>
+        </w:tc>
       </w:tr>
       <w:tr>
         <w:tc>
           <w:tcPr>
-            <w:tcW w:type="dxa" w:w="5155"/>
+            <w:tcW w:type="dxa" w:w="2577"/>
             <w:tcBorders>
               <w:top w:val="nil" w:sz="0"/>
               <w:bottom w:val="nil" w:sz="0"/>
@@ -8527,7 +8219,7 @@
                 <w:i w:val="0"/>
                 <w:sz w:val="16"/>
               </w:rPr>
-              <w:t>→</w:t>
+              <w:t>↔</w:t>
             </w:r>
             <w:r>
               <w:rPr>
@@ -8536,31 +8228,13 @@
                 <w:i w:val="0"/>
                 <w:sz w:val="16"/>
               </w:rPr>
-              <w:t>IOP / IOP</w:t>
-            </w:r>
-            <w:r>
-              <w:rPr>
-                <w:rFonts w:ascii="Times New Roman" w:hAnsi="Times New Roman"/>
-                <w:b w:val="0"/>
-                <w:i w:val="0"/>
-                <w:sz w:val="16"/>
-              </w:rPr>
-              <w:t>→</w:t>
-            </w:r>
-            <w:r>
-              <w:rPr>
-                <w:rFonts w:ascii="Times New Roman" w:hAnsi="Times New Roman"/>
-                <w:b w:val="0"/>
-                <w:i w:val="0"/>
-                <w:sz w:val="16"/>
-              </w:rPr>
-              <w:t>Guys appearance swap</w:t>
+              <w:t>IOP appearance swap</w:t>
             </w:r>
           </w:p>
         </w:tc>
         <w:tc>
           <w:tcPr>
-            <w:tcW w:type="dxa" w:w="5155"/>
+            <w:tcW w:type="dxa" w:w="2577"/>
             <w:tcBorders>
               <w:top w:val="nil" w:sz="0"/>
               <w:bottom w:val="nil" w:sz="0"/>
@@ -8602,11 +8276,63 @@
             </w:r>
           </w:p>
         </w:tc>
+        <w:tc>
+          <w:tcPr>
+            <w:tcW w:type="dxa" w:w="2577"/>
+            <w:tcBorders>
+              <w:top w:val="nil" w:sz="0"/>
+              <w:bottom w:val="nil" w:sz="0"/>
+              <w:left w:val="nil"/>
+              <w:right w:val="nil"/>
+            </w:tcBorders>
+          </w:tcPr>
+          <w:p>
+            <w:pPr>
+              <w:spacing w:before="20" w:after="20"/>
+              <w:jc w:val="center"/>
+            </w:pPr>
+            <w:r>
+              <w:rPr>
+                <w:rFonts w:ascii="Times New Roman" w:hAnsi="Times New Roman"/>
+                <w:b w:val="0"/>
+                <w:i w:val="0"/>
+                <w:sz w:val="16"/>
+              </w:rPr>
+              <w:t>–</w:t>
+            </w:r>
+          </w:p>
+        </w:tc>
+        <w:tc>
+          <w:tcPr>
+            <w:tcW w:type="dxa" w:w="2577"/>
+            <w:tcBorders>
+              <w:top w:val="nil" w:sz="0"/>
+              <w:bottom w:val="nil" w:sz="0"/>
+              <w:left w:val="nil"/>
+              <w:right w:val="nil"/>
+            </w:tcBorders>
+          </w:tcPr>
+          <w:p>
+            <w:pPr>
+              <w:spacing w:before="20" w:after="20"/>
+              <w:jc w:val="center"/>
+            </w:pPr>
+            <w:r>
+              <w:rPr>
+                <w:rFonts w:ascii="Times New Roman" w:hAnsi="Times New Roman"/>
+                <w:b w:val="0"/>
+                <w:i w:val="0"/>
+                <w:sz w:val="16"/>
+              </w:rPr>
+              <w:t>–</w:t>
+            </w:r>
+          </w:p>
+        </w:tc>
       </w:tr>
       <w:tr>
         <w:tc>
           <w:tcPr>
-            <w:tcW w:type="dxa" w:w="5155"/>
+            <w:tcW w:type="dxa" w:w="2577"/>
             <w:tcBorders>
               <w:top w:val="nil" w:sz="0"/>
               <w:bottom w:val="nil" w:sz="0"/>
@@ -8626,13 +8352,13 @@
                 <w:i w:val="0"/>
                 <w:sz w:val="16"/>
               </w:rPr>
-              <w:t>Guys / HH blurred to IOP smoothness</w:t>
+              <w:t>Guys / HH blurred to IOP</w:t>
             </w:r>
           </w:p>
         </w:tc>
         <w:tc>
           <w:tcPr>
-            <w:tcW w:type="dxa" w:w="5155"/>
+            <w:tcW w:type="dxa" w:w="2577"/>
             <w:tcBorders>
               <w:top w:val="nil" w:sz="0"/>
               <w:bottom w:val="nil" w:sz="0"/>
@@ -8674,11 +8400,63 @@
             </w:r>
           </w:p>
         </w:tc>
+        <w:tc>
+          <w:tcPr>
+            <w:tcW w:type="dxa" w:w="2577"/>
+            <w:tcBorders>
+              <w:top w:val="nil" w:sz="0"/>
+              <w:bottom w:val="nil" w:sz="0"/>
+              <w:left w:val="nil"/>
+              <w:right w:val="nil"/>
+            </w:tcBorders>
+          </w:tcPr>
+          <w:p>
+            <w:pPr>
+              <w:spacing w:before="20" w:after="20"/>
+              <w:jc w:val="center"/>
+            </w:pPr>
+            <w:r>
+              <w:rPr>
+                <w:rFonts w:ascii="Times New Roman" w:hAnsi="Times New Roman"/>
+                <w:b w:val="0"/>
+                <w:i w:val="0"/>
+                <w:sz w:val="16"/>
+              </w:rPr>
+              <w:t>–</w:t>
+            </w:r>
+          </w:p>
+        </w:tc>
+        <w:tc>
+          <w:tcPr>
+            <w:tcW w:type="dxa" w:w="2577"/>
+            <w:tcBorders>
+              <w:top w:val="nil" w:sz="0"/>
+              <w:bottom w:val="nil" w:sz="0"/>
+              <w:left w:val="nil"/>
+              <w:right w:val="nil"/>
+            </w:tcBorders>
+          </w:tcPr>
+          <w:p>
+            <w:pPr>
+              <w:spacing w:before="20" w:after="20"/>
+              <w:jc w:val="center"/>
+            </w:pPr>
+            <w:r>
+              <w:rPr>
+                <w:rFonts w:ascii="Times New Roman" w:hAnsi="Times New Roman"/>
+                <w:b w:val="0"/>
+                <w:i w:val="0"/>
+                <w:sz w:val="16"/>
+              </w:rPr>
+              <w:t>–</w:t>
+            </w:r>
+          </w:p>
+        </w:tc>
       </w:tr>
       <w:tr>
         <w:tc>
           <w:tcPr>
-            <w:tcW w:type="dxa" w:w="5155"/>
+            <w:tcW w:type="dxa" w:w="2577"/>
             <w:tcBorders>
               <w:top w:val="nil" w:sz="0"/>
               <w:bottom w:val="nil" w:sz="0"/>
@@ -8704,7 +8482,7 @@
         </w:tc>
         <w:tc>
           <w:tcPr>
-            <w:tcW w:type="dxa" w:w="5155"/>
+            <w:tcW w:type="dxa" w:w="2577"/>
             <w:tcBorders>
               <w:top w:val="nil" w:sz="0"/>
               <w:bottom w:val="nil" w:sz="0"/>
@@ -8737,11 +8515,63 @@
             </w:r>
           </w:p>
         </w:tc>
+        <w:tc>
+          <w:tcPr>
+            <w:tcW w:type="dxa" w:w="2577"/>
+            <w:tcBorders>
+              <w:top w:val="nil" w:sz="0"/>
+              <w:bottom w:val="nil" w:sz="0"/>
+              <w:left w:val="nil"/>
+              <w:right w:val="nil"/>
+            </w:tcBorders>
+          </w:tcPr>
+          <w:p>
+            <w:pPr>
+              <w:spacing w:before="20" w:after="20"/>
+              <w:jc w:val="center"/>
+            </w:pPr>
+            <w:r>
+              <w:rPr>
+                <w:rFonts w:ascii="Times New Roman" w:hAnsi="Times New Roman"/>
+                <w:b w:val="0"/>
+                <w:i w:val="0"/>
+                <w:sz w:val="16"/>
+              </w:rPr>
+              <w:t>–</w:t>
+            </w:r>
+          </w:p>
+        </w:tc>
+        <w:tc>
+          <w:tcPr>
+            <w:tcW w:type="dxa" w:w="2577"/>
+            <w:tcBorders>
+              <w:top w:val="nil" w:sz="0"/>
+              <w:bottom w:val="nil" w:sz="0"/>
+              <w:left w:val="nil"/>
+              <w:right w:val="nil"/>
+            </w:tcBorders>
+          </w:tcPr>
+          <w:p>
+            <w:pPr>
+              <w:spacing w:before="20" w:after="20"/>
+              <w:jc w:val="center"/>
+            </w:pPr>
+            <w:r>
+              <w:rPr>
+                <w:rFonts w:ascii="Times New Roman" w:hAnsi="Times New Roman"/>
+                <w:b w:val="0"/>
+                <w:i w:val="0"/>
+                <w:sz w:val="16"/>
+              </w:rPr>
+              <w:t>–</w:t>
+            </w:r>
+          </w:p>
+        </w:tc>
       </w:tr>
       <w:tr>
         <w:tc>
           <w:tcPr>
-            <w:tcW w:type="dxa" w:w="5155"/>
+            <w:tcW w:type="dxa" w:w="2577"/>
             <w:tcBorders>
               <w:top w:val="nil" w:sz="0"/>
               <w:bottom w:val="nil" w:sz="0"/>
@@ -8767,7 +8597,7 @@
         </w:tc>
         <w:tc>
           <w:tcPr>
-            <w:tcW w:type="dxa" w:w="5155"/>
+            <w:tcW w:type="dxa" w:w="2577"/>
             <w:tcBorders>
               <w:top w:val="nil" w:sz="0"/>
               <w:bottom w:val="nil" w:sz="0"/>
@@ -8800,11 +8630,63 @@
             </w:r>
           </w:p>
         </w:tc>
+        <w:tc>
+          <w:tcPr>
+            <w:tcW w:type="dxa" w:w="2577"/>
+            <w:tcBorders>
+              <w:top w:val="nil" w:sz="0"/>
+              <w:bottom w:val="nil" w:sz="0"/>
+              <w:left w:val="nil"/>
+              <w:right w:val="nil"/>
+            </w:tcBorders>
+          </w:tcPr>
+          <w:p>
+            <w:pPr>
+              <w:spacing w:before="20" w:after="20"/>
+              <w:jc w:val="center"/>
+            </w:pPr>
+            <w:r>
+              <w:rPr>
+                <w:rFonts w:ascii="Times New Roman" w:hAnsi="Times New Roman"/>
+                <w:b w:val="0"/>
+                <w:i w:val="0"/>
+                <w:sz w:val="16"/>
+              </w:rPr>
+              <w:t>–</w:t>
+            </w:r>
+          </w:p>
+        </w:tc>
+        <w:tc>
+          <w:tcPr>
+            <w:tcW w:type="dxa" w:w="2577"/>
+            <w:tcBorders>
+              <w:top w:val="nil" w:sz="0"/>
+              <w:bottom w:val="nil" w:sz="0"/>
+              <w:left w:val="nil"/>
+              <w:right w:val="nil"/>
+            </w:tcBorders>
+          </w:tcPr>
+          <w:p>
+            <w:pPr>
+              <w:spacing w:before="20" w:after="20"/>
+              <w:jc w:val="center"/>
+            </w:pPr>
+            <w:r>
+              <w:rPr>
+                <w:rFonts w:ascii="Times New Roman" w:hAnsi="Times New Roman"/>
+                <w:b w:val="0"/>
+                <w:i w:val="0"/>
+                <w:sz w:val="16"/>
+              </w:rPr>
+              <w:t>–</w:t>
+            </w:r>
+          </w:p>
+        </w:tc>
       </w:tr>
       <w:tr>
         <w:tc>
           <w:tcPr>
-            <w:tcW w:type="dxa" w:w="5155"/>
+            <w:tcW w:type="dxa" w:w="2577"/>
             <w:tcBorders>
               <w:top w:val="nil" w:sz="0"/>
               <w:bottom w:val="nil" w:sz="0"/>
@@ -8830,7 +8712,7 @@
         </w:tc>
         <w:tc>
           <w:tcPr>
-            <w:tcW w:type="dxa" w:w="5155"/>
+            <w:tcW w:type="dxa" w:w="2577"/>
             <w:tcBorders>
               <w:top w:val="nil" w:sz="0"/>
               <w:bottom w:val="nil" w:sz="0"/>
@@ -8863,11 +8745,63 @@
             </w:r>
           </w:p>
         </w:tc>
+        <w:tc>
+          <w:tcPr>
+            <w:tcW w:type="dxa" w:w="2577"/>
+            <w:tcBorders>
+              <w:top w:val="nil" w:sz="0"/>
+              <w:bottom w:val="nil" w:sz="0"/>
+              <w:left w:val="nil"/>
+              <w:right w:val="nil"/>
+            </w:tcBorders>
+          </w:tcPr>
+          <w:p>
+            <w:pPr>
+              <w:spacing w:before="20" w:after="20"/>
+              <w:jc w:val="center"/>
+            </w:pPr>
+            <w:r>
+              <w:rPr>
+                <w:rFonts w:ascii="Times New Roman" w:hAnsi="Times New Roman"/>
+                <w:b w:val="0"/>
+                <w:i w:val="0"/>
+                <w:sz w:val="16"/>
+              </w:rPr>
+              <w:t>3.90</w:t>
+            </w:r>
+          </w:p>
+        </w:tc>
+        <w:tc>
+          <w:tcPr>
+            <w:tcW w:type="dxa" w:w="2577"/>
+            <w:tcBorders>
+              <w:top w:val="nil" w:sz="0"/>
+              <w:bottom w:val="nil" w:sz="0"/>
+              <w:left w:val="nil"/>
+              <w:right w:val="nil"/>
+            </w:tcBorders>
+          </w:tcPr>
+          <w:p>
+            <w:pPr>
+              <w:spacing w:before="20" w:after="20"/>
+              <w:jc w:val="center"/>
+            </w:pPr>
+            <w:r>
+              <w:rPr>
+                <w:rFonts w:ascii="Times New Roman" w:hAnsi="Times New Roman"/>
+                <w:b w:val="0"/>
+                <w:i w:val="0"/>
+                <w:sz w:val="16"/>
+              </w:rPr>
+              <w:t>0.962</w:t>
+            </w:r>
+          </w:p>
+        </w:tc>
       </w:tr>
       <w:tr>
         <w:tc>
           <w:tcPr>
-            <w:tcW w:type="dxa" w:w="5155"/>
+            <w:tcW w:type="dxa" w:w="2577"/>
             <w:tcBorders>
               <w:top w:val="nil" w:sz="0"/>
               <w:bottom w:val="nil" w:sz="0"/>
@@ -8887,13 +8821,13 @@
                 <w:i w:val="0"/>
                 <w:sz w:val="16"/>
               </w:rPr>
-              <w:t>ComBat with spline age</w:t>
+              <w:t>ComBat, spline age (4 df)</w:t>
             </w:r>
           </w:p>
         </w:tc>
         <w:tc>
           <w:tcPr>
-            <w:tcW w:type="dxa" w:w="5155"/>
+            <w:tcW w:type="dxa" w:w="2577"/>
             <w:tcBorders>
               <w:top w:val="nil" w:sz="0"/>
               <w:bottom w:val="nil" w:sz="0"/>
@@ -8926,11 +8860,205 @@
             </w:r>
           </w:p>
         </w:tc>
+        <w:tc>
+          <w:tcPr>
+            <w:tcW w:type="dxa" w:w="2577"/>
+            <w:tcBorders>
+              <w:top w:val="nil" w:sz="0"/>
+              <w:bottom w:val="nil" w:sz="0"/>
+              <w:left w:val="nil"/>
+              <w:right w:val="nil"/>
+            </w:tcBorders>
+          </w:tcPr>
+          <w:p>
+            <w:pPr>
+              <w:spacing w:before="20" w:after="20"/>
+              <w:jc w:val="center"/>
+            </w:pPr>
+            <w:r>
+              <w:rPr>
+                <w:rFonts w:ascii="Times New Roman" w:hAnsi="Times New Roman"/>
+                <w:b w:val="0"/>
+                <w:i w:val="0"/>
+                <w:sz w:val="16"/>
+              </w:rPr>
+              <w:t>4.01</w:t>
+            </w:r>
+          </w:p>
+        </w:tc>
+        <w:tc>
+          <w:tcPr>
+            <w:tcW w:type="dxa" w:w="2577"/>
+            <w:tcBorders>
+              <w:top w:val="nil" w:sz="0"/>
+              <w:bottom w:val="nil" w:sz="0"/>
+              <w:left w:val="nil"/>
+              <w:right w:val="nil"/>
+            </w:tcBorders>
+          </w:tcPr>
+          <w:p>
+            <w:pPr>
+              <w:spacing w:before="20" w:after="20"/>
+              <w:jc w:val="center"/>
+            </w:pPr>
+            <w:r>
+              <w:rPr>
+                <w:rFonts w:ascii="Times New Roman" w:hAnsi="Times New Roman"/>
+                <w:b w:val="0"/>
+                <w:i w:val="0"/>
+                <w:sz w:val="16"/>
+              </w:rPr>
+              <w:t>0.957</w:t>
+            </w:r>
+          </w:p>
+        </w:tc>
       </w:tr>
       <w:tr>
         <w:tc>
           <w:tcPr>
-            <w:tcW w:type="dxa" w:w="5155"/>
+            <w:tcW w:type="dxa" w:w="2577"/>
+            <w:tcBorders>
+              <w:top w:val="nil" w:sz="0"/>
+              <w:bottom w:val="nil" w:sz="0"/>
+              <w:left w:val="nil"/>
+              <w:right w:val="nil"/>
+            </w:tcBorders>
+          </w:tcPr>
+          <w:p>
+            <w:pPr>
+              <w:spacing w:before="20" w:after="20"/>
+              <w:jc w:val="left"/>
+            </w:pPr>
+            <w:r>
+              <w:rPr>
+                <w:rFonts w:ascii="Times New Roman" w:hAnsi="Times New Roman"/>
+                <w:b w:val="0"/>
+                <w:i w:val="0"/>
+                <w:sz w:val="16"/>
+              </w:rPr>
+              <w:t>ComBat, spline 3 / 5 / 6 df</w:t>
+            </w:r>
+          </w:p>
+        </w:tc>
+        <w:tc>
+          <w:tcPr>
+            <w:tcW w:type="dxa" w:w="2577"/>
+            <w:tcBorders>
+              <w:top w:val="nil" w:sz="0"/>
+              <w:bottom w:val="nil" w:sz="0"/>
+              <w:left w:val="nil"/>
+              <w:right w:val="nil"/>
+            </w:tcBorders>
+          </w:tcPr>
+          <w:p>
+            <w:pPr>
+              <w:spacing w:before="20" w:after="20"/>
+              <w:jc w:val="center"/>
+            </w:pPr>
+            <w:r>
+              <w:rPr>
+                <w:rFonts w:ascii="Times New Roman" w:hAnsi="Times New Roman"/>
+                <w:b w:val="0"/>
+                <w:i w:val="0"/>
+                <w:sz w:val="16"/>
+              </w:rPr>
+              <w:t>−6.07</w:t>
+            </w:r>
+            <w:r>
+              <w:rPr>
+                <w:rFonts w:ascii="Times New Roman" w:hAnsi="Times New Roman"/>
+                <w:b w:val="0"/>
+                <w:i w:val="0"/>
+                <w:sz w:val="16"/>
+              </w:rPr>
+              <w:t xml:space="preserve"> / </w:t>
+            </w:r>
+            <w:r>
+              <w:rPr>
+                <w:rFonts w:ascii="Times New Roman" w:hAnsi="Times New Roman"/>
+                <w:b w:val="0"/>
+                <w:i w:val="0"/>
+                <w:sz w:val="16"/>
+              </w:rPr>
+              <w:t>−6.27</w:t>
+            </w:r>
+            <w:r>
+              <w:rPr>
+                <w:rFonts w:ascii="Times New Roman" w:hAnsi="Times New Roman"/>
+                <w:b w:val="0"/>
+                <w:i w:val="0"/>
+                <w:sz w:val="16"/>
+              </w:rPr>
+              <w:t xml:space="preserve"> / </w:t>
+            </w:r>
+            <w:r>
+              <w:rPr>
+                <w:rFonts w:ascii="Times New Roman" w:hAnsi="Times New Roman"/>
+                <w:b w:val="0"/>
+                <w:i w:val="0"/>
+                <w:sz w:val="16"/>
+              </w:rPr>
+              <w:t>−4.72</w:t>
+            </w:r>
+          </w:p>
+        </w:tc>
+        <w:tc>
+          <w:tcPr>
+            <w:tcW w:type="dxa" w:w="2577"/>
+            <w:tcBorders>
+              <w:top w:val="nil" w:sz="0"/>
+              <w:bottom w:val="nil" w:sz="0"/>
+              <w:left w:val="nil"/>
+              <w:right w:val="nil"/>
+            </w:tcBorders>
+          </w:tcPr>
+          <w:p>
+            <w:pPr>
+              <w:spacing w:before="20" w:after="20"/>
+              <w:jc w:val="center"/>
+            </w:pPr>
+            <w:r>
+              <w:rPr>
+                <w:rFonts w:ascii="Times New Roman" w:hAnsi="Times New Roman"/>
+                <w:b w:val="0"/>
+                <w:i w:val="0"/>
+                <w:sz w:val="16"/>
+              </w:rPr>
+              <w:t>–</w:t>
+            </w:r>
+          </w:p>
+        </w:tc>
+        <w:tc>
+          <w:tcPr>
+            <w:tcW w:type="dxa" w:w="2577"/>
+            <w:tcBorders>
+              <w:top w:val="nil" w:sz="0"/>
+              <w:bottom w:val="nil" w:sz="0"/>
+              <w:left w:val="nil"/>
+              <w:right w:val="nil"/>
+            </w:tcBorders>
+          </w:tcPr>
+          <w:p>
+            <w:pPr>
+              <w:spacing w:before="20" w:after="20"/>
+              <w:jc w:val="center"/>
+            </w:pPr>
+            <w:r>
+              <w:rPr>
+                <w:rFonts w:ascii="Times New Roman" w:hAnsi="Times New Roman"/>
+                <w:b w:val="0"/>
+                <w:i w:val="0"/>
+                <w:sz w:val="16"/>
+              </w:rPr>
+              <w:t>–</w:t>
+            </w:r>
+          </w:p>
+        </w:tc>
+      </w:tr>
+      <w:tr>
+        <w:tc>
+          <w:tcPr>
+            <w:tcW w:type="dxa" w:w="2577"/>
             <w:tcBorders>
               <w:top w:val="nil" w:sz="0"/>
               <w:bottom w:val="nil" w:sz="0"/>
@@ -8956,7 +9084,7 @@
         </w:tc>
         <w:tc>
           <w:tcPr>
-            <w:tcW w:type="dxa" w:w="5155"/>
+            <w:tcW w:type="dxa" w:w="2577"/>
             <w:tcBorders>
               <w:top w:val="nil" w:sz="0"/>
               <w:bottom w:val="nil" w:sz="0"/>
@@ -8989,11 +9117,63 @@
             </w:r>
           </w:p>
         </w:tc>
+        <w:tc>
+          <w:tcPr>
+            <w:tcW w:type="dxa" w:w="2577"/>
+            <w:tcBorders>
+              <w:top w:val="nil" w:sz="0"/>
+              <w:bottom w:val="nil" w:sz="0"/>
+              <w:left w:val="nil"/>
+              <w:right w:val="nil"/>
+            </w:tcBorders>
+          </w:tcPr>
+          <w:p>
+            <w:pPr>
+              <w:spacing w:before="20" w:after="20"/>
+              <w:jc w:val="center"/>
+            </w:pPr>
+            <w:r>
+              <w:rPr>
+                <w:rFonts w:ascii="Times New Roman" w:hAnsi="Times New Roman"/>
+                <w:b w:val="0"/>
+                <w:i w:val="0"/>
+                <w:sz w:val="16"/>
+              </w:rPr>
+              <w:t>3.88</w:t>
+            </w:r>
+          </w:p>
+        </w:tc>
+        <w:tc>
+          <w:tcPr>
+            <w:tcW w:type="dxa" w:w="2577"/>
+            <w:tcBorders>
+              <w:top w:val="nil" w:sz="0"/>
+              <w:bottom w:val="nil" w:sz="0"/>
+              <w:left w:val="nil"/>
+              <w:right w:val="nil"/>
+            </w:tcBorders>
+          </w:tcPr>
+          <w:p>
+            <w:pPr>
+              <w:spacing w:before="20" w:after="20"/>
+              <w:jc w:val="center"/>
+            </w:pPr>
+            <w:r>
+              <w:rPr>
+                <w:rFonts w:ascii="Times New Roman" w:hAnsi="Times New Roman"/>
+                <w:b w:val="0"/>
+                <w:i w:val="0"/>
+                <w:sz w:val="16"/>
+              </w:rPr>
+              <w:t>0.962</w:t>
+            </w:r>
+          </w:p>
+        </w:tc>
       </w:tr>
       <w:tr>
         <w:tc>
           <w:tcPr>
-            <w:tcW w:type="dxa" w:w="5155"/>
+            <w:tcW w:type="dxa" w:w="2577"/>
             <w:tcBorders>
               <w:top w:val="nil" w:sz="0"/>
               <w:bottom w:val="nil" w:sz="0"/>
@@ -9013,13 +9193,13 @@
                 <w:i w:val="0"/>
                 <w:sz w:val="16"/>
               </w:rPr>
-              <w:t>LEACE, plain (removes age information)</w:t>
+              <w:t>LEACE, plain</w:t>
             </w:r>
           </w:p>
         </w:tc>
         <w:tc>
           <w:tcPr>
-            <w:tcW w:type="dxa" w:w="5155"/>
+            <w:tcW w:type="dxa" w:w="2577"/>
             <w:tcBorders>
               <w:top w:val="nil" w:sz="0"/>
               <w:bottom w:val="nil" w:sz="0"/>
@@ -9052,14 +9232,66 @@
             </w:r>
           </w:p>
         </w:tc>
+        <w:tc>
+          <w:tcPr>
+            <w:tcW w:type="dxa" w:w="2577"/>
+            <w:tcBorders>
+              <w:top w:val="nil" w:sz="0"/>
+              <w:bottom w:val="nil" w:sz="0"/>
+              <w:left w:val="nil"/>
+              <w:right w:val="nil"/>
+            </w:tcBorders>
+          </w:tcPr>
+          <w:p>
+            <w:pPr>
+              <w:spacing w:before="20" w:after="20"/>
+              <w:jc w:val="center"/>
+            </w:pPr>
+            <w:r>
+              <w:rPr>
+                <w:rFonts w:ascii="Times New Roman" w:hAnsi="Times New Roman"/>
+                <w:b w:val="0"/>
+                <w:i w:val="0"/>
+                <w:sz w:val="16"/>
+              </w:rPr>
+              <w:t>3.94</w:t>
+            </w:r>
+          </w:p>
+        </w:tc>
+        <w:tc>
+          <w:tcPr>
+            <w:tcW w:type="dxa" w:w="2577"/>
+            <w:tcBorders>
+              <w:top w:val="nil" w:sz="0"/>
+              <w:bottom w:val="nil" w:sz="0"/>
+              <w:left w:val="nil"/>
+              <w:right w:val="nil"/>
+            </w:tcBorders>
+          </w:tcPr>
+          <w:p>
+            <w:pPr>
+              <w:spacing w:before="20" w:after="20"/>
+              <w:jc w:val="center"/>
+            </w:pPr>
+            <w:r>
+              <w:rPr>
+                <w:rFonts w:ascii="Times New Roman" w:hAnsi="Times New Roman"/>
+                <w:b w:val="0"/>
+                <w:i w:val="0"/>
+                <w:sz w:val="16"/>
+              </w:rPr>
+              <w:t>0.962</w:t>
+            </w:r>
+          </w:p>
+        </w:tc>
       </w:tr>
       <w:tr>
         <w:tc>
           <w:tcPr>
-            <w:tcW w:type="dxa" w:w="5155"/>
+            <w:tcW w:type="dxa" w:w="2577"/>
             <w:tcBorders>
-              <w:top w:val="nil" w:sz="0"/>
-              <w:bottom w:val="single" w:sz="8"/>
+              <w:top w:val="single" w:sz="8"/>
+              <w:bottom w:val="nil" w:sz="0"/>
               <w:left w:val="nil"/>
               <w:right w:val="nil"/>
             </w:tcBorders>
@@ -9076,25 +9308,16 @@
                 <w:i w:val="0"/>
                 <w:sz w:val="16"/>
               </w:rPr>
-              <w:t>Zero-shot model, before fine-tuning</w:t>
-            </w:r>
-            <w:r>
-              <w:rPr>
-                <w:rFonts w:ascii="Times New Roman" w:hAnsi="Times New Roman"/>
-                <w:b w:val="0"/>
-                <w:i w:val="0"/>
-                <w:sz w:val="16"/>
-              </w:rPr>
-              <w:t>^*</w:t>
+              <w:t>Zero-shot, linear age, 42–82</w:t>
             </w:r>
           </w:p>
         </w:tc>
         <w:tc>
           <w:tcPr>
-            <w:tcW w:type="dxa" w:w="5155"/>
+            <w:tcW w:type="dxa" w:w="2577"/>
             <w:tcBorders>
-              <w:top w:val="nil" w:sz="0"/>
-              <w:bottom w:val="single" w:sz="8"/>
+              <w:top w:val="single" w:sz="8"/>
+              <w:bottom w:val="nil" w:sz="0"/>
               <w:left w:val="nil"/>
               <w:right w:val="nil"/>
             </w:tcBorders>
@@ -9124,6 +9347,554 @@
             </w:r>
           </w:p>
         </w:tc>
+        <w:tc>
+          <w:tcPr>
+            <w:tcW w:type="dxa" w:w="2577"/>
+            <w:tcBorders>
+              <w:top w:val="single" w:sz="8"/>
+              <w:bottom w:val="nil" w:sz="0"/>
+              <w:left w:val="nil"/>
+              <w:right w:val="nil"/>
+            </w:tcBorders>
+          </w:tcPr>
+          <w:p>
+            <w:pPr>
+              <w:spacing w:before="20" w:after="20"/>
+              <w:jc w:val="center"/>
+            </w:pPr>
+            <w:r>
+              <w:rPr>
+                <w:rFonts w:ascii="Times New Roman" w:hAnsi="Times New Roman"/>
+                <w:b w:val="0"/>
+                <w:i w:val="0"/>
+                <w:sz w:val="16"/>
+              </w:rPr>
+              <w:t>–</w:t>
+            </w:r>
+          </w:p>
+        </w:tc>
+        <w:tc>
+          <w:tcPr>
+            <w:tcW w:type="dxa" w:w="2577"/>
+            <w:tcBorders>
+              <w:top w:val="single" w:sz="8"/>
+              <w:bottom w:val="nil" w:sz="0"/>
+              <w:left w:val="nil"/>
+              <w:right w:val="nil"/>
+            </w:tcBorders>
+          </w:tcPr>
+          <w:p>
+            <w:pPr>
+              <w:spacing w:before="20" w:after="20"/>
+              <w:jc w:val="center"/>
+            </w:pPr>
+            <w:r>
+              <w:rPr>
+                <w:rFonts w:ascii="Times New Roman" w:hAnsi="Times New Roman"/>
+                <w:b w:val="0"/>
+                <w:i w:val="0"/>
+                <w:sz w:val="16"/>
+              </w:rPr>
+              <w:t>–</w:t>
+            </w:r>
+          </w:p>
+        </w:tc>
+      </w:tr>
+      <w:tr>
+        <w:tc>
+          <w:tcPr>
+            <w:tcW w:type="dxa" w:w="2577"/>
+            <w:tcBorders>
+              <w:top w:val="nil" w:sz="0"/>
+              <w:bottom w:val="nil" w:sz="0"/>
+              <w:left w:val="nil"/>
+              <w:right w:val="nil"/>
+            </w:tcBorders>
+          </w:tcPr>
+          <w:p>
+            <w:pPr>
+              <w:spacing w:before="20" w:after="20"/>
+              <w:jc w:val="left"/>
+            </w:pPr>
+            <w:r>
+              <w:rPr>
+                <w:rFonts w:ascii="Times New Roman" w:hAnsi="Times New Roman"/>
+                <w:b w:val="0"/>
+                <w:i w:val="0"/>
+                <w:sz w:val="16"/>
+              </w:rPr>
+              <w:t>Zero-shot, B-spline age, 42–82</w:t>
+            </w:r>
+          </w:p>
+        </w:tc>
+        <w:tc>
+          <w:tcPr>
+            <w:tcW w:type="dxa" w:w="2577"/>
+            <w:tcBorders>
+              <w:top w:val="nil" w:sz="0"/>
+              <w:bottom w:val="nil" w:sz="0"/>
+              <w:left w:val="nil"/>
+              <w:right w:val="nil"/>
+            </w:tcBorders>
+          </w:tcPr>
+          <w:p>
+            <w:pPr>
+              <w:spacing w:before="20" w:after="20"/>
+              <w:jc w:val="center"/>
+            </w:pPr>
+            <w:r>
+              <w:rPr>
+                <w:rFonts w:ascii="Times New Roman" w:hAnsi="Times New Roman"/>
+                <w:b w:val="0"/>
+                <w:i w:val="0"/>
+                <w:sz w:val="16"/>
+              </w:rPr>
+              <w:t>−3.55</w:t>
+            </w:r>
+            <w:r>
+              <w:rPr>
+                <w:rFonts w:ascii="Times New Roman" w:hAnsi="Times New Roman"/>
+                <w:b w:val="0"/>
+                <w:i w:val="0"/>
+                <w:sz w:val="16"/>
+              </w:rPr>
+              <w:t xml:space="preserve"> [−4.94, −2.25]</w:t>
+            </w:r>
+          </w:p>
+        </w:tc>
+        <w:tc>
+          <w:tcPr>
+            <w:tcW w:type="dxa" w:w="2577"/>
+            <w:tcBorders>
+              <w:top w:val="nil" w:sz="0"/>
+              <w:bottom w:val="nil" w:sz="0"/>
+              <w:left w:val="nil"/>
+              <w:right w:val="nil"/>
+            </w:tcBorders>
+          </w:tcPr>
+          <w:p>
+            <w:pPr>
+              <w:spacing w:before="20" w:after="20"/>
+              <w:jc w:val="center"/>
+            </w:pPr>
+            <w:r>
+              <w:rPr>
+                <w:rFonts w:ascii="Times New Roman" w:hAnsi="Times New Roman"/>
+                <w:b w:val="0"/>
+                <w:i w:val="0"/>
+                <w:sz w:val="16"/>
+              </w:rPr>
+              <w:t>–</w:t>
+            </w:r>
+          </w:p>
+        </w:tc>
+        <w:tc>
+          <w:tcPr>
+            <w:tcW w:type="dxa" w:w="2577"/>
+            <w:tcBorders>
+              <w:top w:val="nil" w:sz="0"/>
+              <w:bottom w:val="nil" w:sz="0"/>
+              <w:left w:val="nil"/>
+              <w:right w:val="nil"/>
+            </w:tcBorders>
+          </w:tcPr>
+          <w:p>
+            <w:pPr>
+              <w:spacing w:before="20" w:after="20"/>
+              <w:jc w:val="center"/>
+            </w:pPr>
+            <w:r>
+              <w:rPr>
+                <w:rFonts w:ascii="Times New Roman" w:hAnsi="Times New Roman"/>
+                <w:b w:val="0"/>
+                <w:i w:val="0"/>
+                <w:sz w:val="16"/>
+              </w:rPr>
+              <w:t>–</w:t>
+            </w:r>
+          </w:p>
+        </w:tc>
+      </w:tr>
+      <w:tr>
+        <w:tc>
+          <w:tcPr>
+            <w:tcW w:type="dxa" w:w="2577"/>
+            <w:tcBorders>
+              <w:top w:val="nil" w:sz="0"/>
+              <w:bottom w:val="nil" w:sz="0"/>
+              <w:left w:val="nil"/>
+              <w:right w:val="nil"/>
+            </w:tcBorders>
+          </w:tcPr>
+          <w:p>
+            <w:pPr>
+              <w:spacing w:before="20" w:after="20"/>
+              <w:jc w:val="left"/>
+            </w:pPr>
+            <w:r>
+              <w:rPr>
+                <w:rFonts w:ascii="Times New Roman" w:hAnsi="Times New Roman"/>
+                <w:b w:val="0"/>
+                <w:i w:val="0"/>
+                <w:sz w:val="16"/>
+              </w:rPr>
+              <w:t>Zero-shot, matched pairs, 42–82 (</w:t>
+            </w:r>
+            <w:r>
+              <w:rPr>
+                <w:rFonts w:ascii="Times New Roman" w:hAnsi="Times New Roman"/>
+                <w:b w:val="0"/>
+                <w:i w:val="0"/>
+                <w:sz w:val="16"/>
+              </w:rPr>
+              <w:t>n</w:t>
+            </w:r>
+            <w:r>
+              <w:rPr>
+                <w:rFonts w:ascii="Times New Roman" w:hAnsi="Times New Roman"/>
+                <w:b w:val="0"/>
+                <w:i w:val="0"/>
+                <w:sz w:val="16"/>
+              </w:rPr>
+              <w:t>=19)</w:t>
+            </w:r>
+          </w:p>
+        </w:tc>
+        <w:tc>
+          <w:tcPr>
+            <w:tcW w:type="dxa" w:w="2577"/>
+            <w:tcBorders>
+              <w:top w:val="nil" w:sz="0"/>
+              <w:bottom w:val="nil" w:sz="0"/>
+              <w:left w:val="nil"/>
+              <w:right w:val="nil"/>
+            </w:tcBorders>
+          </w:tcPr>
+          <w:p>
+            <w:pPr>
+              <w:spacing w:before="20" w:after="20"/>
+              <w:jc w:val="center"/>
+            </w:pPr>
+            <w:r>
+              <w:rPr>
+                <w:rFonts w:ascii="Times New Roman" w:hAnsi="Times New Roman"/>
+                <w:b w:val="0"/>
+                <w:i w:val="0"/>
+                <w:sz w:val="16"/>
+              </w:rPr>
+              <w:t>−3.63</w:t>
+            </w:r>
+            <w:r>
+              <w:rPr>
+                <w:rFonts w:ascii="Times New Roman" w:hAnsi="Times New Roman"/>
+                <w:b w:val="0"/>
+                <w:i w:val="0"/>
+                <w:sz w:val="16"/>
+              </w:rPr>
+              <w:t xml:space="preserve"> [−5.47, −1.74]</w:t>
+            </w:r>
+          </w:p>
+        </w:tc>
+        <w:tc>
+          <w:tcPr>
+            <w:tcW w:type="dxa" w:w="2577"/>
+            <w:tcBorders>
+              <w:top w:val="nil" w:sz="0"/>
+              <w:bottom w:val="nil" w:sz="0"/>
+              <w:left w:val="nil"/>
+              <w:right w:val="nil"/>
+            </w:tcBorders>
+          </w:tcPr>
+          <w:p>
+            <w:pPr>
+              <w:spacing w:before="20" w:after="20"/>
+              <w:jc w:val="center"/>
+            </w:pPr>
+            <w:r>
+              <w:rPr>
+                <w:rFonts w:ascii="Times New Roman" w:hAnsi="Times New Roman"/>
+                <w:b w:val="0"/>
+                <w:i w:val="0"/>
+                <w:sz w:val="16"/>
+              </w:rPr>
+              <w:t>–</w:t>
+            </w:r>
+          </w:p>
+        </w:tc>
+        <w:tc>
+          <w:tcPr>
+            <w:tcW w:type="dxa" w:w="2577"/>
+            <w:tcBorders>
+              <w:top w:val="nil" w:sz="0"/>
+              <w:bottom w:val="nil" w:sz="0"/>
+              <w:left w:val="nil"/>
+              <w:right w:val="nil"/>
+            </w:tcBorders>
+          </w:tcPr>
+          <w:p>
+            <w:pPr>
+              <w:spacing w:before="20" w:after="20"/>
+              <w:jc w:val="center"/>
+            </w:pPr>
+            <w:r>
+              <w:rPr>
+                <w:rFonts w:ascii="Times New Roman" w:hAnsi="Times New Roman"/>
+                <w:b w:val="0"/>
+                <w:i w:val="0"/>
+                <w:sz w:val="16"/>
+              </w:rPr>
+              <w:t>–</w:t>
+            </w:r>
+          </w:p>
+        </w:tc>
+      </w:tr>
+      <w:tr>
+        <w:tc>
+          <w:tcPr>
+            <w:tcW w:type="dxa" w:w="2577"/>
+            <w:tcBorders>
+              <w:top w:val="nil" w:sz="0"/>
+              <w:bottom w:val="nil" w:sz="0"/>
+              <w:left w:val="nil"/>
+              <w:right w:val="nil"/>
+            </w:tcBorders>
+          </w:tcPr>
+          <w:p>
+            <w:pPr>
+              <w:spacing w:before="20" w:after="20"/>
+              <w:jc w:val="left"/>
+            </w:pPr>
+            <w:r>
+              <w:rPr>
+                <w:rFonts w:ascii="Times New Roman" w:hAnsi="Times New Roman"/>
+                <w:b w:val="0"/>
+                <w:i w:val="0"/>
+                <w:sz w:val="16"/>
+              </w:rPr>
+              <w:t>Zero-shot, linear age, 50–80</w:t>
+            </w:r>
+          </w:p>
+        </w:tc>
+        <w:tc>
+          <w:tcPr>
+            <w:tcW w:type="dxa" w:w="2577"/>
+            <w:tcBorders>
+              <w:top w:val="nil" w:sz="0"/>
+              <w:bottom w:val="nil" w:sz="0"/>
+              <w:left w:val="nil"/>
+              <w:right w:val="nil"/>
+            </w:tcBorders>
+          </w:tcPr>
+          <w:p>
+            <w:pPr>
+              <w:spacing w:before="20" w:after="20"/>
+              <w:jc w:val="center"/>
+            </w:pPr>
+            <w:r>
+              <w:rPr>
+                <w:rFonts w:ascii="Times New Roman" w:hAnsi="Times New Roman"/>
+                <w:b w:val="0"/>
+                <w:i w:val="0"/>
+                <w:sz w:val="16"/>
+              </w:rPr>
+              <w:t>−5.49</w:t>
+            </w:r>
+            <w:r>
+              <w:rPr>
+                <w:rFonts w:ascii="Times New Roman" w:hAnsi="Times New Roman"/>
+                <w:b w:val="0"/>
+                <w:i w:val="0"/>
+                <w:sz w:val="16"/>
+              </w:rPr>
+              <w:t xml:space="preserve"> [−6.75, −4.27]</w:t>
+            </w:r>
+          </w:p>
+        </w:tc>
+        <w:tc>
+          <w:tcPr>
+            <w:tcW w:type="dxa" w:w="2577"/>
+            <w:tcBorders>
+              <w:top w:val="nil" w:sz="0"/>
+              <w:bottom w:val="nil" w:sz="0"/>
+              <w:left w:val="nil"/>
+              <w:right w:val="nil"/>
+            </w:tcBorders>
+          </w:tcPr>
+          <w:p>
+            <w:pPr>
+              <w:spacing w:before="20" w:after="20"/>
+              <w:jc w:val="center"/>
+            </w:pPr>
+            <w:r>
+              <w:rPr>
+                <w:rFonts w:ascii="Times New Roman" w:hAnsi="Times New Roman"/>
+                <w:b w:val="0"/>
+                <w:i w:val="0"/>
+                <w:sz w:val="16"/>
+              </w:rPr>
+              <w:t>–</w:t>
+            </w:r>
+          </w:p>
+        </w:tc>
+        <w:tc>
+          <w:tcPr>
+            <w:tcW w:type="dxa" w:w="2577"/>
+            <w:tcBorders>
+              <w:top w:val="nil" w:sz="0"/>
+              <w:bottom w:val="nil" w:sz="0"/>
+              <w:left w:val="nil"/>
+              <w:right w:val="nil"/>
+            </w:tcBorders>
+          </w:tcPr>
+          <w:p>
+            <w:pPr>
+              <w:spacing w:before="20" w:after="20"/>
+              <w:jc w:val="center"/>
+            </w:pPr>
+            <w:r>
+              <w:rPr>
+                <w:rFonts w:ascii="Times New Roman" w:hAnsi="Times New Roman"/>
+                <w:b w:val="0"/>
+                <w:i w:val="0"/>
+                <w:sz w:val="16"/>
+              </w:rPr>
+              <w:t>–</w:t>
+            </w:r>
+          </w:p>
+        </w:tc>
+      </w:tr>
+      <w:tr>
+        <w:tc>
+          <w:tcPr>
+            <w:tcW w:type="dxa" w:w="2577"/>
+            <w:tcBorders>
+              <w:top w:val="nil" w:sz="0"/>
+              <w:bottom w:val="single" w:sz="8"/>
+              <w:left w:val="nil"/>
+              <w:right w:val="nil"/>
+            </w:tcBorders>
+          </w:tcPr>
+          <w:p>
+            <w:pPr>
+              <w:spacing w:before="20" w:after="20"/>
+              <w:jc w:val="left"/>
+            </w:pPr>
+            <w:r>
+              <w:rPr>
+                <w:rFonts w:ascii="Times New Roman" w:hAnsi="Times New Roman"/>
+                <w:b w:val="0"/>
+                <w:i w:val="0"/>
+                <w:sz w:val="16"/>
+              </w:rPr>
+              <w:t>Zero-shot, matched pairs, 50–80 (</w:t>
+            </w:r>
+            <w:r>
+              <w:rPr>
+                <w:rFonts w:ascii="Times New Roman" w:hAnsi="Times New Roman"/>
+                <w:b w:val="0"/>
+                <w:i w:val="0"/>
+                <w:sz w:val="16"/>
+              </w:rPr>
+              <w:t>n</w:t>
+            </w:r>
+            <w:r>
+              <w:rPr>
+                <w:rFonts w:ascii="Times New Roman" w:hAnsi="Times New Roman"/>
+                <w:b w:val="0"/>
+                <w:i w:val="0"/>
+                <w:sz w:val="16"/>
+              </w:rPr>
+              <w:t>=12)</w:t>
+            </w:r>
+          </w:p>
+        </w:tc>
+        <w:tc>
+          <w:tcPr>
+            <w:tcW w:type="dxa" w:w="2577"/>
+            <w:tcBorders>
+              <w:top w:val="nil" w:sz="0"/>
+              <w:bottom w:val="single" w:sz="8"/>
+              <w:left w:val="nil"/>
+              <w:right w:val="nil"/>
+            </w:tcBorders>
+          </w:tcPr>
+          <w:p>
+            <w:pPr>
+              <w:spacing w:before="20" w:after="20"/>
+              <w:jc w:val="center"/>
+            </w:pPr>
+            <w:r>
+              <w:rPr>
+                <w:rFonts w:ascii="Times New Roman" w:hAnsi="Times New Roman"/>
+                <w:b w:val="0"/>
+                <w:i w:val="0"/>
+                <w:sz w:val="16"/>
+              </w:rPr>
+              <w:t>−5.94</w:t>
+            </w:r>
+            <w:r>
+              <w:rPr>
+                <w:rFonts w:ascii="Times New Roman" w:hAnsi="Times New Roman"/>
+                <w:b w:val="0"/>
+                <w:i w:val="0"/>
+                <w:sz w:val="16"/>
+              </w:rPr>
+              <w:t xml:space="preserve"> [−7.79, −3.64]</w:t>
+            </w:r>
+          </w:p>
+        </w:tc>
+        <w:tc>
+          <w:tcPr>
+            <w:tcW w:type="dxa" w:w="2577"/>
+            <w:tcBorders>
+              <w:top w:val="nil" w:sz="0"/>
+              <w:bottom w:val="single" w:sz="8"/>
+              <w:left w:val="nil"/>
+              <w:right w:val="nil"/>
+            </w:tcBorders>
+          </w:tcPr>
+          <w:p>
+            <w:pPr>
+              <w:spacing w:before="20" w:after="20"/>
+              <w:jc w:val="center"/>
+            </w:pPr>
+            <w:r>
+              <w:rPr>
+                <w:rFonts w:ascii="Times New Roman" w:hAnsi="Times New Roman"/>
+                <w:b w:val="0"/>
+                <w:i w:val="0"/>
+                <w:sz w:val="16"/>
+              </w:rPr>
+              <w:t>–</w:t>
+            </w:r>
+          </w:p>
+        </w:tc>
+        <w:tc>
+          <w:tcPr>
+            <w:tcW w:type="dxa" w:w="2577"/>
+            <w:tcBorders>
+              <w:top w:val="nil" w:sz="0"/>
+              <w:bottom w:val="single" w:sz="8"/>
+              <w:left w:val="nil"/>
+              <w:right w:val="nil"/>
+            </w:tcBorders>
+          </w:tcPr>
+          <w:p>
+            <w:pPr>
+              <w:spacing w:before="20" w:after="20"/>
+              <w:jc w:val="center"/>
+            </w:pPr>
+            <w:r>
+              <w:rPr>
+                <w:rFonts w:ascii="Times New Roman" w:hAnsi="Times New Roman"/>
+                <w:b w:val="0"/>
+                <w:i w:val="0"/>
+                <w:sz w:val="16"/>
+              </w:rPr>
+              <w:t>–</w:t>
+            </w:r>
+          </w:p>
+        </w:tc>
       </w:tr>
     </w:tbl>
     <w:p>
@@ -9139,16 +9910,7 @@
           <w:i w:val="0"/>
           <w:sz w:val="15"/>
         </w:rPr>
-        <w:t>^*</w:t>
-      </w:r>
-      <w:r>
-        <w:rPr>
-          <w:rFonts w:ascii="Times New Roman" w:hAnsi="Times New Roman"/>
-          <w:b w:val="0"/>
-          <w:i w:val="0"/>
-          <w:sz w:val="15"/>
-        </w:rPr>
-        <w:t>Raw prediction, age-adjusted, all subjects aged 42–82.</w:t>
+        <w:t>HC3 CIs; zero-shot rows: raw prediction, bootstrap CIs.</w:t>
       </w:r>
     </w:p>
     <w:p>
@@ -9232,7 +9994,7 @@
           <w:i w:val="0"/>
           <w:sz w:val="16"/>
         </w:rPr>
-        <w:t>ComBat harmonisation of the features: the site fingerprint is removed (left) and accuracy is unchanged (right), but the IOP offset remains (middle).</w:t>
+        <w:t>Main model, held-out subjects. ComBat harmonisation of the features: the site fingerprint is removed (left) and accuracy is unchanged (right), but the IOP offset remains (middle).</w:t>
       </w:r>
     </w:p>
     <w:p>
@@ -10612,7 +11374,7 @@
           <w:i w:val="0"/>
           <w:sz w:val="20"/>
         </w:rPr>
-        <w:t xml:space="preserve">The model's own spread was larger for IOP (8.06 vs 5.66 years for Guys) and doubled when IOP was unseen (12.46 vs 6.13) with 92% coverage, so the model signals unfamiliar data. Out of fold (Table </w:t>
+        <w:t xml:space="preserve">Out of fold (Table </w:t>
       </w:r>
       <w:r>
         <w:rPr>
@@ -10630,7 +11392,7 @@
           <w:i w:val="0"/>
           <w:sz w:val="20"/>
         </w:rPr>
-        <w:t xml:space="preserve">), the model's own 90% range covered 94% of Guys, 89% of HH but only </w:t>
+        <w:t xml:space="preserve">), the cross-validated models' own 90% range covered 94% of Guys, 89% of HH but only </w:t>
       </w:r>
       <w:r>
         <w:rPr>
@@ -10648,16 +11410,16 @@
           <w:i w:val="0"/>
           <w:sz w:val="20"/>
         </w:rPr>
-        <w:t xml:space="preserve"> of IOP subjects. Pooled split-conformal intervals, which guarantee coverage only on average, were worse for IOP (69%), whereas per-site (Mondrian) conformal intervals covered 91–92% at every site, at the price of much wider intervals for IOP (</w:t>
-      </w:r>
-      <w:r>
-        <w:rPr>
-          <w:rFonts w:ascii="Times New Roman" w:hAnsi="Times New Roman"/>
-          <w:b w:val="0"/>
-          <w:i w:val="0"/>
-          <w:sz w:val="20"/>
-        </w:rPr>
-        <w:t>±17.8</w:t>
+        <w:t xml:space="preserve"> of IOP subjects. Conformal intervals were calibrated and evaluated on disjoint subjects (calibrate on folds 1–3, evaluate on folds 4–5, then swap; all three seeds). Pooled intervals, which guarantee coverage only on average, covered only 69% of IOP subjects, whereas per-site (Mondrian) intervals covered 91–94% at every site, at the price of much wider intervals for IOP (</w:t>
+      </w:r>
+      <w:r>
+        <w:rPr>
+          <w:rFonts w:ascii="Times New Roman" w:hAnsi="Times New Roman"/>
+          <w:b w:val="0"/>
+          <w:i w:val="0"/>
+          <w:sz w:val="20"/>
+        </w:rPr>
+        <w:t>±20.6</w:t>
       </w:r>
       <w:r>
         <w:rPr>
@@ -10675,16 +11437,33 @@
           <w:i w:val="0"/>
           <w:sz w:val="20"/>
         </w:rPr>
-        <w:t>±8.2</w:t>
-      </w:r>
-      <w:r>
-        <w:rPr>
-          <w:rFonts w:ascii="Times New Roman" w:hAnsi="Times New Roman"/>
-          <w:b w:val="0"/>
-          <w:i w:val="0"/>
-          <w:sz w:val="20"/>
-        </w:rPr>
-        <w:t xml:space="preserve"> years for Guys). Disagreement between the 15 ensemble members was also largest for IOP on the test set (spread 3.1 vs 1.6 years for Guys). Average coverage thus hides that one site receives unreliable intervals; uncertainty must be calibrated per site, like accuracy and bias. Per subject, uncertainty tracked error only weakly (Spearman 0.16).</w:t>
+        <w:t>±8.4</w:t>
+      </w:r>
+      <w:r>
+        <w:rPr>
+          <w:rFonts w:ascii="Times New Roman" w:hAnsi="Times New Roman"/>
+          <w:b w:val="0"/>
+          <w:i w:val="0"/>
+          <w:sz w:val="20"/>
+        </w:rPr>
+        <w:t xml:space="preserve"> years for Guys, from only 26 IOP calibration subjects per split). Average coverage thus hides that one site receives unreliable intervals; uncertainty must be calibrated per site, like accuracy and bias.</w:t>
+      </w:r>
+    </w:p>
+    <w:p>
+      <w:pPr>
+        <w:keepNext w:val="0"/>
+        <w:spacing w:before="0" w:after="40" w:line="240" w:lineRule="auto"/>
+        <w:ind w:firstLine="245"/>
+        <w:jc w:val="both"/>
+      </w:pPr>
+      <w:r>
+        <w:rPr>
+          <w:rFonts w:ascii="Times New Roman" w:hAnsi="Times New Roman"/>
+          <w:b w:val="0"/>
+          <w:i w:val="0"/>
+          <w:sz w:val="20"/>
+        </w:rPr>
+        <w:t>A separate analysis gives a different picture for the leave-one-site-out model: trained without IOP, its own spread doubled on IOP (12.46 vs 6.13 years) and its 90% range covered 92% of IOP subjects. The difference is expected: a model that has never seen a site widens its distribution there, whereas the cross-validated models have seen IOP in training and become over-confident on it.</w:t>
       </w:r>
     </w:p>
     <w:p>
@@ -11142,7 +11921,7 @@
                 <w:i w:val="0"/>
                 <w:sz w:val="16"/>
               </w:rPr>
-              <w:t>0.90</w:t>
+              <w:t>0.92</w:t>
             </w:r>
           </w:p>
         </w:tc>
@@ -11168,7 +11947,7 @@
                 <w:i w:val="0"/>
                 <w:sz w:val="16"/>
               </w:rPr>
-              <w:t>0.92</w:t>
+              <w:t>0.94</w:t>
             </w:r>
           </w:p>
         </w:tc>
@@ -11179,6 +11958,112 @@
             <w:tcW w:type="dxa" w:w="2577"/>
             <w:tcBorders>
               <w:top w:val="single" w:sz="8"/>
+              <w:bottom w:val="nil" w:sz="0"/>
+              <w:left w:val="nil"/>
+              <w:right w:val="nil"/>
+            </w:tcBorders>
+          </w:tcPr>
+          <w:p>
+            <w:pPr>
+              <w:spacing w:before="20" w:after="20"/>
+              <w:jc w:val="left"/>
+            </w:pPr>
+            <w:r>
+              <w:rPr>
+                <w:rFonts w:ascii="Times New Roman" w:hAnsi="Times New Roman"/>
+                <w:b w:val="0"/>
+                <w:i w:val="0"/>
+                <w:sz w:val="16"/>
+              </w:rPr>
+              <w:t>Calibration subjects per split</w:t>
+            </w:r>
+          </w:p>
+        </w:tc>
+        <w:tc>
+          <w:tcPr>
+            <w:tcW w:type="dxa" w:w="2577"/>
+            <w:tcBorders>
+              <w:top w:val="single" w:sz="8"/>
+              <w:bottom w:val="nil" w:sz="0"/>
+              <w:left w:val="nil"/>
+              <w:right w:val="nil"/>
+            </w:tcBorders>
+          </w:tcPr>
+          <w:p>
+            <w:pPr>
+              <w:spacing w:before="20" w:after="20"/>
+              <w:jc w:val="center"/>
+            </w:pPr>
+            <w:r>
+              <w:rPr>
+                <w:rFonts w:ascii="Times New Roman" w:hAnsi="Times New Roman"/>
+                <w:b w:val="0"/>
+                <w:i w:val="0"/>
+                <w:sz w:val="16"/>
+              </w:rPr>
+              <w:t>117</w:t>
+            </w:r>
+          </w:p>
+        </w:tc>
+        <w:tc>
+          <w:tcPr>
+            <w:tcW w:type="dxa" w:w="2577"/>
+            <w:tcBorders>
+              <w:top w:val="single" w:sz="8"/>
+              <w:bottom w:val="nil" w:sz="0"/>
+              <w:left w:val="nil"/>
+              <w:right w:val="nil"/>
+            </w:tcBorders>
+          </w:tcPr>
+          <w:p>
+            <w:pPr>
+              <w:spacing w:before="20" w:after="20"/>
+              <w:jc w:val="center"/>
+            </w:pPr>
+            <w:r>
+              <w:rPr>
+                <w:rFonts w:ascii="Times New Roman" w:hAnsi="Times New Roman"/>
+                <w:b w:val="0"/>
+                <w:i w:val="0"/>
+                <w:sz w:val="16"/>
+              </w:rPr>
+              <w:t>64</w:t>
+            </w:r>
+          </w:p>
+        </w:tc>
+        <w:tc>
+          <w:tcPr>
+            <w:tcW w:type="dxa" w:w="2577"/>
+            <w:tcBorders>
+              <w:top w:val="single" w:sz="8"/>
+              <w:bottom w:val="nil" w:sz="0"/>
+              <w:left w:val="nil"/>
+              <w:right w:val="nil"/>
+            </w:tcBorders>
+          </w:tcPr>
+          <w:p>
+            <w:pPr>
+              <w:spacing w:before="20" w:after="20"/>
+              <w:jc w:val="center"/>
+            </w:pPr>
+            <w:r>
+              <w:rPr>
+                <w:rFonts w:ascii="Times New Roman" w:hAnsi="Times New Roman"/>
+                <w:b w:val="0"/>
+                <w:i w:val="0"/>
+                <w:sz w:val="16"/>
+              </w:rPr>
+              <w:t>26</w:t>
+            </w:r>
+          </w:p>
+        </w:tc>
+      </w:tr>
+      <w:tr>
+        <w:tc>
+          <w:tcPr>
+            <w:tcW w:type="dxa" w:w="2577"/>
+            <w:tcBorders>
+              <w:top w:val="nil" w:sz="0"/>
               <w:bottom w:val="single" w:sz="8"/>
               <w:left w:val="nil"/>
               <w:right w:val="nil"/>
@@ -11204,7 +12089,7 @@
           <w:tcPr>
             <w:tcW w:type="dxa" w:w="2577"/>
             <w:tcBorders>
-              <w:top w:val="single" w:sz="8"/>
+              <w:top w:val="nil" w:sz="0"/>
               <w:bottom w:val="single" w:sz="8"/>
               <w:left w:val="nil"/>
               <w:right w:val="nil"/>
@@ -11222,7 +12107,7 @@
                 <w:i w:val="0"/>
                 <w:sz w:val="16"/>
               </w:rPr>
-              <w:t>8.2</w:t>
+              <w:t>8.4</w:t>
             </w:r>
           </w:p>
         </w:tc>
@@ -11230,7 +12115,7 @@
           <w:tcPr>
             <w:tcW w:type="dxa" w:w="2577"/>
             <w:tcBorders>
-              <w:top w:val="single" w:sz="8"/>
+              <w:top w:val="nil" w:sz="0"/>
               <w:bottom w:val="single" w:sz="8"/>
               <w:left w:val="nil"/>
               <w:right w:val="nil"/>
@@ -11248,7 +12133,7 @@
                 <w:i w:val="0"/>
                 <w:sz w:val="16"/>
               </w:rPr>
-              <w:t>10.6</w:t>
+              <w:t>11.4</w:t>
             </w:r>
           </w:p>
         </w:tc>
@@ -11256,7 +12141,7 @@
           <w:tcPr>
             <w:tcW w:type="dxa" w:w="2577"/>
             <w:tcBorders>
-              <w:top w:val="single" w:sz="8"/>
+              <w:top w:val="nil" w:sz="0"/>
               <w:bottom w:val="single" w:sz="8"/>
               <w:left w:val="nil"/>
               <w:right w:val="nil"/>
@@ -11274,7 +12159,7 @@
                 <w:i w:val="0"/>
                 <w:sz w:val="16"/>
               </w:rPr>
-              <w:t>17.8</w:t>
+              <w:t>20.6</w:t>
             </w:r>
           </w:p>
         </w:tc>
@@ -11401,7 +12286,7 @@
           <w:i w:val="0"/>
           <w:sz w:val="20"/>
         </w:rPr>
-        <w:t xml:space="preserve"> applies the pre-specified criteria. The full passport, its machine-readable criteria and the script that generates it are released.</w:t>
+        <w:t xml:space="preserve"> applies the criteria fixed before cross-validation. The full passport, its machine-readable criteria and the script that generates it are released.</w:t>
       </w:r>
     </w:p>
     <w:p>
@@ -11433,7 +12318,7 @@
           <w:i w:val="0"/>
           <w:sz w:val="16"/>
         </w:rPr>
-        <w:t>Model fairness passport (pre-specified criteria)</w:t>
+        <w:t>Model fairness passport (criteria fixed before CV)</w:t>
       </w:r>
     </w:p>
     <w:tbl>
@@ -11847,7 +12732,7 @@
                 <w:i w:val="0"/>
                 <w:sz w:val="16"/>
               </w:rPr>
-              <w:t>Scanner invariance</w:t>
+              <w:t>Invariance to intensity-swap stress test</w:t>
             </w:r>
           </w:p>
         </w:tc>
@@ -12195,16 +13080,70 @@
           <w:i w:val="0"/>
           <w:sz w:val="20"/>
         </w:rPr>
-        <w:t>Sensitive to acquisition, but the sensitivity is not the explanation.</w:t>
-      </w:r>
-      <w:r>
-        <w:rPr>
-          <w:rFonts w:ascii="Times New Roman" w:hAnsi="Times New Roman"/>
-          <w:b w:val="0"/>
-          <w:i w:val="0"/>
-          <w:sz w:val="20"/>
-        </w:rPr>
-        <w:t xml:space="preserve"> The model is not acquisition-invariant: an unchanged HH brain given IOP's appearance loses almost four years. Yet the explanations we can measure—intensity profile, smoothness, head size, recorded cohort characteristics, and the site signature in the features—each leave the IOP offset in place. Two methodological lessons follow. First, references for intensity and erasure must be conditioned on age, because tissue contrast and the site–age confound carry age information: unconditioned versions overstated the intensity effect and made the offset seem to vanish. Second, removing a site signature is not the same as removing a site disparity. A study that had stopped at the stress test, or at plain erasure, would have reported “scanner bias”; the evidence here does not support that label.</w:t>
+        <w:t>Fine-tuning hides the offset where it is easiest to check.</w:t>
+      </w:r>
+      <w:r>
+        <w:rPr>
+          <w:rFonts w:ascii="Times New Roman" w:hAnsi="Times New Roman"/>
+          <w:b w:val="0"/>
+          <w:i w:val="0"/>
+          <w:sz w:val="20"/>
+        </w:rPr>
+        <w:t xml:space="preserve"> Perhaps the most practical finding is Fig. </w:t>
+      </w:r>
+      <w:r>
+        <w:rPr>
+          <w:rFonts w:ascii="Times New Roman" w:hAnsi="Times New Roman"/>
+          <w:b w:val="0"/>
+          <w:i w:val="0"/>
+          <w:sz w:val="20"/>
+        </w:rPr>
+        <w:t>7</w:t>
+      </w:r>
+      <w:r>
+        <w:rPr>
+          <w:rFonts w:ascii="Times New Roman" w:hAnsi="Times New Roman"/>
+          <w:b w:val="0"/>
+          <w:i w:val="0"/>
+          <w:sz w:val="20"/>
+        </w:rPr>
+        <w:t>: the offset is present in every subject before fine-tuning, and fine-tuning removes it only for the IOP subjects the model is trained on (</w:t>
+      </w:r>
+      <w:r>
+        <w:rPr>
+          <w:rFonts w:ascii="Times New Roman" w:hAnsi="Times New Roman"/>
+          <w:b w:val="0"/>
+          <w:i w:val="0"/>
+          <w:sz w:val="20"/>
+        </w:rPr>
+        <w:t>+0.19</w:t>
+      </w:r>
+      <w:r>
+        <w:rPr>
+          <w:rFonts w:ascii="Times New Roman" w:hAnsi="Times New Roman"/>
+          <w:b w:val="0"/>
+          <w:i w:val="0"/>
+          <w:sz w:val="20"/>
+        </w:rPr>
+        <w:t xml:space="preserve"> years at the end of training) while it grows for unseen IOP subjects (</w:t>
+      </w:r>
+      <w:r>
+        <w:rPr>
+          <w:rFonts w:ascii="Times New Roman" w:hAnsi="Times New Roman"/>
+          <w:b w:val="0"/>
+          <w:i w:val="0"/>
+          <w:sz w:val="20"/>
+        </w:rPr>
+        <w:t>−4.49</w:t>
+      </w:r>
+      <w:r>
+        <w:rPr>
+          <w:rFonts w:ascii="Times New Roman" w:hAnsi="Times New Roman"/>
+          <w:b w:val="0"/>
+          <w:i w:val="0"/>
+          <w:sz w:val="20"/>
+        </w:rPr>
+        <w:t>). An audit that inspects training-set residuals, or reports in-sample site effects, would conclude that the model is fair across sites. Site effects must be estimated on subjects the model has not seen, and ideally with cross-validation, because a held-out split from a small site is too small to detect them.</w:t>
       </w:r>
     </w:p>
     <w:p>
@@ -12221,16 +13160,16 @@
           <w:i w:val="0"/>
           <w:sz w:val="20"/>
         </w:rPr>
-        <w:t>What remains.</w:t>
-      </w:r>
-      <w:r>
-        <w:rPr>
-          <w:rFonts w:ascii="Times New Roman" w:hAnsi="Times New Roman"/>
-          <w:b w:val="0"/>
-          <w:i w:val="0"/>
-          <w:sz w:val="20"/>
-        </w:rPr>
-        <w:t xml:space="preserve"> The offset could stem from acquisition properties not modelled here (e.g., spatially varying contrast or vendor-specific reconstruction) or from cohort characteristics IXI does not record. Within IXI, site and cohort are confounded, so these cannot be separated; travelling-subject data would.</w:t>
+        <w:t>Sensitive to acquisition, but the sensitivity is not the explanation.</w:t>
+      </w:r>
+      <w:r>
+        <w:rPr>
+          <w:rFonts w:ascii="Times New Roman" w:hAnsi="Times New Roman"/>
+          <w:b w:val="0"/>
+          <w:i w:val="0"/>
+          <w:sz w:val="20"/>
+        </w:rPr>
+        <w:t xml:space="preserve"> The model is not acquisition-invariant: an unchanged HH brain given IOP's appearance loses almost four years. Yet the explanations we can measure—intensity profile, smoothness, head size, recorded cohort characteristics, and the site signature in the features—each leave the IOP offset in place. Two methodological lessons follow. First, references for intensity and erasure must be conditioned on age, because tissue contrast and the site–age confound carry age information: unconditioned versions overstated the intensity effect and made the offset seem to vanish. Second, removing a site signature is not the same as removing a site disparity. A study that had stopped at the stress test, or at plain erasure, would have reported “scanner bias”; the evidence here does not support that label.</w:t>
       </w:r>
     </w:p>
     <w:p>
@@ -12247,6 +13186,32 @@
           <w:i w:val="0"/>
           <w:sz w:val="20"/>
         </w:rPr>
+        <w:t>What remains.</w:t>
+      </w:r>
+      <w:r>
+        <w:rPr>
+          <w:rFonts w:ascii="Times New Roman" w:hAnsi="Times New Roman"/>
+          <w:b w:val="0"/>
+          <w:i w:val="0"/>
+          <w:sz w:val="20"/>
+        </w:rPr>
+        <w:t xml:space="preserve"> The offset could stem from acquisition properties not modelled here (e.g., spatially varying contrast or vendor-specific reconstruction) or from cohort characteristics IXI does not record. Within IXI, site and cohort are confounded, so these cannot be separated; travelling-subject data would.</w:t>
+      </w:r>
+    </w:p>
+    <w:p>
+      <w:pPr>
+        <w:keepNext w:val="0"/>
+        <w:spacing w:before="0" w:after="40" w:line="240" w:lineRule="auto"/>
+        <w:ind w:firstLine="245"/>
+        <w:jc w:val="both"/>
+      </w:pPr>
+      <w:r>
+        <w:rPr>
+          <w:rFonts w:ascii="Times New Roman" w:hAnsi="Times New Roman"/>
+          <w:b/>
+          <w:i w:val="0"/>
+          <w:sz w:val="20"/>
+        </w:rPr>
         <w:t>Limitations.</w:t>
       </w:r>
       <w:r>
@@ -12256,7 +13221,7 @@
           <w:i w:val="0"/>
           <w:sz w:val="20"/>
         </w:rPr>
-        <w:t xml:space="preserve"> IOP contributes 61 subjects in total. The cross-validated models fine-tune only the upper blocks, a lighter recipe than the main model. Quantile matching changes only the global intensity distribution, and Gaussian blur did not reproduce IOP's full sharpness profile. Attribution has 8 mm resolution, and deletion tests are themselves affected by distribution shift. We did not evaluate a classical feature-based baseline or a second dataset. Participants are healthy volunteers; no clinical conclusion follows.</w:t>
+        <w:t xml:space="preserve"> IOP contributes 61 subjects in total. The cross-validated models fine-tune only the upper blocks, a lighter recipe than the main model, so their estimates describe that recipe; the main model's held-out estimates agree in sign and size, but a fully fine-tuned cross-validation remains to be run. The equivalence margin and verdict rules were fixed after the test-set analysis, so they are pre-specified only for the cross-validated analysis. Three seeds give a limited view of training variability. Quantile matching changes only the global intensity distribution, and Gaussian blur did not reproduce IOP's full sharpness profile. Attribution has 8 mm resolution, and deletion tests are themselves affected by distribution shift. We did not evaluate a classical feature-based baseline or a second dataset. Participants are healthy volunteers; no clinical conclusion follows.</w:t>
       </w:r>
     </w:p>
     <w:p>
@@ -13426,7 +14391,7 @@
           <w:i w:val="0"/>
           <w:sz w:val="16"/>
         </w:rPr>
-        <w:t xml:space="preserve">L. J. Aguzin Parrilli, M. A. Belzunce et al., “Bias and generalizability of brain age prediction models: A multi-cohort evaluation with anatomical and interpretability insights,” </w:t>
+        <w:t xml:space="preserve">L. J. Aguzin Parrilli and M. A. Belzunce, “Bias and generalizability of brain age prediction models: A multi-cohort evaluation with anatomical and interpretability insights,” </w:t>
       </w:r>
       <w:r>
         <w:rPr>
@@ -14749,7 +15714,7 @@
           <w:i w:val="0"/>
           <w:sz w:val="16"/>
         </w:rPr>
-        <w:t xml:space="preserve">D. J. Schuirmann, “A comparison of the two one-sided tests procedure and the power approach for assessing the equivalence of average bioavailability,” </w:t>
+        <w:t xml:space="preserve">R. P. Dörfel, J. M. Arenas-Gomez, P. M. Fisher, M. Ganz, G. M. Knudsen, J. E. Svensson, and P. Plavén-Sigray, “Prediction of brain age using structural magnetic resonance imaging: A comparison of accuracy and test–retest reliability of publicly available software packages,” </w:t>
       </w:r>
       <w:r>
         <w:rPr>
@@ -14758,7 +15723,7 @@
           <w:i/>
           <w:sz w:val="16"/>
         </w:rPr>
-        <w:t>Journal of Pharmacokinetics and Biopharmaceutics</w:t>
+        <w:t>Human Brain Mapping</w:t>
       </w:r>
       <w:r>
         <w:rPr>
@@ -14767,7 +15732,7 @@
           <w:i w:val="0"/>
           <w:sz w:val="16"/>
         </w:rPr>
-        <w:t>, vol. 15, no. 6, pp. 657–680, 1987.</w:t>
+        <w:t>, vol. 44, no. 17, pp. 6139–6148, 2023.</w:t>
       </w:r>
     </w:p>
     <w:p>
@@ -14797,7 +15762,7 @@
           <w:i w:val="0"/>
           <w:sz w:val="16"/>
         </w:rPr>
-        <w:t xml:space="preserve">S. Holm, “A simple sequentially rejective multiple test procedure,” </w:t>
+        <w:t xml:space="preserve">D. J. Schuirmann, “A comparison of the two one-sided tests procedure and the power approach for assessing the equivalence of average bioavailability,” </w:t>
       </w:r>
       <w:r>
         <w:rPr>
@@ -14806,7 +15771,7 @@
           <w:i/>
           <w:sz w:val="16"/>
         </w:rPr>
-        <w:t>Scandinavian Journal of Statistics</w:t>
+        <w:t>Journal of Pharmacokinetics and Biopharmaceutics</w:t>
       </w:r>
       <w:r>
         <w:rPr>
@@ -14815,7 +15780,7 @@
           <w:i w:val="0"/>
           <w:sz w:val="16"/>
         </w:rPr>
-        <w:t>, vol. 6, no. 2, pp. 65–70, 1979.</w:t>
+        <w:t>, vol. 15, no. 6, pp. 657–680, 1987.</w:t>
       </w:r>
     </w:p>
     <w:p>
@@ -14845,7 +15810,7 @@
           <w:i w:val="0"/>
           <w:sz w:val="16"/>
         </w:rPr>
-        <w:t xml:space="preserve">S. D. Forman, J. D. Cohen, M. Fitzgerald, W. F. Eddy, M. A. Mintun, and D. C. Noll, “Improved assessment of significant activation in functional magnetic resonance imaging (fMRI): use of a cluster-size threshold,” </w:t>
+        <w:t xml:space="preserve">S. Holm, “A simple sequentially rejective multiple test procedure,” </w:t>
       </w:r>
       <w:r>
         <w:rPr>
@@ -14854,7 +15819,7 @@
           <w:i/>
           <w:sz w:val="16"/>
         </w:rPr>
-        <w:t>Magnetic Resonance in Medicine</w:t>
+        <w:t>Scandinavian Journal of Statistics</w:t>
       </w:r>
       <w:r>
         <w:rPr>
@@ -14863,7 +15828,7 @@
           <w:i w:val="0"/>
           <w:sz w:val="16"/>
         </w:rPr>
-        <w:t>, vol. 33, no. 5, pp. 636–647, 1995.</w:t>
+        <w:t>, vol. 6, no. 2, pp. 65–70, 1979.</w:t>
       </w:r>
     </w:p>
     <w:p>
@@ -14893,7 +15858,7 @@
           <w:i w:val="0"/>
           <w:sz w:val="16"/>
         </w:rPr>
-        <w:t xml:space="preserve">M. Jenkinson, C. F. Beckmann, T. E. J. Behrens, M. W. Woolrich, and S. M. Smith, “FSL,” </w:t>
+        <w:t xml:space="preserve">S. D. Forman, J. D. Cohen, M. Fitzgerald, W. F. Eddy, M. A. Mintun, and D. C. Noll, “Improved assessment of significant activation in functional magnetic resonance imaging (fMRI): use of a cluster-size threshold,” </w:t>
       </w:r>
       <w:r>
         <w:rPr>
@@ -14902,7 +15867,7 @@
           <w:i/>
           <w:sz w:val="16"/>
         </w:rPr>
-        <w:t>NeuroImage</w:t>
+        <w:t>Magnetic Resonance in Medicine</w:t>
       </w:r>
       <w:r>
         <w:rPr>
@@ -14911,7 +15876,7 @@
           <w:i w:val="0"/>
           <w:sz w:val="16"/>
         </w:rPr>
-        <w:t>, vol. 62, no. 2, pp. 782–790, 2012.</w:t>
+        <w:t>, vol. 33, no. 5, pp. 636–647, 1995.</w:t>
       </w:r>
     </w:p>
     <w:p>
@@ -14932,6 +15897,54 @@
           <w:sz w:val="16"/>
         </w:rPr>
         <w:t>[51]</w:t>
+        <w:tab/>
+      </w:r>
+      <w:r>
+        <w:rPr>
+          <w:rFonts w:ascii="Times New Roman" w:hAnsi="Times New Roman"/>
+          <w:b w:val="0"/>
+          <w:i w:val="0"/>
+          <w:sz w:val="16"/>
+        </w:rPr>
+        <w:t xml:space="preserve">M. Jenkinson, C. F. Beckmann, T. E. J. Behrens, M. W. Woolrich, and S. M. Smith, “FSL,” </w:t>
+      </w:r>
+      <w:r>
+        <w:rPr>
+          <w:rFonts w:ascii="Times New Roman" w:hAnsi="Times New Roman"/>
+          <w:b w:val="0"/>
+          <w:i/>
+          <w:sz w:val="16"/>
+        </w:rPr>
+        <w:t>NeuroImage</w:t>
+      </w:r>
+      <w:r>
+        <w:rPr>
+          <w:rFonts w:ascii="Times New Roman" w:hAnsi="Times New Roman"/>
+          <w:b w:val="0"/>
+          <w:i w:val="0"/>
+          <w:sz w:val="16"/>
+        </w:rPr>
+        <w:t>, vol. 62, no. 2, pp. 782–790, 2012.</w:t>
+      </w:r>
+    </w:p>
+    <w:p>
+      <w:pPr>
+        <w:keepNext w:val="0"/>
+        <w:tabs>
+          <w:tab w:pos="432" w:val="left"/>
+        </w:tabs>
+        <w:spacing w:before="0" w:after="20" w:line="240" w:lineRule="auto"/>
+        <w:ind w:left="432" w:hanging="432"/>
+        <w:jc w:val="both"/>
+      </w:pPr>
+      <w:r>
+        <w:rPr>
+          <w:rFonts w:ascii="Times New Roman" w:hAnsi="Times New Roman"/>
+          <w:b w:val="0"/>
+          <w:i w:val="0"/>
+          <w:sz w:val="16"/>
+        </w:rPr>
+        <w:t>[52]</w:t>
         <w:tab/>
       </w:r>
       <w:r>

</xml_diff>